<commit_message>
Fix TOC heading separation, remove blank paragraph pushes, and align all front matter sections
</commit_message>
<xml_diff>
--- a/Pairix_Phase_I_Report_final.docx
+++ b/Pairix_Phase_I_Report_final.docx
@@ -132,6 +132,7 @@
     <w:p>
       <w:pPr>
         <w:pStyle w:val="Heading1"/>
+        <w:keepNext/>
         <w:spacing w:after="205"/>
         <w:ind w:left="18" w:right="5"/>
         <w:jc w:val="center"/>
@@ -146,6 +147,7 @@
     <w:p>
       <w:pPr>
         <w:pStyle w:val="Heading2"/>
+        <w:keepNext/>
         <w:spacing w:after="723" w:line="265" w:lineRule="auto"/>
         <w:ind w:left="16"/>
         <w:jc w:val="center"/>
@@ -264,46 +266,7 @@
         </w:rPr>
       </w:pPr>
       <w:r>
-        <w:rPr>
-          <w:b/>
-          <w:bCs/>
-        </w:rPr>
-        <w:t xml:space="preserve">   </w:t>
-      </w:r>
-      <w:r>
-        <w:rPr>
-          <w:b/>
-          <w:bCs/>
-        </w:rPr>
-        <w:t>ELAK</w:t>
-      </w:r>
-      <w:r>
-        <w:rPr>
-          <w:b/>
-          <w:bCs/>
-        </w:rPr>
-        <w:t>I</w:t>
-      </w:r>
-      <w:r>
-        <w:rPr>
-          <w:b/>
-          <w:bCs/>
-        </w:rPr>
-        <w:t xml:space="preserve">YA </w:t>
-      </w:r>
-      <w:r>
-        <w:rPr>
-          <w:b/>
-          <w:bCs/>
-        </w:rPr>
-        <w:t>M</w:t>
-      </w:r>
-      <w:r>
-        <w:rPr>
-          <w:b/>
-          <w:bCs/>
-        </w:rPr>
-        <w:t xml:space="preserve"> (24AD034)</w:t>
+        <w:t>ELAKIYA M (24AD034)</w:t>
       </w:r>
     </w:p>
     <w:p>
@@ -913,6 +876,7 @@
     <w:p>
       <w:pPr>
         <w:pStyle w:val="Heading1"/>
+        <w:keepNext/>
         <w:ind w:left="18" w:right="1"/>
         <w:jc w:val="center"/>
       </w:pPr>
@@ -1062,25 +1026,7 @@
         </w:rPr>
       </w:pPr>
       <w:r>
-        <w:rPr>
-          <w:b/>
-          <w:sz w:val="22"/>
-        </w:rPr>
-        <w:t xml:space="preserve">                                                                            ELAK</w:t>
-      </w:r>
-      <w:r>
-        <w:rPr>
-          <w:b/>
-          <w:sz w:val="22"/>
-        </w:rPr>
-        <w:t>I</w:t>
-      </w:r>
-      <w:r>
-        <w:rPr>
-          <w:b/>
-          <w:sz w:val="22"/>
-        </w:rPr>
-        <w:t>YA M (24AD034)</w:t>
+        <w:t>ELAKIYA M (24AD034)</w:t>
       </w:r>
     </w:p>
     <w:p>
@@ -1092,6 +1038,7 @@
     <w:p>
       <w:pPr>
         <w:pStyle w:val="Heading1"/>
+        <w:keepNext/>
         <w:ind w:left="18" w:right="1"/>
         <w:jc w:val="center"/>
       </w:pPr>
@@ -1121,115 +1068,13 @@
     </w:p>
     <w:p>
       <w:pPr>
-        <w:spacing w:after="0" w:line="259" w:lineRule="auto"/>
-        <w:ind w:left="3254" w:right="0" w:hanging="10"/>
-        <w:jc w:val="left"/>
-        <w:rPr>
-          <w:b/>
-          <w:sz w:val="32"/>
-        </w:rPr>
-      </w:pPr>
-    </w:p>
-    <w:p>
-      <w:pPr>
-        <w:spacing w:after="0" w:line="259" w:lineRule="auto"/>
-        <w:ind w:left="3254" w:right="0" w:hanging="10"/>
-        <w:jc w:val="left"/>
-        <w:rPr>
-          <w:b/>
-          <w:sz w:val="32"/>
-        </w:rPr>
-      </w:pPr>
-    </w:p>
-    <w:p>
-      <w:pPr>
-        <w:spacing w:after="0" w:line="259" w:lineRule="auto"/>
-        <w:ind w:left="3254" w:right="0" w:hanging="10"/>
-        <w:jc w:val="left"/>
-        <w:rPr>
-          <w:b/>
-          <w:sz w:val="32"/>
-        </w:rPr>
-      </w:pPr>
-    </w:p>
-    <w:p>
-      <w:pPr>
-        <w:spacing w:after="0" w:line="259" w:lineRule="auto"/>
-        <w:ind w:left="3254" w:right="0" w:hanging="10"/>
-        <w:jc w:val="left"/>
-        <w:rPr>
-          <w:b/>
-          <w:sz w:val="32"/>
-        </w:rPr>
-      </w:pPr>
-    </w:p>
-    <w:p>
-      <w:pPr>
-        <w:spacing w:after="0" w:line="259" w:lineRule="auto"/>
-        <w:ind w:left="3254" w:right="0" w:hanging="10"/>
-        <w:jc w:val="left"/>
-        <w:rPr>
-          <w:b/>
-          <w:sz w:val="32"/>
-        </w:rPr>
-      </w:pPr>
-    </w:p>
-    <w:p>
-      <w:pPr>
-        <w:spacing w:after="0" w:line="259" w:lineRule="auto"/>
-        <w:ind w:left="3254" w:right="0" w:hanging="10"/>
-        <w:jc w:val="left"/>
-        <w:rPr>
-          <w:b/>
-          <w:sz w:val="32"/>
-        </w:rPr>
-      </w:pPr>
-    </w:p>
-    <w:p>
-      <w:pPr>
-        <w:spacing w:after="0" w:line="259" w:lineRule="auto"/>
-        <w:ind w:left="3254" w:right="0" w:hanging="10"/>
-        <w:jc w:val="left"/>
-        <w:rPr>
-          <w:b/>
-          <w:sz w:val="32"/>
-        </w:rPr>
-      </w:pPr>
-    </w:p>
-    <w:p>
-      <w:pPr>
-        <w:spacing w:after="0" w:line="259" w:lineRule="auto"/>
-        <w:ind w:left="3254" w:right="0" w:hanging="10"/>
-        <w:jc w:val="left"/>
-        <w:rPr>
-          <w:b/>
-          <w:sz w:val="32"/>
-        </w:rPr>
-      </w:pPr>
-    </w:p>
-    <w:p>
-      <w:pPr>
-        <w:spacing w:after="0" w:line="259" w:lineRule="auto"/>
-        <w:ind w:left="3254" w:right="0" w:hanging="10"/>
-        <w:jc w:val="left"/>
-        <w:rPr>
-          <w:b/>
-          <w:sz w:val="32"/>
-        </w:rPr>
-      </w:pPr>
-    </w:p>
-    <w:p>
-      <w:pPr>
-        <w:spacing w:after="0" w:line="259" w:lineRule="auto"/>
+        <w:keepNext/>
+        <w:pageBreakBefore/>
+        <w:spacing w:after="240" w:line="259" w:lineRule="auto" w:before="0"/>
         <w:ind w:right="0" w:firstLine="0"/>
         <w:jc w:val="center"/>
       </w:pPr>
       <w:r>
-        <w:rPr>
-          <w:b/>
-          <w:sz w:val="32"/>
-        </w:rPr>
-        <w:lastRenderedPageBreak/>
         <w:t>TABLE OF CONTENTS</w:t>
       </w:r>
     </w:p>
@@ -4484,48 +4329,13 @@
     </w:tbl>
     <w:p>
       <w:pPr>
-        <w:spacing w:after="0" w:line="259" w:lineRule="auto"/>
+        <w:keepNext/>
+        <w:pageBreakBefore/>
+        <w:spacing w:after="240" w:line="259" w:lineRule="auto" w:before="0"/>
         <w:ind w:left="3600" w:right="0" w:hanging="10"/>
-        <w:jc w:val="left"/>
-        <w:rPr>
-          <w:b/>
-          <w:sz w:val="32"/>
-        </w:rPr>
-      </w:pPr>
-    </w:p>
-    <w:p>
-      <w:pPr>
-        <w:spacing w:after="0" w:line="259" w:lineRule="auto"/>
-        <w:ind w:left="3600" w:right="0" w:hanging="10"/>
-        <w:jc w:val="left"/>
-        <w:rPr>
-          <w:b/>
-          <w:sz w:val="32"/>
-        </w:rPr>
-      </w:pPr>
-    </w:p>
-    <w:p>
-      <w:pPr>
-        <w:spacing w:after="0" w:line="259" w:lineRule="auto"/>
-        <w:ind w:left="3600" w:right="0" w:hanging="10"/>
-        <w:jc w:val="left"/>
-        <w:rPr>
-          <w:b/>
-          <w:sz w:val="32"/>
-        </w:rPr>
-      </w:pPr>
-    </w:p>
-    <w:p>
-      <w:pPr>
-        <w:spacing w:after="0" w:line="259" w:lineRule="auto"/>
-        <w:ind w:left="3600" w:right="0" w:hanging="10"/>
-        <w:jc w:val="center"/>
-      </w:pPr>
-      <w:r>
-        <w:rPr>
-          <w:b/>
-          <w:sz w:val="32"/>
-        </w:rPr>
+        <w:jc w:val="center"/>
+      </w:pPr>
+      <w:r>
         <w:t>LIST OF FIGURES</w:t>
       </w:r>
     </w:p>
@@ -5121,59 +4931,13 @@
     </w:tbl>
     <w:p>
       <w:pPr>
+        <w:keepNext/>
+        <w:pageBreakBefore/>
+        <w:spacing w:before="0" w:after="240"/>
         <w:ind w:firstLine="0"/>
-      </w:pPr>
-    </w:p>
-    <w:p>
-      <w:pPr>
-        <w:ind w:firstLine="0"/>
-        <w:jc w:val="center"/>
-        <w:rPr>
-          <w:b/>
-          <w:sz w:val="32"/>
-        </w:rPr>
-      </w:pPr>
-      <w:r>
-        <w:rPr>
-          <w:b/>
-          <w:sz w:val="32"/>
-        </w:rPr>
-        <w:t xml:space="preserve">                                                       </w:t>
-      </w:r>
-    </w:p>
-    <w:p>
-      <w:pPr>
-        <w:ind w:firstLine="0"/>
-        <w:rPr>
-          <w:b/>
-          <w:sz w:val="32"/>
-        </w:rPr>
-      </w:pPr>
-    </w:p>
-    <w:p>
-      <w:pPr>
-        <w:ind w:firstLine="0"/>
-        <w:jc w:val="center"/>
-      </w:pPr>
-      <w:r>
-        <w:rPr>
-          <w:b/>
-          <w:sz w:val="32"/>
-        </w:rPr>
-        <w:t xml:space="preserve">                                                   </w:t>
-      </w:r>
-      <w:r>
-        <w:rPr>
-          <w:b/>
-          <w:sz w:val="32"/>
-        </w:rPr>
-        <w:t xml:space="preserve"> </w:t>
-      </w:r>
-      <w:r>
-        <w:rPr>
-          <w:b/>
-          <w:sz w:val="32"/>
-        </w:rPr>
+        <w:jc w:val="center"/>
+      </w:pPr>
+      <w:r>
         <w:t>LIST OF TABLES</w:t>
       </w:r>
     </w:p>
@@ -6146,16 +5910,13 @@
     </w:p>
     <w:p>
       <w:pPr>
-        <w:spacing w:after="0" w:line="259" w:lineRule="auto"/>
+        <w:keepNext/>
+        <w:pageBreakBefore/>
+        <w:spacing w:after="240" w:line="259" w:lineRule="auto" w:before="0"/>
         <w:ind w:left="2969" w:right="0" w:hanging="10"/>
         <w:jc w:val="center"/>
       </w:pPr>
       <w:r>
-        <w:rPr>
-          <w:b/>
-          <w:sz w:val="32"/>
-        </w:rPr>
-        <w:lastRenderedPageBreak/>
         <w:t>LIST OF ABBREVIATIONS</w:t>
       </w:r>
     </w:p>
@@ -7110,7 +6871,9 @@
     <w:p>
       <w:pPr>
         <w:pStyle w:val="Heading2"/>
-        <w:spacing w:after="308"/>
+        <w:keepNext/>
+        <w:pageBreakBefore/>
+        <w:spacing w:after="240" w:before="0"/>
         <w:jc w:val="center"/>
       </w:pPr>
       <w:r>
@@ -7121,6 +6884,7 @@
     <w:p>
       <w:pPr>
         <w:pStyle w:val="Heading3"/>
+        <w:keepNext/>
         <w:ind w:left="-5"/>
         <w:jc w:val="center"/>
       </w:pPr>
@@ -7161,6 +6925,7 @@
     <w:p>
       <w:pPr>
         <w:pStyle w:val="Heading3"/>
+        <w:keepNext/>
         <w:ind w:left="-5"/>
         <w:jc w:val="center"/>
       </w:pPr>
@@ -7251,6 +7016,7 @@
     <w:p>
       <w:pPr>
         <w:pStyle w:val="Heading3"/>
+        <w:keepNext/>
         <w:ind w:left="-5"/>
         <w:jc w:val="center"/>
       </w:pPr>
@@ -7271,6 +7037,7 @@
     <w:p>
       <w:pPr>
         <w:pStyle w:val="Heading3"/>
+        <w:keepNext/>
         <w:ind w:left="-5"/>
         <w:jc w:val="center"/>
       </w:pPr>
@@ -7347,6 +7114,7 @@
     <w:p>
       <w:pPr>
         <w:pStyle w:val="Heading3"/>
+        <w:keepNext/>
         <w:ind w:left="-5"/>
         <w:jc w:val="center"/>
       </w:pPr>
@@ -7376,7 +7144,9 @@
     <w:p>
       <w:pPr>
         <w:pStyle w:val="Heading2"/>
-        <w:spacing w:after="308"/>
+        <w:keepNext/>
+        <w:pageBreakBefore/>
+        <w:spacing w:after="240" w:before="0"/>
         <w:jc w:val="center"/>
       </w:pPr>
       <w:r>
@@ -7387,6 +7157,7 @@
     <w:p>
       <w:pPr>
         <w:pStyle w:val="Heading3"/>
+        <w:keepNext/>
         <w:ind w:left="-5"/>
         <w:jc w:val="center"/>
       </w:pPr>
@@ -7446,6 +7217,7 @@
     <w:p>
       <w:pPr>
         <w:pStyle w:val="Heading3"/>
+        <w:keepNext/>
         <w:spacing w:after="0"/>
         <w:ind w:left="-5"/>
         <w:jc w:val="center"/>
@@ -8039,12 +7811,14 @@
     <w:p>
       <w:pPr>
         <w:pStyle w:val="Heading3"/>
+        <w:keepNext/>
         <w:ind w:left="-5"/>
       </w:pPr>
     </w:p>
     <w:p>
       <w:pPr>
         <w:pStyle w:val="Heading3"/>
+        <w:keepNext/>
         <w:ind w:left="-5"/>
         <w:jc w:val="center"/>
       </w:pPr>
@@ -8075,6 +7849,7 @@
     <w:p>
       <w:pPr>
         <w:pStyle w:val="Heading3"/>
+        <w:keepNext/>
         <w:ind w:left="-5"/>
         <w:jc w:val="center"/>
       </w:pPr>
@@ -8094,6 +7869,7 @@
     <w:p>
       <w:pPr>
         <w:pStyle w:val="Heading3"/>
+        <w:keepNext/>
         <w:ind w:left="-5"/>
         <w:jc w:val="center"/>
       </w:pPr>
@@ -8115,6 +7891,7 @@
     <w:p>
       <w:pPr>
         <w:pStyle w:val="Heading3"/>
+        <w:keepNext/>
         <w:ind w:left="-5"/>
         <w:jc w:val="center"/>
       </w:pPr>
@@ -8137,7 +7914,9 @@
     <w:p>
       <w:pPr>
         <w:pStyle w:val="Heading2"/>
-        <w:spacing w:after="308"/>
+        <w:keepNext/>
+        <w:pageBreakBefore/>
+        <w:spacing w:after="240" w:before="0"/>
         <w:jc w:val="center"/>
       </w:pPr>
       <w:r>
@@ -8148,6 +7927,7 @@
     <w:p>
       <w:pPr>
         <w:pStyle w:val="Heading3"/>
+        <w:keepNext/>
         <w:ind w:left="-5"/>
         <w:jc w:val="center"/>
       </w:pPr>
@@ -8168,6 +7948,7 @@
     <w:p>
       <w:pPr>
         <w:pStyle w:val="Heading3"/>
+        <w:keepNext/>
         <w:ind w:left="-5"/>
         <w:jc w:val="center"/>
       </w:pPr>
@@ -9170,12 +8951,14 @@
     <w:p>
       <w:pPr>
         <w:pStyle w:val="Heading3"/>
+        <w:keepNext/>
         <w:ind w:left="-5"/>
       </w:pPr>
     </w:p>
     <w:p>
       <w:pPr>
         <w:pStyle w:val="Heading3"/>
+        <w:keepNext/>
         <w:ind w:left="-5"/>
         <w:jc w:val="center"/>
       </w:pPr>
@@ -9215,6 +8998,7 @@
     <w:p>
       <w:pPr>
         <w:pStyle w:val="Heading3"/>
+        <w:keepNext/>
         <w:ind w:left="-5"/>
         <w:jc w:val="center"/>
       </w:pPr>
@@ -9790,12 +9574,14 @@
     <w:p>
       <w:pPr>
         <w:pStyle w:val="Heading3"/>
+        <w:keepNext/>
         <w:ind w:left="-5"/>
       </w:pPr>
     </w:p>
     <w:p>
       <w:pPr>
         <w:pStyle w:val="Heading3"/>
+        <w:keepNext/>
         <w:ind w:left="-5"/>
         <w:jc w:val="center"/>
       </w:pPr>
@@ -10344,12 +10130,14 @@
     <w:p>
       <w:pPr>
         <w:pStyle w:val="Heading3"/>
+        <w:keepNext/>
         <w:ind w:left="-5"/>
       </w:pPr>
     </w:p>
     <w:p>
       <w:pPr>
         <w:pStyle w:val="Heading3"/>
+        <w:keepNext/>
         <w:ind w:left="-5"/>
         <w:jc w:val="center"/>
       </w:pPr>
@@ -10370,6 +10158,7 @@
     <w:p>
       <w:pPr>
         <w:pStyle w:val="Heading3"/>
+        <w:keepNext/>
         <w:ind w:left="-5"/>
         <w:jc w:val="center"/>
       </w:pPr>
@@ -10470,6 +10259,7 @@
     <w:p>
       <w:pPr>
         <w:pStyle w:val="Heading3"/>
+        <w:keepNext/>
         <w:ind w:left="-5"/>
         <w:jc w:val="center"/>
       </w:pPr>
@@ -10492,7 +10282,9 @@
     <w:p>
       <w:pPr>
         <w:pStyle w:val="Heading2"/>
-        <w:spacing w:after="308"/>
+        <w:keepNext/>
+        <w:pageBreakBefore/>
+        <w:spacing w:after="240" w:before="0"/>
         <w:jc w:val="center"/>
       </w:pPr>
       <w:r>
@@ -10503,6 +10295,7 @@
     <w:p>
       <w:pPr>
         <w:pStyle w:val="Heading3"/>
+        <w:keepNext/>
         <w:ind w:left="-5"/>
         <w:jc w:val="center"/>
       </w:pPr>
@@ -10578,6 +10371,7 @@
     <w:p>
       <w:pPr>
         <w:pStyle w:val="Heading3"/>
+        <w:keepNext/>
         <w:ind w:left="-5"/>
         <w:jc w:val="center"/>
       </w:pPr>
@@ -10653,6 +10447,7 @@
     <w:p>
       <w:pPr>
         <w:pStyle w:val="Heading3"/>
+        <w:keepNext/>
         <w:ind w:left="-5"/>
         <w:jc w:val="center"/>
       </w:pPr>
@@ -10673,6 +10468,7 @@
     <w:p>
       <w:pPr>
         <w:pStyle w:val="Heading4"/>
+        <w:keepNext/>
         <w:ind w:left="-5"/>
         <w:jc w:val="center"/>
       </w:pPr>
@@ -10748,6 +10544,7 @@
     <w:p>
       <w:pPr>
         <w:pStyle w:val="Heading4"/>
+        <w:keepNext/>
         <w:ind w:left="-5"/>
         <w:jc w:val="center"/>
       </w:pPr>
@@ -10823,6 +10620,7 @@
     <w:p>
       <w:pPr>
         <w:pStyle w:val="Heading4"/>
+        <w:keepNext/>
         <w:ind w:left="-5"/>
         <w:jc w:val="center"/>
       </w:pPr>
@@ -10898,6 +10696,7 @@
     <w:p>
       <w:pPr>
         <w:pStyle w:val="Heading4"/>
+        <w:keepNext/>
         <w:ind w:left="-5"/>
         <w:jc w:val="center"/>
       </w:pPr>
@@ -10973,6 +10772,7 @@
     <w:p>
       <w:pPr>
         <w:pStyle w:val="Heading4"/>
+        <w:keepNext/>
         <w:ind w:left="-5"/>
         <w:jc w:val="center"/>
       </w:pPr>
@@ -11048,6 +10848,7 @@
     <w:p>
       <w:pPr>
         <w:pStyle w:val="Heading4"/>
+        <w:keepNext/>
         <w:jc w:val="center"/>
       </w:pPr>
       <w:r>
@@ -11116,6 +10917,7 @@
     <w:p>
       <w:pPr>
         <w:pStyle w:val="Heading3"/>
+        <w:keepNext/>
         <w:ind w:left="-5"/>
         <w:jc w:val="center"/>
       </w:pPr>
@@ -11822,6 +11624,7 @@
     <w:p>
       <w:pPr>
         <w:pStyle w:val="Heading3"/>
+        <w:keepNext/>
         <w:spacing w:after="0"/>
         <w:ind w:left="-5"/>
         <w:jc w:val="center"/>
@@ -12481,6 +12284,7 @@
     <w:p>
       <w:pPr>
         <w:pStyle w:val="Heading3"/>
+        <w:keepNext/>
         <w:ind w:left="-5"/>
         <w:jc w:val="center"/>
       </w:pPr>
@@ -12504,6 +12308,7 @@
     <w:p>
       <w:pPr>
         <w:pStyle w:val="Heading3"/>
+        <w:keepNext/>
         <w:ind w:left="-5"/>
         <w:jc w:val="center"/>
       </w:pPr>
@@ -12526,7 +12331,9 @@
     <w:p>
       <w:pPr>
         <w:pStyle w:val="Heading2"/>
-        <w:spacing w:after="308"/>
+        <w:keepNext/>
+        <w:pageBreakBefore/>
+        <w:spacing w:after="240" w:before="0"/>
         <w:jc w:val="center"/>
       </w:pPr>
       <w:r>
@@ -12537,6 +12344,7 @@
     <w:p>
       <w:pPr>
         <w:pStyle w:val="Heading3"/>
+        <w:keepNext/>
         <w:ind w:left="-5"/>
         <w:jc w:val="center"/>
       </w:pPr>
@@ -12567,6 +12375,7 @@
     <w:p>
       <w:pPr>
         <w:pStyle w:val="Heading3"/>
+        <w:keepNext/>
         <w:spacing w:after="0"/>
         <w:ind w:left="-5"/>
         <w:jc w:val="center"/>
@@ -13996,12 +13805,14 @@
     <w:p>
       <w:pPr>
         <w:pStyle w:val="Heading3"/>
+        <w:keepNext/>
         <w:ind w:left="-5"/>
       </w:pPr>
     </w:p>
     <w:p>
       <w:pPr>
         <w:pStyle w:val="Heading3"/>
+        <w:keepNext/>
         <w:ind w:left="-5"/>
         <w:jc w:val="center"/>
       </w:pPr>
@@ -14748,6 +14559,7 @@
     <w:p>
       <w:pPr>
         <w:pStyle w:val="Heading3"/>
+        <w:keepNext/>
         <w:ind w:left="-5"/>
         <w:jc w:val="center"/>
       </w:pPr>
@@ -14850,6 +14662,7 @@
     <w:p>
       <w:pPr>
         <w:pStyle w:val="Heading3"/>
+        <w:keepNext/>
         <w:ind w:left="-5"/>
         <w:jc w:val="center"/>
       </w:pPr>
@@ -14870,6 +14683,7 @@
     <w:p>
       <w:pPr>
         <w:pStyle w:val="Heading3"/>
+        <w:keepNext/>
         <w:ind w:left="-5"/>
         <w:jc w:val="center"/>
       </w:pPr>
@@ -14963,6 +14777,7 @@
     <w:p>
       <w:pPr>
         <w:pStyle w:val="Heading3"/>
+        <w:keepNext/>
         <w:ind w:left="-5"/>
         <w:jc w:val="center"/>
       </w:pPr>
@@ -15040,7 +14855,9 @@
     <w:p>
       <w:pPr>
         <w:pStyle w:val="Heading2"/>
-        <w:spacing w:after="308"/>
+        <w:keepNext/>
+        <w:pageBreakBefore/>
+        <w:spacing w:after="240" w:before="0"/>
         <w:jc w:val="center"/>
       </w:pPr>
       <w:r>
@@ -15050,6 +14867,7 @@
     <w:p>
       <w:pPr>
         <w:pStyle w:val="Heading3"/>
+        <w:keepNext/>
         <w:ind w:left="-5"/>
         <w:jc w:val="center"/>
       </w:pPr>
@@ -15070,6 +14888,7 @@
     <w:p>
       <w:pPr>
         <w:pStyle w:val="Heading3"/>
+        <w:keepNext/>
         <w:ind w:left="-5"/>
         <w:jc w:val="center"/>
       </w:pPr>
@@ -15201,6 +15020,7 @@
     <w:p>
       <w:pPr>
         <w:pStyle w:val="Heading3"/>
+        <w:keepNext/>
         <w:ind w:left="-5"/>
         <w:jc w:val="center"/>
       </w:pPr>
@@ -15220,6 +15040,9 @@
     <w:p>
       <w:pPr>
         <w:pStyle w:val="Heading2"/>
+        <w:keepNext/>
+        <w:pageBreakBefore/>
+        <w:spacing w:before="0" w:after="240"/>
         <w:ind w:right="1"/>
         <w:jc w:val="center"/>
       </w:pPr>
@@ -15245,6 +15068,7 @@
     <w:p>
       <w:pPr>
         <w:pStyle w:val="Heading3"/>
+        <w:keepNext/>
         <w:ind w:left="-5"/>
         <w:jc w:val="center"/>
       </w:pPr>
@@ -15265,6 +15089,7 @@
     <w:p>
       <w:pPr>
         <w:pStyle w:val="Heading3"/>
+        <w:keepNext/>
         <w:ind w:left="-5"/>
         <w:jc w:val="center"/>
       </w:pPr>
@@ -15285,6 +15110,7 @@
     <w:p>
       <w:pPr>
         <w:pStyle w:val="Heading3"/>
+        <w:keepNext/>
         <w:spacing w:after="147"/>
         <w:ind w:left="-5"/>
         <w:jc w:val="center"/>
@@ -15576,6 +15402,7 @@
     <w:p>
       <w:pPr>
         <w:pStyle w:val="Heading3"/>
+        <w:keepNext/>
         <w:spacing w:after="147"/>
         <w:ind w:left="-5"/>
         <w:jc w:val="center"/>
@@ -15876,6 +15703,7 @@
     <w:p>
       <w:pPr>
         <w:pStyle w:val="Heading3"/>
+        <w:keepNext/>
         <w:ind w:left="-5"/>
         <w:jc w:val="center"/>
       </w:pPr>
@@ -15908,6 +15736,9 @@
     <w:p>
       <w:pPr>
         <w:pStyle w:val="Heading2"/>
+        <w:keepNext/>
+        <w:pageBreakBefore/>
+        <w:spacing w:before="0" w:after="240"/>
         <w:ind w:right="2"/>
         <w:jc w:val="center"/>
       </w:pPr>
@@ -15919,6 +15750,7 @@
     <w:p>
       <w:pPr>
         <w:pStyle w:val="Heading3"/>
+        <w:keepNext/>
         <w:spacing w:after="0" w:line="265" w:lineRule="auto"/>
         <w:ind w:left="16" w:right="1"/>
         <w:jc w:val="center"/>
@@ -17939,6 +17771,7 @@
     <w:p>
       <w:pPr>
         <w:pStyle w:val="Heading3"/>
+        <w:keepNext/>
         <w:ind w:left="-5"/>
         <w:jc w:val="center"/>
       </w:pPr>
@@ -18044,6 +17877,9 @@
     <w:p>
       <w:pPr>
         <w:pStyle w:val="Heading2"/>
+        <w:keepNext/>
+        <w:pageBreakBefore/>
+        <w:spacing w:before="0" w:after="240"/>
         <w:ind w:right="1"/>
         <w:jc w:val="center"/>
       </w:pPr>
@@ -18055,6 +17891,7 @@
     <w:p>
       <w:pPr>
         <w:pStyle w:val="Heading3"/>
+        <w:keepNext/>
         <w:spacing w:after="189" w:line="265" w:lineRule="auto"/>
         <w:ind w:left="16" w:right="1"/>
         <w:jc w:val="center"/>
@@ -19155,6 +18992,7 @@
     <w:p>
       <w:pPr>
         <w:pStyle w:val="Heading3"/>
+        <w:keepNext/>
         <w:ind w:left="-5"/>
         <w:jc w:val="center"/>
       </w:pPr>
@@ -19175,6 +19013,7 @@
     <w:p>
       <w:pPr>
         <w:pStyle w:val="Heading3"/>
+        <w:keepNext/>
         <w:spacing w:after="0"/>
         <w:ind w:left="-5"/>
         <w:jc w:val="center"/>
@@ -19912,6 +19751,7 @@
     <w:p>
       <w:pPr>
         <w:pStyle w:val="Heading3"/>
+        <w:keepNext/>
         <w:ind w:left="-5"/>
         <w:jc w:val="center"/>
       </w:pPr>
@@ -19994,6 +19834,9 @@
     <w:p>
       <w:pPr>
         <w:pStyle w:val="Heading2"/>
+        <w:keepNext/>
+        <w:pageBreakBefore/>
+        <w:spacing w:before="0" w:after="240"/>
         <w:ind w:right="1"/>
         <w:jc w:val="center"/>
       </w:pPr>
@@ -20005,6 +19848,7 @@
     <w:p>
       <w:pPr>
         <w:pStyle w:val="Heading3"/>
+        <w:keepNext/>
         <w:spacing w:after="189" w:line="265" w:lineRule="auto"/>
         <w:ind w:left="16" w:right="2"/>
         <w:jc w:val="center"/>
@@ -20177,6 +20021,7 @@
     <w:p>
       <w:pPr>
         <w:pStyle w:val="Heading3"/>
+        <w:keepNext/>
         <w:spacing w:after="0"/>
         <w:ind w:left="-5"/>
         <w:jc w:val="center"/>
@@ -20914,6 +20759,9 @@
     <w:p>
       <w:pPr>
         <w:pStyle w:val="Heading1"/>
+        <w:keepNext/>
+        <w:pageBreakBefore/>
+        <w:spacing w:before="0" w:after="240"/>
         <w:ind w:left="18"/>
         <w:jc w:val="center"/>
       </w:pPr>
@@ -20945,6 +20793,7 @@
     </w:p>
     <w:p>
       <w:pPr>
+        <w:keepNext/>
         <w:numPr>
           <w:ilvl w:val="0"/>
           <w:numId w:val="10"/>
@@ -20960,6 +20809,7 @@
     </w:p>
     <w:p>
       <w:pPr>
+        <w:keepNext/>
         <w:numPr>
           <w:ilvl w:val="0"/>
           <w:numId w:val="10"/>
@@ -20996,6 +20846,7 @@
     </w:p>
     <w:p>
       <w:pPr>
+        <w:keepNext/>
         <w:numPr>
           <w:ilvl w:val="0"/>
           <w:numId w:val="10"/>
@@ -21010,6 +20861,7 @@
     </w:p>
     <w:p>
       <w:pPr>
+        <w:keepNext/>
         <w:numPr>
           <w:ilvl w:val="0"/>
           <w:numId w:val="10"/>
@@ -21162,6 +21014,7 @@
     </w:p>
     <w:p>
       <w:pPr>
+        <w:keepNext/>
         <w:numPr>
           <w:ilvl w:val="0"/>
           <w:numId w:val="10"/>
@@ -21187,6 +21040,7 @@
     <w:p>
       <w:pPr>
         <w:pStyle w:val="Heading2"/>
+        <w:keepNext/>
         <w:spacing w:after="221"/>
         <w:ind w:left="-5"/>
         <w:jc w:val="center"/>

</xml_diff>

<commit_message>
Fit entire Table of Contents on single page with complete bottom border
</commit_message>
<xml_diff>
--- a/Pairix_Phase_I_Report_final.docx
+++ b/Pairix_Phase_I_Report_final.docx
@@ -1070,7 +1070,7 @@
       <w:pPr>
         <w:keepNext/>
         <w:pageBreakBefore/>
-        <w:spacing w:after="240" w:line="259" w:lineRule="auto" w:before="0"/>
+        <w:spacing w:after="120" w:line="259" w:lineRule="auto" w:before="0"/>
         <w:ind w:right="0" w:firstLine="0"/>
         <w:jc w:val="center"/>
       </w:pPr>
@@ -1098,9 +1098,9 @@
       </w:tblGrid>
       <w:tr>
         <w:trPr>
-          <w:trHeight w:val="218"/>
           <w:tblHeader/>
           <w:cantSplit/>
+          <w:trHeight w:val="210" w:hRule="atLeast"/>
         </w:trPr>
         <w:tc>
           <w:tcPr>
@@ -1111,17 +1111,23 @@
               <w:bottom w:val="single" w:sz="4" w:space="0" w:color="000000"/>
               <w:right w:val="single" w:sz="4" w:space="0" w:color="000000"/>
             </w:tcBorders>
-          </w:tcPr>
-          <w:p>
-            <w:pPr>
-              <w:spacing w:after="0" w:line="259" w:lineRule="auto"/>
+            <w:tcMar>
+              <w:top w:w="20" w:type="dxa"/>
+              <w:bottom w:w="20" w:type="dxa"/>
+              <w:left w:w="60" w:type="dxa"/>
+              <w:right w:w="60" w:type="dxa"/>
+            </w:tcMar>
+          </w:tcPr>
+          <w:p>
+            <w:pPr>
+              <w:spacing w:after="0" w:line="240" w:lineRule="auto" w:before="0"/>
               <w:ind w:left="117" w:right="0" w:firstLine="0"/>
               <w:jc w:val="center"/>
             </w:pPr>
             <w:r>
               <w:rPr>
                 <w:b/>
-                <w:sz w:val="20"/>
+                <w:sz w:val="18"/>
               </w:rPr>
               <w:t>CHAPTER / SECTION</w:t>
             </w:r>
@@ -1136,17 +1142,23 @@
               <w:bottom w:val="single" w:sz="4" w:space="0" w:color="000000"/>
               <w:right w:val="single" w:sz="4" w:space="0" w:color="000000"/>
             </w:tcBorders>
-          </w:tcPr>
-          <w:p>
-            <w:pPr>
-              <w:spacing w:after="0" w:line="259" w:lineRule="auto"/>
+            <w:tcMar>
+              <w:top w:w="20" w:type="dxa"/>
+              <w:bottom w:w="20" w:type="dxa"/>
+              <w:left w:w="60" w:type="dxa"/>
+              <w:right w:w="60" w:type="dxa"/>
+            </w:tcMar>
+          </w:tcPr>
+          <w:p>
+            <w:pPr>
+              <w:spacing w:after="0" w:line="240" w:lineRule="auto" w:before="0"/>
               <w:ind w:left="118" w:right="0" w:firstLine="0"/>
               <w:jc w:val="center"/>
             </w:pPr>
             <w:r>
               <w:rPr>
                 <w:b/>
-                <w:sz w:val="20"/>
+                <w:sz w:val="18"/>
               </w:rPr>
               <w:t>TITLE</w:t>
             </w:r>
@@ -1161,17 +1173,23 @@
               <w:bottom w:val="single" w:sz="4" w:space="0" w:color="000000"/>
               <w:right w:val="nil"/>
             </w:tcBorders>
-          </w:tcPr>
-          <w:p>
-            <w:pPr>
-              <w:spacing w:after="160" w:line="259" w:lineRule="auto"/>
+            <w:tcMar>
+              <w:top w:w="20" w:type="dxa"/>
+              <w:bottom w:w="20" w:type="dxa"/>
+              <w:left w:w="60" w:type="dxa"/>
+              <w:right w:w="60" w:type="dxa"/>
+            </w:tcMar>
+          </w:tcPr>
+          <w:p>
+            <w:pPr>
+              <w:spacing w:after="0" w:line="240" w:lineRule="auto" w:before="0"/>
               <w:ind w:right="0" w:firstLine="0"/>
               <w:jc w:val="left"/>
             </w:pPr>
             <w:r>
               <w:rPr>
                 <w:b/>
-                <w:sz w:val="20"/>
+                <w:sz w:val="18"/>
               </w:rPr>
               <w:t>PAGE</w:t>
             </w:r>
@@ -1180,8 +1198,8 @@
       </w:tr>
       <w:tr>
         <w:trPr>
-          <w:trHeight w:val="286"/>
           <w:cantSplit/>
+          <w:trHeight w:val="210" w:hRule="atLeast"/>
         </w:trPr>
         <w:tc>
           <w:tcPr>
@@ -1192,10 +1210,16 @@
               <w:bottom w:val="single" w:sz="4" w:space="0" w:color="000000"/>
               <w:right w:val="single" w:sz="4" w:space="0" w:color="000000"/>
             </w:tcBorders>
-          </w:tcPr>
-          <w:p>
-            <w:pPr>
-              <w:spacing w:after="160" w:line="259" w:lineRule="auto"/>
+            <w:tcMar>
+              <w:top w:w="20" w:type="dxa"/>
+              <w:bottom w:w="20" w:type="dxa"/>
+              <w:left w:w="60" w:type="dxa"/>
+              <w:right w:w="60" w:type="dxa"/>
+            </w:tcMar>
+          </w:tcPr>
+          <w:p>
+            <w:pPr>
+              <w:spacing w:after="0" w:line="240" w:lineRule="auto" w:before="0"/>
               <w:ind w:right="0" w:firstLine="0"/>
               <w:jc w:val="left"/>
             </w:pPr>
@@ -1210,16 +1234,22 @@
               <w:bottom w:val="single" w:sz="4" w:space="0" w:color="000000"/>
               <w:right w:val="single" w:sz="4" w:space="0" w:color="000000"/>
             </w:tcBorders>
-          </w:tcPr>
-          <w:p>
-            <w:pPr>
-              <w:spacing w:after="0" w:line="259" w:lineRule="auto"/>
-              <w:ind w:left="110" w:right="0" w:firstLine="0"/>
-              <w:jc w:val="left"/>
-            </w:pPr>
-            <w:r>
-              <w:rPr>
-                <w:sz w:val="19"/>
+            <w:tcMar>
+              <w:top w:w="20" w:type="dxa"/>
+              <w:bottom w:w="20" w:type="dxa"/>
+              <w:left w:w="60" w:type="dxa"/>
+              <w:right w:w="60" w:type="dxa"/>
+            </w:tcMar>
+          </w:tcPr>
+          <w:p>
+            <w:pPr>
+              <w:spacing w:after="0" w:line="240" w:lineRule="auto" w:before="0"/>
+              <w:ind w:left="110" w:right="0" w:firstLine="0"/>
+              <w:jc w:val="left"/>
+            </w:pPr>
+            <w:r>
+              <w:rPr>
+                <w:sz w:val="17"/>
               </w:rPr>
               <w:t>ACKNOWLEDGMENT</w:t>
             </w:r>
@@ -1234,16 +1264,22 @@
               <w:bottom w:val="single" w:sz="4" w:space="0" w:color="000000"/>
               <w:right w:val="nil"/>
             </w:tcBorders>
-          </w:tcPr>
-          <w:p>
-            <w:pPr>
-              <w:spacing w:after="0" w:line="259" w:lineRule="auto"/>
-              <w:ind w:left="110" w:right="0" w:firstLine="0"/>
-              <w:jc w:val="left"/>
-            </w:pPr>
-            <w:r>
-              <w:rPr>
-                <w:sz w:val="19"/>
+            <w:tcMar>
+              <w:top w:w="20" w:type="dxa"/>
+              <w:bottom w:w="20" w:type="dxa"/>
+              <w:left w:w="60" w:type="dxa"/>
+              <w:right w:w="60" w:type="dxa"/>
+            </w:tcMar>
+          </w:tcPr>
+          <w:p>
+            <w:pPr>
+              <w:spacing w:after="0" w:line="240" w:lineRule="auto" w:before="0"/>
+              <w:ind w:left="110" w:right="0" w:firstLine="0"/>
+              <w:jc w:val="left"/>
+            </w:pPr>
+            <w:r>
+              <w:rPr>
+                <w:sz w:val="17"/>
               </w:rPr>
               <w:t>iii</w:t>
             </w:r>
@@ -1252,8 +1288,8 @@
       </w:tr>
       <w:tr>
         <w:trPr>
-          <w:trHeight w:val="286"/>
           <w:cantSplit/>
+          <w:trHeight w:val="210" w:hRule="atLeast"/>
         </w:trPr>
         <w:tc>
           <w:tcPr>
@@ -1264,10 +1300,16 @@
               <w:bottom w:val="single" w:sz="4" w:space="0" w:color="000000"/>
               <w:right w:val="single" w:sz="4" w:space="0" w:color="000000"/>
             </w:tcBorders>
-          </w:tcPr>
-          <w:p>
-            <w:pPr>
-              <w:spacing w:after="160" w:line="259" w:lineRule="auto"/>
+            <w:tcMar>
+              <w:top w:w="20" w:type="dxa"/>
+              <w:bottom w:w="20" w:type="dxa"/>
+              <w:left w:w="60" w:type="dxa"/>
+              <w:right w:w="60" w:type="dxa"/>
+            </w:tcMar>
+          </w:tcPr>
+          <w:p>
+            <w:pPr>
+              <w:spacing w:after="0" w:line="240" w:lineRule="auto" w:before="0"/>
               <w:ind w:right="0" w:firstLine="0"/>
               <w:jc w:val="left"/>
             </w:pPr>
@@ -1282,16 +1324,22 @@
               <w:bottom w:val="single" w:sz="4" w:space="0" w:color="000000"/>
               <w:right w:val="single" w:sz="4" w:space="0" w:color="000000"/>
             </w:tcBorders>
-          </w:tcPr>
-          <w:p>
-            <w:pPr>
-              <w:spacing w:after="0" w:line="259" w:lineRule="auto"/>
-              <w:ind w:left="110" w:right="0" w:firstLine="0"/>
-              <w:jc w:val="left"/>
-            </w:pPr>
-            <w:r>
-              <w:rPr>
-                <w:sz w:val="19"/>
+            <w:tcMar>
+              <w:top w:w="20" w:type="dxa"/>
+              <w:bottom w:w="20" w:type="dxa"/>
+              <w:left w:w="60" w:type="dxa"/>
+              <w:right w:w="60" w:type="dxa"/>
+            </w:tcMar>
+          </w:tcPr>
+          <w:p>
+            <w:pPr>
+              <w:spacing w:after="0" w:line="240" w:lineRule="auto" w:before="0"/>
+              <w:ind w:left="110" w:right="0" w:firstLine="0"/>
+              <w:jc w:val="left"/>
+            </w:pPr>
+            <w:r>
+              <w:rPr>
+                <w:sz w:val="17"/>
               </w:rPr>
               <w:t>ABSTRACT</w:t>
             </w:r>
@@ -1306,16 +1354,22 @@
               <w:bottom w:val="single" w:sz="4" w:space="0" w:color="000000"/>
               <w:right w:val="nil"/>
             </w:tcBorders>
-          </w:tcPr>
-          <w:p>
-            <w:pPr>
-              <w:spacing w:after="0" w:line="259" w:lineRule="auto"/>
-              <w:ind w:left="110" w:right="0" w:firstLine="0"/>
-              <w:jc w:val="left"/>
-            </w:pPr>
-            <w:r>
-              <w:rPr>
-                <w:sz w:val="19"/>
+            <w:tcMar>
+              <w:top w:w="20" w:type="dxa"/>
+              <w:bottom w:w="20" w:type="dxa"/>
+              <w:left w:w="60" w:type="dxa"/>
+              <w:right w:w="60" w:type="dxa"/>
+            </w:tcMar>
+          </w:tcPr>
+          <w:p>
+            <w:pPr>
+              <w:spacing w:after="0" w:line="240" w:lineRule="auto" w:before="0"/>
+              <w:ind w:left="110" w:right="0" w:firstLine="0"/>
+              <w:jc w:val="left"/>
+            </w:pPr>
+            <w:r>
+              <w:rPr>
+                <w:sz w:val="17"/>
               </w:rPr>
               <w:t>iv</w:t>
             </w:r>
@@ -1324,8 +1378,8 @@
       </w:tr>
       <w:tr>
         <w:trPr>
-          <w:trHeight w:val="286"/>
           <w:cantSplit/>
+          <w:trHeight w:val="210" w:hRule="atLeast"/>
         </w:trPr>
         <w:tc>
           <w:tcPr>
@@ -1336,10 +1390,16 @@
               <w:bottom w:val="single" w:sz="4" w:space="0" w:color="000000"/>
               <w:right w:val="single" w:sz="4" w:space="0" w:color="000000"/>
             </w:tcBorders>
-          </w:tcPr>
-          <w:p>
-            <w:pPr>
-              <w:spacing w:after="160" w:line="259" w:lineRule="auto"/>
+            <w:tcMar>
+              <w:top w:w="20" w:type="dxa"/>
+              <w:bottom w:w="20" w:type="dxa"/>
+              <w:left w:w="60" w:type="dxa"/>
+              <w:right w:w="60" w:type="dxa"/>
+            </w:tcMar>
+          </w:tcPr>
+          <w:p>
+            <w:pPr>
+              <w:spacing w:after="0" w:line="240" w:lineRule="auto" w:before="0"/>
               <w:ind w:right="0" w:firstLine="0"/>
               <w:jc w:val="left"/>
             </w:pPr>
@@ -1354,16 +1414,22 @@
               <w:bottom w:val="single" w:sz="4" w:space="0" w:color="000000"/>
               <w:right w:val="single" w:sz="4" w:space="0" w:color="000000"/>
             </w:tcBorders>
-          </w:tcPr>
-          <w:p>
-            <w:pPr>
-              <w:spacing w:after="0" w:line="259" w:lineRule="auto"/>
-              <w:ind w:left="110" w:right="0" w:firstLine="0"/>
-              <w:jc w:val="left"/>
-            </w:pPr>
-            <w:r>
-              <w:rPr>
-                <w:sz w:val="19"/>
+            <w:tcMar>
+              <w:top w:w="20" w:type="dxa"/>
+              <w:bottom w:w="20" w:type="dxa"/>
+              <w:left w:w="60" w:type="dxa"/>
+              <w:right w:w="60" w:type="dxa"/>
+            </w:tcMar>
+          </w:tcPr>
+          <w:p>
+            <w:pPr>
+              <w:spacing w:after="0" w:line="240" w:lineRule="auto" w:before="0"/>
+              <w:ind w:left="110" w:right="0" w:firstLine="0"/>
+              <w:jc w:val="left"/>
+            </w:pPr>
+            <w:r>
+              <w:rPr>
+                <w:sz w:val="17"/>
               </w:rPr>
               <w:t>LIST OF FIGURES</w:t>
             </w:r>
@@ -1378,16 +1444,22 @@
               <w:bottom w:val="single" w:sz="4" w:space="0" w:color="000000"/>
               <w:right w:val="nil"/>
             </w:tcBorders>
-          </w:tcPr>
-          <w:p>
-            <w:pPr>
-              <w:spacing w:after="0" w:line="259" w:lineRule="auto"/>
-              <w:ind w:left="110" w:right="0" w:firstLine="0"/>
-              <w:jc w:val="left"/>
-            </w:pPr>
-            <w:r>
-              <w:rPr>
-                <w:sz w:val="19"/>
+            <w:tcMar>
+              <w:top w:w="20" w:type="dxa"/>
+              <w:bottom w:w="20" w:type="dxa"/>
+              <w:left w:w="60" w:type="dxa"/>
+              <w:right w:w="60" w:type="dxa"/>
+            </w:tcMar>
+          </w:tcPr>
+          <w:p>
+            <w:pPr>
+              <w:spacing w:after="0" w:line="240" w:lineRule="auto" w:before="0"/>
+              <w:ind w:left="110" w:right="0" w:firstLine="0"/>
+              <w:jc w:val="left"/>
+            </w:pPr>
+            <w:r>
+              <w:rPr>
+                <w:sz w:val="17"/>
               </w:rPr>
               <w:t>vi</w:t>
             </w:r>
@@ -1396,8 +1468,8 @@
       </w:tr>
       <w:tr>
         <w:trPr>
-          <w:trHeight w:val="286"/>
           <w:cantSplit/>
+          <w:trHeight w:val="210" w:hRule="atLeast"/>
         </w:trPr>
         <w:tc>
           <w:tcPr>
@@ -1408,10 +1480,16 @@
               <w:bottom w:val="single" w:sz="4" w:space="0" w:color="000000"/>
               <w:right w:val="single" w:sz="4" w:space="0" w:color="000000"/>
             </w:tcBorders>
-          </w:tcPr>
-          <w:p>
-            <w:pPr>
-              <w:spacing w:after="160" w:line="259" w:lineRule="auto"/>
+            <w:tcMar>
+              <w:top w:w="20" w:type="dxa"/>
+              <w:bottom w:w="20" w:type="dxa"/>
+              <w:left w:w="60" w:type="dxa"/>
+              <w:right w:w="60" w:type="dxa"/>
+            </w:tcMar>
+          </w:tcPr>
+          <w:p>
+            <w:pPr>
+              <w:spacing w:after="0" w:line="240" w:lineRule="auto" w:before="0"/>
               <w:ind w:right="0" w:firstLine="0"/>
               <w:jc w:val="left"/>
             </w:pPr>
@@ -1426,16 +1504,22 @@
               <w:bottom w:val="single" w:sz="4" w:space="0" w:color="000000"/>
               <w:right w:val="single" w:sz="4" w:space="0" w:color="000000"/>
             </w:tcBorders>
-          </w:tcPr>
-          <w:p>
-            <w:pPr>
-              <w:spacing w:after="0" w:line="259" w:lineRule="auto"/>
-              <w:ind w:left="110" w:right="0" w:firstLine="0"/>
-              <w:jc w:val="left"/>
-            </w:pPr>
-            <w:r>
-              <w:rPr>
-                <w:sz w:val="19"/>
+            <w:tcMar>
+              <w:top w:w="20" w:type="dxa"/>
+              <w:bottom w:w="20" w:type="dxa"/>
+              <w:left w:w="60" w:type="dxa"/>
+              <w:right w:w="60" w:type="dxa"/>
+            </w:tcMar>
+          </w:tcPr>
+          <w:p>
+            <w:pPr>
+              <w:spacing w:after="0" w:line="240" w:lineRule="auto" w:before="0"/>
+              <w:ind w:left="110" w:right="0" w:firstLine="0"/>
+              <w:jc w:val="left"/>
+            </w:pPr>
+            <w:r>
+              <w:rPr>
+                <w:sz w:val="17"/>
               </w:rPr>
               <w:t>LIST OF TABLES</w:t>
             </w:r>
@@ -1450,16 +1534,22 @@
               <w:bottom w:val="single" w:sz="4" w:space="0" w:color="000000"/>
               <w:right w:val="nil"/>
             </w:tcBorders>
-          </w:tcPr>
-          <w:p>
-            <w:pPr>
-              <w:spacing w:after="0" w:line="259" w:lineRule="auto"/>
-              <w:ind w:left="110" w:right="0" w:firstLine="0"/>
-              <w:jc w:val="left"/>
-            </w:pPr>
-            <w:r>
-              <w:rPr>
-                <w:sz w:val="19"/>
+            <w:tcMar>
+              <w:top w:w="20" w:type="dxa"/>
+              <w:bottom w:w="20" w:type="dxa"/>
+              <w:left w:w="60" w:type="dxa"/>
+              <w:right w:w="60" w:type="dxa"/>
+            </w:tcMar>
+          </w:tcPr>
+          <w:p>
+            <w:pPr>
+              <w:spacing w:after="0" w:line="240" w:lineRule="auto" w:before="0"/>
+              <w:ind w:left="110" w:right="0" w:firstLine="0"/>
+              <w:jc w:val="left"/>
+            </w:pPr>
+            <w:r>
+              <w:rPr>
+                <w:sz w:val="17"/>
               </w:rPr>
               <w:t>vii</w:t>
             </w:r>
@@ -1468,8 +1558,8 @@
       </w:tr>
       <w:tr>
         <w:trPr>
-          <w:trHeight w:val="286"/>
           <w:cantSplit/>
+          <w:trHeight w:val="210" w:hRule="atLeast"/>
         </w:trPr>
         <w:tc>
           <w:tcPr>
@@ -1480,10 +1570,16 @@
               <w:bottom w:val="single" w:sz="4" w:space="0" w:color="000000"/>
               <w:right w:val="single" w:sz="4" w:space="0" w:color="000000"/>
             </w:tcBorders>
-          </w:tcPr>
-          <w:p>
-            <w:pPr>
-              <w:spacing w:after="160" w:line="259" w:lineRule="auto"/>
+            <w:tcMar>
+              <w:top w:w="20" w:type="dxa"/>
+              <w:bottom w:w="20" w:type="dxa"/>
+              <w:left w:w="60" w:type="dxa"/>
+              <w:right w:w="60" w:type="dxa"/>
+            </w:tcMar>
+          </w:tcPr>
+          <w:p>
+            <w:pPr>
+              <w:spacing w:after="0" w:line="240" w:lineRule="auto" w:before="0"/>
               <w:ind w:right="0" w:firstLine="0"/>
               <w:jc w:val="left"/>
             </w:pPr>
@@ -1498,16 +1594,22 @@
               <w:bottom w:val="single" w:sz="4" w:space="0" w:color="000000"/>
               <w:right w:val="single" w:sz="4" w:space="0" w:color="000000"/>
             </w:tcBorders>
-          </w:tcPr>
-          <w:p>
-            <w:pPr>
-              <w:spacing w:after="0" w:line="259" w:lineRule="auto"/>
-              <w:ind w:left="110" w:right="0" w:firstLine="0"/>
-              <w:jc w:val="left"/>
-            </w:pPr>
-            <w:r>
-              <w:rPr>
-                <w:sz w:val="19"/>
+            <w:tcMar>
+              <w:top w:w="20" w:type="dxa"/>
+              <w:bottom w:w="20" w:type="dxa"/>
+              <w:left w:w="60" w:type="dxa"/>
+              <w:right w:w="60" w:type="dxa"/>
+            </w:tcMar>
+          </w:tcPr>
+          <w:p>
+            <w:pPr>
+              <w:spacing w:after="0" w:line="240" w:lineRule="auto" w:before="0"/>
+              <w:ind w:left="110" w:right="0" w:firstLine="0"/>
+              <w:jc w:val="left"/>
+            </w:pPr>
+            <w:r>
+              <w:rPr>
+                <w:sz w:val="17"/>
               </w:rPr>
               <w:t>LIST OF ABBREVIATIONS</w:t>
             </w:r>
@@ -1522,16 +1624,22 @@
               <w:bottom w:val="single" w:sz="4" w:space="0" w:color="000000"/>
               <w:right w:val="nil"/>
             </w:tcBorders>
-          </w:tcPr>
-          <w:p>
-            <w:pPr>
-              <w:spacing w:after="0" w:line="259" w:lineRule="auto"/>
-              <w:ind w:left="110" w:right="0" w:firstLine="0"/>
-              <w:jc w:val="left"/>
-            </w:pPr>
-            <w:r>
-              <w:rPr>
-                <w:sz w:val="19"/>
+            <w:tcMar>
+              <w:top w:w="20" w:type="dxa"/>
+              <w:bottom w:w="20" w:type="dxa"/>
+              <w:left w:w="60" w:type="dxa"/>
+              <w:right w:w="60" w:type="dxa"/>
+            </w:tcMar>
+          </w:tcPr>
+          <w:p>
+            <w:pPr>
+              <w:spacing w:after="0" w:line="240" w:lineRule="auto" w:before="0"/>
+              <w:ind w:left="110" w:right="0" w:firstLine="0"/>
+              <w:jc w:val="left"/>
+            </w:pPr>
+            <w:r>
+              <w:rPr>
+                <w:sz w:val="17"/>
               </w:rPr>
               <w:t>viii</w:t>
             </w:r>
@@ -1540,8 +1648,8 @@
       </w:tr>
       <w:tr>
         <w:trPr>
-          <w:trHeight w:val="216"/>
           <w:cantSplit/>
+          <w:trHeight w:val="210" w:hRule="atLeast"/>
         </w:trPr>
         <w:tc>
           <w:tcPr>
@@ -1552,16 +1660,22 @@
               <w:bottom w:val="single" w:sz="4" w:space="0" w:color="000000"/>
               <w:right w:val="single" w:sz="4" w:space="0" w:color="000000"/>
             </w:tcBorders>
-          </w:tcPr>
-          <w:p>
-            <w:pPr>
-              <w:spacing w:after="0" w:line="259" w:lineRule="auto"/>
-              <w:ind w:left="110" w:right="0" w:firstLine="0"/>
-              <w:jc w:val="left"/>
-            </w:pPr>
-            <w:r>
-              <w:rPr>
-                <w:sz w:val="19"/>
+            <w:tcMar>
+              <w:top w:w="20" w:type="dxa"/>
+              <w:bottom w:w="20" w:type="dxa"/>
+              <w:left w:w="60" w:type="dxa"/>
+              <w:right w:w="60" w:type="dxa"/>
+            </w:tcMar>
+          </w:tcPr>
+          <w:p>
+            <w:pPr>
+              <w:spacing w:after="0" w:line="240" w:lineRule="auto" w:before="0"/>
+              <w:ind w:left="110" w:right="0" w:firstLine="0"/>
+              <w:jc w:val="left"/>
+            </w:pPr>
+            <w:r>
+              <w:rPr>
+                <w:sz w:val="17"/>
               </w:rPr>
               <w:t>1</w:t>
             </w:r>
@@ -1576,16 +1690,22 @@
               <w:bottom w:val="single" w:sz="4" w:space="0" w:color="000000"/>
               <w:right w:val="single" w:sz="4" w:space="0" w:color="000000"/>
             </w:tcBorders>
-          </w:tcPr>
-          <w:p>
-            <w:pPr>
-              <w:spacing w:after="0" w:line="259" w:lineRule="auto"/>
-              <w:ind w:left="110" w:right="0" w:firstLine="0"/>
-              <w:jc w:val="left"/>
-            </w:pPr>
-            <w:r>
-              <w:rPr>
-                <w:sz w:val="19"/>
+            <w:tcMar>
+              <w:top w:w="20" w:type="dxa"/>
+              <w:bottom w:w="20" w:type="dxa"/>
+              <w:left w:w="60" w:type="dxa"/>
+              <w:right w:w="60" w:type="dxa"/>
+            </w:tcMar>
+          </w:tcPr>
+          <w:p>
+            <w:pPr>
+              <w:spacing w:after="0" w:line="240" w:lineRule="auto" w:before="0"/>
+              <w:ind w:left="110" w:right="0" w:firstLine="0"/>
+              <w:jc w:val="left"/>
+            </w:pPr>
+            <w:r>
+              <w:rPr>
+                <w:sz w:val="17"/>
               </w:rPr>
               <w:t>INTRODUCTION</w:t>
             </w:r>
@@ -1600,16 +1720,22 @@
               <w:bottom w:val="single" w:sz="4" w:space="0" w:color="000000"/>
               <w:right w:val="nil"/>
             </w:tcBorders>
-          </w:tcPr>
-          <w:p>
-            <w:pPr>
-              <w:spacing w:after="0" w:line="259" w:lineRule="auto"/>
-              <w:ind w:left="110" w:right="0" w:firstLine="0"/>
-              <w:jc w:val="left"/>
-            </w:pPr>
-            <w:r>
-              <w:rPr>
-                <w:sz w:val="19"/>
+            <w:tcMar>
+              <w:top w:w="20" w:type="dxa"/>
+              <w:bottom w:w="20" w:type="dxa"/>
+              <w:left w:w="60" w:type="dxa"/>
+              <w:right w:w="60" w:type="dxa"/>
+            </w:tcMar>
+          </w:tcPr>
+          <w:p>
+            <w:pPr>
+              <w:spacing w:after="0" w:line="240" w:lineRule="auto" w:before="0"/>
+              <w:ind w:left="110" w:right="0" w:firstLine="0"/>
+              <w:jc w:val="left"/>
+            </w:pPr>
+            <w:r>
+              <w:rPr>
+                <w:sz w:val="17"/>
               </w:rPr>
               <w:t>1</w:t>
             </w:r>
@@ -1618,8 +1744,8 @@
       </w:tr>
       <w:tr>
         <w:trPr>
-          <w:trHeight w:val="218"/>
           <w:cantSplit/>
+          <w:trHeight w:val="210" w:hRule="atLeast"/>
         </w:trPr>
         <w:tc>
           <w:tcPr>
@@ -1630,16 +1756,22 @@
               <w:bottom w:val="single" w:sz="4" w:space="0" w:color="000000"/>
               <w:right w:val="single" w:sz="4" w:space="0" w:color="000000"/>
             </w:tcBorders>
-          </w:tcPr>
-          <w:p>
-            <w:pPr>
-              <w:spacing w:after="0" w:line="259" w:lineRule="auto"/>
-              <w:ind w:left="110" w:right="0" w:firstLine="0"/>
-              <w:jc w:val="left"/>
-            </w:pPr>
-            <w:r>
-              <w:rPr>
-                <w:sz w:val="19"/>
+            <w:tcMar>
+              <w:top w:w="20" w:type="dxa"/>
+              <w:bottom w:w="20" w:type="dxa"/>
+              <w:left w:w="60" w:type="dxa"/>
+              <w:right w:w="60" w:type="dxa"/>
+            </w:tcMar>
+          </w:tcPr>
+          <w:p>
+            <w:pPr>
+              <w:spacing w:after="0" w:line="240" w:lineRule="auto" w:before="0"/>
+              <w:ind w:left="110" w:right="0" w:firstLine="0"/>
+              <w:jc w:val="left"/>
+            </w:pPr>
+            <w:r>
+              <w:rPr>
+                <w:sz w:val="17"/>
               </w:rPr>
               <w:t>1.1</w:t>
             </w:r>
@@ -1654,16 +1786,22 @@
               <w:bottom w:val="single" w:sz="4" w:space="0" w:color="000000"/>
               <w:right w:val="single" w:sz="4" w:space="0" w:color="000000"/>
             </w:tcBorders>
-          </w:tcPr>
-          <w:p>
-            <w:pPr>
-              <w:spacing w:after="0" w:line="259" w:lineRule="auto"/>
-              <w:ind w:left="110" w:right="0" w:firstLine="0"/>
-              <w:jc w:val="left"/>
-            </w:pPr>
-            <w:r>
-              <w:rPr>
-                <w:sz w:val="19"/>
+            <w:tcMar>
+              <w:top w:w="20" w:type="dxa"/>
+              <w:bottom w:w="20" w:type="dxa"/>
+              <w:left w:w="60" w:type="dxa"/>
+              <w:right w:w="60" w:type="dxa"/>
+            </w:tcMar>
+          </w:tcPr>
+          <w:p>
+            <w:pPr>
+              <w:spacing w:after="0" w:line="240" w:lineRule="auto" w:before="0"/>
+              <w:ind w:left="110" w:right="0" w:firstLine="0"/>
+              <w:jc w:val="left"/>
+            </w:pPr>
+            <w:r>
+              <w:rPr>
+                <w:sz w:val="17"/>
               </w:rPr>
               <w:t>Problem Statement</w:t>
             </w:r>
@@ -1678,16 +1816,22 @@
               <w:bottom w:val="single" w:sz="4" w:space="0" w:color="000000"/>
               <w:right w:val="nil"/>
             </w:tcBorders>
-          </w:tcPr>
-          <w:p>
-            <w:pPr>
-              <w:spacing w:after="0" w:line="259" w:lineRule="auto"/>
-              <w:ind w:left="110" w:right="0" w:firstLine="0"/>
-              <w:jc w:val="left"/>
-            </w:pPr>
-            <w:r>
-              <w:rPr>
-                <w:sz w:val="19"/>
+            <w:tcMar>
+              <w:top w:w="20" w:type="dxa"/>
+              <w:bottom w:w="20" w:type="dxa"/>
+              <w:left w:w="60" w:type="dxa"/>
+              <w:right w:w="60" w:type="dxa"/>
+            </w:tcMar>
+          </w:tcPr>
+          <w:p>
+            <w:pPr>
+              <w:spacing w:after="0" w:line="240" w:lineRule="auto" w:before="0"/>
+              <w:ind w:left="110" w:right="0" w:firstLine="0"/>
+              <w:jc w:val="left"/>
+            </w:pPr>
+            <w:r>
+              <w:rPr>
+                <w:sz w:val="17"/>
               </w:rPr>
               <w:t>1</w:t>
             </w:r>
@@ -1696,8 +1840,8 @@
       </w:tr>
       <w:tr>
         <w:trPr>
-          <w:trHeight w:val="216"/>
           <w:cantSplit/>
+          <w:trHeight w:val="210" w:hRule="atLeast"/>
         </w:trPr>
         <w:tc>
           <w:tcPr>
@@ -1708,16 +1852,22 @@
               <w:bottom w:val="single" w:sz="4" w:space="0" w:color="000000"/>
               <w:right w:val="single" w:sz="4" w:space="0" w:color="000000"/>
             </w:tcBorders>
-          </w:tcPr>
-          <w:p>
-            <w:pPr>
-              <w:spacing w:after="0" w:line="259" w:lineRule="auto"/>
-              <w:ind w:left="110" w:right="0" w:firstLine="0"/>
-              <w:jc w:val="left"/>
-            </w:pPr>
-            <w:r>
-              <w:rPr>
-                <w:sz w:val="19"/>
+            <w:tcMar>
+              <w:top w:w="20" w:type="dxa"/>
+              <w:bottom w:w="20" w:type="dxa"/>
+              <w:left w:w="60" w:type="dxa"/>
+              <w:right w:w="60" w:type="dxa"/>
+            </w:tcMar>
+          </w:tcPr>
+          <w:p>
+            <w:pPr>
+              <w:spacing w:after="0" w:line="240" w:lineRule="auto" w:before="0"/>
+              <w:ind w:left="110" w:right="0" w:firstLine="0"/>
+              <w:jc w:val="left"/>
+            </w:pPr>
+            <w:r>
+              <w:rPr>
+                <w:sz w:val="17"/>
               </w:rPr>
               <w:t>1.2</w:t>
             </w:r>
@@ -1732,16 +1882,22 @@
               <w:bottom w:val="single" w:sz="4" w:space="0" w:color="000000"/>
               <w:right w:val="single" w:sz="4" w:space="0" w:color="000000"/>
             </w:tcBorders>
-          </w:tcPr>
-          <w:p>
-            <w:pPr>
-              <w:spacing w:after="0" w:line="259" w:lineRule="auto"/>
-              <w:ind w:left="110" w:right="0" w:firstLine="0"/>
-              <w:jc w:val="left"/>
-            </w:pPr>
-            <w:r>
-              <w:rPr>
-                <w:sz w:val="19"/>
+            <w:tcMar>
+              <w:top w:w="20" w:type="dxa"/>
+              <w:bottom w:w="20" w:type="dxa"/>
+              <w:left w:w="60" w:type="dxa"/>
+              <w:right w:w="60" w:type="dxa"/>
+            </w:tcMar>
+          </w:tcPr>
+          <w:p>
+            <w:pPr>
+              <w:spacing w:after="0" w:line="240" w:lineRule="auto" w:before="0"/>
+              <w:ind w:left="110" w:right="0" w:firstLine="0"/>
+              <w:jc w:val="left"/>
+            </w:pPr>
+            <w:r>
+              <w:rPr>
+                <w:sz w:val="17"/>
               </w:rPr>
               <w:t>Objectives</w:t>
             </w:r>
@@ -1756,16 +1912,22 @@
               <w:bottom w:val="single" w:sz="4" w:space="0" w:color="000000"/>
               <w:right w:val="nil"/>
             </w:tcBorders>
-          </w:tcPr>
-          <w:p>
-            <w:pPr>
-              <w:spacing w:after="0" w:line="259" w:lineRule="auto"/>
-              <w:ind w:left="110" w:right="0" w:firstLine="0"/>
-              <w:jc w:val="left"/>
-            </w:pPr>
-            <w:r>
-              <w:rPr>
-                <w:sz w:val="19"/>
+            <w:tcMar>
+              <w:top w:w="20" w:type="dxa"/>
+              <w:bottom w:w="20" w:type="dxa"/>
+              <w:left w:w="60" w:type="dxa"/>
+              <w:right w:w="60" w:type="dxa"/>
+            </w:tcMar>
+          </w:tcPr>
+          <w:p>
+            <w:pPr>
+              <w:spacing w:after="0" w:line="240" w:lineRule="auto" w:before="0"/>
+              <w:ind w:left="110" w:right="0" w:firstLine="0"/>
+              <w:jc w:val="left"/>
+            </w:pPr>
+            <w:r>
+              <w:rPr>
+                <w:sz w:val="17"/>
               </w:rPr>
               <w:t>2</w:t>
             </w:r>
@@ -1774,8 +1936,8 @@
       </w:tr>
       <w:tr>
         <w:trPr>
-          <w:trHeight w:val="218"/>
           <w:cantSplit/>
+          <w:trHeight w:val="210" w:hRule="atLeast"/>
         </w:trPr>
         <w:tc>
           <w:tcPr>
@@ -1786,16 +1948,22 @@
               <w:bottom w:val="single" w:sz="4" w:space="0" w:color="000000"/>
               <w:right w:val="single" w:sz="4" w:space="0" w:color="000000"/>
             </w:tcBorders>
-          </w:tcPr>
-          <w:p>
-            <w:pPr>
-              <w:spacing w:after="0" w:line="259" w:lineRule="auto"/>
-              <w:ind w:left="110" w:right="0" w:firstLine="0"/>
-              <w:jc w:val="left"/>
-            </w:pPr>
-            <w:r>
-              <w:rPr>
-                <w:sz w:val="19"/>
+            <w:tcMar>
+              <w:top w:w="20" w:type="dxa"/>
+              <w:bottom w:w="20" w:type="dxa"/>
+              <w:left w:w="60" w:type="dxa"/>
+              <w:right w:w="60" w:type="dxa"/>
+            </w:tcMar>
+          </w:tcPr>
+          <w:p>
+            <w:pPr>
+              <w:spacing w:after="0" w:line="240" w:lineRule="auto" w:before="0"/>
+              <w:ind w:left="110" w:right="0" w:firstLine="0"/>
+              <w:jc w:val="left"/>
+            </w:pPr>
+            <w:r>
+              <w:rPr>
+                <w:sz w:val="17"/>
               </w:rPr>
               <w:t>1.3</w:t>
             </w:r>
@@ -1810,16 +1978,22 @@
               <w:bottom w:val="single" w:sz="4" w:space="0" w:color="000000"/>
               <w:right w:val="single" w:sz="4" w:space="0" w:color="000000"/>
             </w:tcBorders>
-          </w:tcPr>
-          <w:p>
-            <w:pPr>
-              <w:spacing w:after="0" w:line="259" w:lineRule="auto"/>
-              <w:ind w:left="110" w:right="0" w:firstLine="0"/>
-              <w:jc w:val="left"/>
-            </w:pPr>
-            <w:r>
-              <w:rPr>
-                <w:sz w:val="19"/>
+            <w:tcMar>
+              <w:top w:w="20" w:type="dxa"/>
+              <w:bottom w:w="20" w:type="dxa"/>
+              <w:left w:w="60" w:type="dxa"/>
+              <w:right w:w="60" w:type="dxa"/>
+            </w:tcMar>
+          </w:tcPr>
+          <w:p>
+            <w:pPr>
+              <w:spacing w:after="0" w:line="240" w:lineRule="auto" w:before="0"/>
+              <w:ind w:left="110" w:right="0" w:firstLine="0"/>
+              <w:jc w:val="left"/>
+            </w:pPr>
+            <w:r>
+              <w:rPr>
+                <w:sz w:val="17"/>
               </w:rPr>
               <w:t>Scope</w:t>
             </w:r>
@@ -1834,16 +2008,22 @@
               <w:bottom w:val="single" w:sz="4" w:space="0" w:color="000000"/>
               <w:right w:val="nil"/>
             </w:tcBorders>
-          </w:tcPr>
-          <w:p>
-            <w:pPr>
-              <w:spacing w:after="0" w:line="259" w:lineRule="auto"/>
-              <w:ind w:left="110" w:right="0" w:firstLine="0"/>
-              <w:jc w:val="left"/>
-            </w:pPr>
-            <w:r>
-              <w:rPr>
-                <w:sz w:val="19"/>
+            <w:tcMar>
+              <w:top w:w="20" w:type="dxa"/>
+              <w:bottom w:w="20" w:type="dxa"/>
+              <w:left w:w="60" w:type="dxa"/>
+              <w:right w:w="60" w:type="dxa"/>
+            </w:tcMar>
+          </w:tcPr>
+          <w:p>
+            <w:pPr>
+              <w:spacing w:after="0" w:line="240" w:lineRule="auto" w:before="0"/>
+              <w:ind w:left="110" w:right="0" w:firstLine="0"/>
+              <w:jc w:val="left"/>
+            </w:pPr>
+            <w:r>
+              <w:rPr>
+                <w:sz w:val="17"/>
               </w:rPr>
               <w:t>3</w:t>
             </w:r>
@@ -1852,8 +2032,8 @@
       </w:tr>
       <w:tr>
         <w:trPr>
-          <w:trHeight w:val="216"/>
           <w:cantSplit/>
+          <w:trHeight w:val="210" w:hRule="atLeast"/>
         </w:trPr>
         <w:tc>
           <w:tcPr>
@@ -1864,16 +2044,22 @@
               <w:bottom w:val="single" w:sz="4" w:space="0" w:color="000000"/>
               <w:right w:val="single" w:sz="4" w:space="0" w:color="000000"/>
             </w:tcBorders>
-          </w:tcPr>
-          <w:p>
-            <w:pPr>
-              <w:spacing w:after="0" w:line="259" w:lineRule="auto"/>
-              <w:ind w:left="110" w:right="0" w:firstLine="0"/>
-              <w:jc w:val="left"/>
-            </w:pPr>
-            <w:r>
-              <w:rPr>
-                <w:sz w:val="19"/>
+            <w:tcMar>
+              <w:top w:w="20" w:type="dxa"/>
+              <w:bottom w:w="20" w:type="dxa"/>
+              <w:left w:w="60" w:type="dxa"/>
+              <w:right w:w="60" w:type="dxa"/>
+            </w:tcMar>
+          </w:tcPr>
+          <w:p>
+            <w:pPr>
+              <w:spacing w:after="0" w:line="240" w:lineRule="auto" w:before="0"/>
+              <w:ind w:left="110" w:right="0" w:firstLine="0"/>
+              <w:jc w:val="left"/>
+            </w:pPr>
+            <w:r>
+              <w:rPr>
+                <w:sz w:val="17"/>
               </w:rPr>
               <w:t>1.4</w:t>
             </w:r>
@@ -1888,16 +2074,22 @@
               <w:bottom w:val="single" w:sz="4" w:space="0" w:color="000000"/>
               <w:right w:val="single" w:sz="4" w:space="0" w:color="000000"/>
             </w:tcBorders>
-          </w:tcPr>
-          <w:p>
-            <w:pPr>
-              <w:spacing w:after="0" w:line="259" w:lineRule="auto"/>
-              <w:ind w:left="110" w:right="0" w:firstLine="0"/>
-              <w:jc w:val="left"/>
-            </w:pPr>
-            <w:r>
-              <w:rPr>
-                <w:sz w:val="19"/>
+            <w:tcMar>
+              <w:top w:w="20" w:type="dxa"/>
+              <w:bottom w:w="20" w:type="dxa"/>
+              <w:left w:w="60" w:type="dxa"/>
+              <w:right w:w="60" w:type="dxa"/>
+            </w:tcMar>
+          </w:tcPr>
+          <w:p>
+            <w:pPr>
+              <w:spacing w:after="0" w:line="240" w:lineRule="auto" w:before="0"/>
+              <w:ind w:left="110" w:right="0" w:firstLine="0"/>
+              <w:jc w:val="left"/>
+            </w:pPr>
+            <w:r>
+              <w:rPr>
+                <w:sz w:val="17"/>
               </w:rPr>
               <w:t>Project Contributions</w:t>
             </w:r>
@@ -1912,16 +2104,22 @@
               <w:bottom w:val="single" w:sz="4" w:space="0" w:color="000000"/>
               <w:right w:val="nil"/>
             </w:tcBorders>
-          </w:tcPr>
-          <w:p>
-            <w:pPr>
-              <w:spacing w:after="0" w:line="259" w:lineRule="auto"/>
-              <w:ind w:left="110" w:right="0" w:firstLine="0"/>
-              <w:jc w:val="left"/>
-            </w:pPr>
-            <w:r>
-              <w:rPr>
-                <w:sz w:val="19"/>
+            <w:tcMar>
+              <w:top w:w="20" w:type="dxa"/>
+              <w:bottom w:w="20" w:type="dxa"/>
+              <w:left w:w="60" w:type="dxa"/>
+              <w:right w:w="60" w:type="dxa"/>
+            </w:tcMar>
+          </w:tcPr>
+          <w:p>
+            <w:pPr>
+              <w:spacing w:after="0" w:line="240" w:lineRule="auto" w:before="0"/>
+              <w:ind w:left="110" w:right="0" w:firstLine="0"/>
+              <w:jc w:val="left"/>
+            </w:pPr>
+            <w:r>
+              <w:rPr>
+                <w:sz w:val="17"/>
               </w:rPr>
               <w:t>3</w:t>
             </w:r>
@@ -1930,8 +2128,8 @@
       </w:tr>
       <w:tr>
         <w:trPr>
-          <w:trHeight w:val="218"/>
           <w:cantSplit/>
+          <w:trHeight w:val="210" w:hRule="atLeast"/>
         </w:trPr>
         <w:tc>
           <w:tcPr>
@@ -1942,16 +2140,22 @@
               <w:bottom w:val="single" w:sz="4" w:space="0" w:color="000000"/>
               <w:right w:val="single" w:sz="4" w:space="0" w:color="000000"/>
             </w:tcBorders>
-          </w:tcPr>
-          <w:p>
-            <w:pPr>
-              <w:spacing w:after="0" w:line="259" w:lineRule="auto"/>
-              <w:ind w:left="110" w:right="0" w:firstLine="0"/>
-              <w:jc w:val="left"/>
-            </w:pPr>
-            <w:r>
-              <w:rPr>
-                <w:sz w:val="19"/>
+            <w:tcMar>
+              <w:top w:w="20" w:type="dxa"/>
+              <w:bottom w:w="20" w:type="dxa"/>
+              <w:left w:w="60" w:type="dxa"/>
+              <w:right w:w="60" w:type="dxa"/>
+            </w:tcMar>
+          </w:tcPr>
+          <w:p>
+            <w:pPr>
+              <w:spacing w:after="0" w:line="240" w:lineRule="auto" w:before="0"/>
+              <w:ind w:left="110" w:right="0" w:firstLine="0"/>
+              <w:jc w:val="left"/>
+            </w:pPr>
+            <w:r>
+              <w:rPr>
+                <w:sz w:val="17"/>
               </w:rPr>
               <w:t>2</w:t>
             </w:r>
@@ -1966,16 +2170,22 @@
               <w:bottom w:val="single" w:sz="4" w:space="0" w:color="000000"/>
               <w:right w:val="single" w:sz="4" w:space="0" w:color="000000"/>
             </w:tcBorders>
-          </w:tcPr>
-          <w:p>
-            <w:pPr>
-              <w:spacing w:after="0" w:line="259" w:lineRule="auto"/>
-              <w:ind w:left="110" w:right="0" w:firstLine="0"/>
-              <w:jc w:val="left"/>
-            </w:pPr>
-            <w:r>
-              <w:rPr>
-                <w:sz w:val="19"/>
+            <w:tcMar>
+              <w:top w:w="20" w:type="dxa"/>
+              <w:bottom w:w="20" w:type="dxa"/>
+              <w:left w:w="60" w:type="dxa"/>
+              <w:right w:w="60" w:type="dxa"/>
+            </w:tcMar>
+          </w:tcPr>
+          <w:p>
+            <w:pPr>
+              <w:spacing w:after="0" w:line="240" w:lineRule="auto" w:before="0"/>
+              <w:ind w:left="110" w:right="0" w:firstLine="0"/>
+              <w:jc w:val="left"/>
+            </w:pPr>
+            <w:r>
+              <w:rPr>
+                <w:sz w:val="17"/>
               </w:rPr>
               <w:t>REVIEW OF LITERATURE</w:t>
             </w:r>
@@ -1990,16 +2200,22 @@
               <w:bottom w:val="single" w:sz="4" w:space="0" w:color="000000"/>
               <w:right w:val="nil"/>
             </w:tcBorders>
-          </w:tcPr>
-          <w:p>
-            <w:pPr>
-              <w:spacing w:after="0" w:line="259" w:lineRule="auto"/>
-              <w:ind w:left="110" w:right="0" w:firstLine="0"/>
-              <w:jc w:val="left"/>
-            </w:pPr>
-            <w:r>
-              <w:rPr>
-                <w:sz w:val="19"/>
+            <w:tcMar>
+              <w:top w:w="20" w:type="dxa"/>
+              <w:bottom w:w="20" w:type="dxa"/>
+              <w:left w:w="60" w:type="dxa"/>
+              <w:right w:w="60" w:type="dxa"/>
+            </w:tcMar>
+          </w:tcPr>
+          <w:p>
+            <w:pPr>
+              <w:spacing w:after="0" w:line="240" w:lineRule="auto" w:before="0"/>
+              <w:ind w:left="110" w:right="0" w:firstLine="0"/>
+              <w:jc w:val="left"/>
+            </w:pPr>
+            <w:r>
+              <w:rPr>
+                <w:sz w:val="17"/>
               </w:rPr>
               <w:t>4</w:t>
             </w:r>
@@ -2008,8 +2224,8 @@
       </w:tr>
       <w:tr>
         <w:trPr>
-          <w:trHeight w:val="216"/>
           <w:cantSplit/>
+          <w:trHeight w:val="210" w:hRule="atLeast"/>
         </w:trPr>
         <w:tc>
           <w:tcPr>
@@ -2020,16 +2236,22 @@
               <w:bottom w:val="single" w:sz="4" w:space="0" w:color="000000"/>
               <w:right w:val="single" w:sz="4" w:space="0" w:color="000000"/>
             </w:tcBorders>
-          </w:tcPr>
-          <w:p>
-            <w:pPr>
-              <w:spacing w:after="0" w:line="259" w:lineRule="auto"/>
-              <w:ind w:left="110" w:right="0" w:firstLine="0"/>
-              <w:jc w:val="left"/>
-            </w:pPr>
-            <w:r>
-              <w:rPr>
-                <w:sz w:val="19"/>
+            <w:tcMar>
+              <w:top w:w="20" w:type="dxa"/>
+              <w:bottom w:w="20" w:type="dxa"/>
+              <w:left w:w="60" w:type="dxa"/>
+              <w:right w:w="60" w:type="dxa"/>
+            </w:tcMar>
+          </w:tcPr>
+          <w:p>
+            <w:pPr>
+              <w:spacing w:after="0" w:line="240" w:lineRule="auto" w:before="0"/>
+              <w:ind w:left="110" w:right="0" w:firstLine="0"/>
+              <w:jc w:val="left"/>
+            </w:pPr>
+            <w:r>
+              <w:rPr>
+                <w:sz w:val="17"/>
               </w:rPr>
               <w:t>2.1</w:t>
             </w:r>
@@ -2044,16 +2266,22 @@
               <w:bottom w:val="single" w:sz="4" w:space="0" w:color="000000"/>
               <w:right w:val="single" w:sz="4" w:space="0" w:color="000000"/>
             </w:tcBorders>
-          </w:tcPr>
-          <w:p>
-            <w:pPr>
-              <w:spacing w:after="0" w:line="259" w:lineRule="auto"/>
-              <w:ind w:left="110" w:right="0" w:firstLine="0"/>
-              <w:jc w:val="left"/>
-            </w:pPr>
-            <w:r>
-              <w:rPr>
-                <w:sz w:val="19"/>
+            <w:tcMar>
+              <w:top w:w="20" w:type="dxa"/>
+              <w:bottom w:w="20" w:type="dxa"/>
+              <w:left w:w="60" w:type="dxa"/>
+              <w:right w:w="60" w:type="dxa"/>
+            </w:tcMar>
+          </w:tcPr>
+          <w:p>
+            <w:pPr>
+              <w:spacing w:after="0" w:line="240" w:lineRule="auto" w:before="0"/>
+              <w:ind w:left="110" w:right="0" w:firstLine="0"/>
+              <w:jc w:val="left"/>
+            </w:pPr>
+            <w:r>
+              <w:rPr>
+                <w:sz w:val="17"/>
               </w:rPr>
               <w:t>Related Backgrounds</w:t>
             </w:r>
@@ -2068,16 +2296,22 @@
               <w:bottom w:val="single" w:sz="4" w:space="0" w:color="000000"/>
               <w:right w:val="nil"/>
             </w:tcBorders>
-          </w:tcPr>
-          <w:p>
-            <w:pPr>
-              <w:spacing w:after="0" w:line="259" w:lineRule="auto"/>
-              <w:ind w:left="110" w:right="0" w:firstLine="0"/>
-              <w:jc w:val="left"/>
-            </w:pPr>
-            <w:r>
-              <w:rPr>
-                <w:sz w:val="19"/>
+            <w:tcMar>
+              <w:top w:w="20" w:type="dxa"/>
+              <w:bottom w:w="20" w:type="dxa"/>
+              <w:left w:w="60" w:type="dxa"/>
+              <w:right w:w="60" w:type="dxa"/>
+            </w:tcMar>
+          </w:tcPr>
+          <w:p>
+            <w:pPr>
+              <w:spacing w:after="0" w:line="240" w:lineRule="auto" w:before="0"/>
+              <w:ind w:left="110" w:right="0" w:firstLine="0"/>
+              <w:jc w:val="left"/>
+            </w:pPr>
+            <w:r>
+              <w:rPr>
+                <w:sz w:val="17"/>
               </w:rPr>
               <w:t>4</w:t>
             </w:r>
@@ -2086,8 +2320,8 @@
       </w:tr>
       <w:tr>
         <w:trPr>
-          <w:trHeight w:val="218"/>
           <w:cantSplit/>
+          <w:trHeight w:val="210" w:hRule="atLeast"/>
         </w:trPr>
         <w:tc>
           <w:tcPr>
@@ -2098,16 +2332,22 @@
               <w:bottom w:val="single" w:sz="4" w:space="0" w:color="000000"/>
               <w:right w:val="single" w:sz="4" w:space="0" w:color="000000"/>
             </w:tcBorders>
-          </w:tcPr>
-          <w:p>
-            <w:pPr>
-              <w:spacing w:after="0" w:line="259" w:lineRule="auto"/>
-              <w:ind w:left="110" w:right="0" w:firstLine="0"/>
-              <w:jc w:val="left"/>
-            </w:pPr>
-            <w:r>
-              <w:rPr>
-                <w:sz w:val="19"/>
+            <w:tcMar>
+              <w:top w:w="20" w:type="dxa"/>
+              <w:bottom w:w="20" w:type="dxa"/>
+              <w:left w:w="60" w:type="dxa"/>
+              <w:right w:w="60" w:type="dxa"/>
+            </w:tcMar>
+          </w:tcPr>
+          <w:p>
+            <w:pPr>
+              <w:spacing w:after="0" w:line="240" w:lineRule="auto" w:before="0"/>
+              <w:ind w:left="110" w:right="0" w:firstLine="0"/>
+              <w:jc w:val="left"/>
+            </w:pPr>
+            <w:r>
+              <w:rPr>
+                <w:sz w:val="17"/>
               </w:rPr>
               <w:t>2.2</w:t>
             </w:r>
@@ -2122,16 +2362,22 @@
               <w:bottom w:val="single" w:sz="4" w:space="0" w:color="000000"/>
               <w:right w:val="single" w:sz="4" w:space="0" w:color="000000"/>
             </w:tcBorders>
-          </w:tcPr>
-          <w:p>
-            <w:pPr>
-              <w:spacing w:after="0" w:line="259" w:lineRule="auto"/>
-              <w:ind w:left="110" w:right="0" w:firstLine="0"/>
-              <w:jc w:val="left"/>
-            </w:pPr>
-            <w:r>
-              <w:rPr>
-                <w:sz w:val="19"/>
+            <w:tcMar>
+              <w:top w:w="20" w:type="dxa"/>
+              <w:bottom w:w="20" w:type="dxa"/>
+              <w:left w:w="60" w:type="dxa"/>
+              <w:right w:w="60" w:type="dxa"/>
+            </w:tcMar>
+          </w:tcPr>
+          <w:p>
+            <w:pPr>
+              <w:spacing w:after="0" w:line="240" w:lineRule="auto" w:before="0"/>
+              <w:ind w:left="110" w:right="0" w:firstLine="0"/>
+              <w:jc w:val="left"/>
+            </w:pPr>
+            <w:r>
+              <w:rPr>
+                <w:sz w:val="17"/>
               </w:rPr>
               <w:t>Team Formation Methods</w:t>
             </w:r>
@@ -2146,16 +2392,22 @@
               <w:bottom w:val="single" w:sz="4" w:space="0" w:color="000000"/>
               <w:right w:val="nil"/>
             </w:tcBorders>
-          </w:tcPr>
-          <w:p>
-            <w:pPr>
-              <w:spacing w:after="0" w:line="259" w:lineRule="auto"/>
-              <w:ind w:left="110" w:right="0" w:firstLine="0"/>
-              <w:jc w:val="left"/>
-            </w:pPr>
-            <w:r>
-              <w:rPr>
-                <w:sz w:val="19"/>
+            <w:tcMar>
+              <w:top w:w="20" w:type="dxa"/>
+              <w:bottom w:w="20" w:type="dxa"/>
+              <w:left w:w="60" w:type="dxa"/>
+              <w:right w:w="60" w:type="dxa"/>
+            </w:tcMar>
+          </w:tcPr>
+          <w:p>
+            <w:pPr>
+              <w:spacing w:after="0" w:line="240" w:lineRule="auto" w:before="0"/>
+              <w:ind w:left="110" w:right="0" w:firstLine="0"/>
+              <w:jc w:val="left"/>
+            </w:pPr>
+            <w:r>
+              <w:rPr>
+                <w:sz w:val="17"/>
               </w:rPr>
               <w:t>5</w:t>
             </w:r>
@@ -2164,8 +2416,8 @@
       </w:tr>
       <w:tr>
         <w:trPr>
-          <w:trHeight w:val="424"/>
           <w:cantSplit/>
+          <w:trHeight w:val="210" w:hRule="atLeast"/>
         </w:trPr>
         <w:tc>
           <w:tcPr>
@@ -2177,16 +2429,22 @@
               <w:right w:val="single" w:sz="4" w:space="0" w:color="000000"/>
             </w:tcBorders>
             <w:vAlign w:val="center"/>
-          </w:tcPr>
-          <w:p>
-            <w:pPr>
-              <w:spacing w:after="0" w:line="259" w:lineRule="auto"/>
-              <w:ind w:left="110" w:right="0" w:firstLine="0"/>
-              <w:jc w:val="left"/>
-            </w:pPr>
-            <w:r>
-              <w:rPr>
-                <w:sz w:val="19"/>
+            <w:tcMar>
+              <w:top w:w="20" w:type="dxa"/>
+              <w:bottom w:w="20" w:type="dxa"/>
+              <w:left w:w="60" w:type="dxa"/>
+              <w:right w:w="60" w:type="dxa"/>
+            </w:tcMar>
+          </w:tcPr>
+          <w:p>
+            <w:pPr>
+              <w:spacing w:after="0" w:line="240" w:lineRule="auto" w:before="0"/>
+              <w:ind w:left="110" w:right="0" w:firstLine="0"/>
+              <w:jc w:val="left"/>
+            </w:pPr>
+            <w:r>
+              <w:rPr>
+                <w:sz w:val="17"/>
               </w:rPr>
               <w:t>2.3</w:t>
             </w:r>
@@ -2201,16 +2459,22 @@
               <w:bottom w:val="single" w:sz="4" w:space="0" w:color="000000"/>
               <w:right w:val="single" w:sz="4" w:space="0" w:color="000000"/>
             </w:tcBorders>
-          </w:tcPr>
-          <w:p>
-            <w:pPr>
-              <w:spacing w:after="0" w:line="259" w:lineRule="auto"/>
-              <w:ind w:left="110" w:right="0" w:firstLine="0"/>
-              <w:jc w:val="left"/>
-            </w:pPr>
-            <w:r>
-              <w:rPr>
-                <w:sz w:val="19"/>
+            <w:tcMar>
+              <w:top w:w="20" w:type="dxa"/>
+              <w:bottom w:w="20" w:type="dxa"/>
+              <w:left w:w="60" w:type="dxa"/>
+              <w:right w:w="60" w:type="dxa"/>
+            </w:tcMar>
+          </w:tcPr>
+          <w:p>
+            <w:pPr>
+              <w:spacing w:after="0" w:line="240" w:lineRule="auto" w:before="0"/>
+              <w:ind w:left="110" w:right="0" w:firstLine="0"/>
+              <w:jc w:val="left"/>
+            </w:pPr>
+            <w:r>
+              <w:rPr>
+                <w:sz w:val="17"/>
               </w:rPr>
               <w:t>Similarity and Recommendation Methods</w:t>
             </w:r>
@@ -2226,16 +2490,22 @@
               <w:right w:val="nil"/>
             </w:tcBorders>
             <w:vAlign w:val="center"/>
-          </w:tcPr>
-          <w:p>
-            <w:pPr>
-              <w:spacing w:after="0" w:line="259" w:lineRule="auto"/>
-              <w:ind w:left="110" w:right="0" w:firstLine="0"/>
-              <w:jc w:val="left"/>
-            </w:pPr>
-            <w:r>
-              <w:rPr>
-                <w:sz w:val="19"/>
+            <w:tcMar>
+              <w:top w:w="20" w:type="dxa"/>
+              <w:bottom w:w="20" w:type="dxa"/>
+              <w:left w:w="60" w:type="dxa"/>
+              <w:right w:w="60" w:type="dxa"/>
+            </w:tcMar>
+          </w:tcPr>
+          <w:p>
+            <w:pPr>
+              <w:spacing w:after="0" w:line="240" w:lineRule="auto" w:before="0"/>
+              <w:ind w:left="110" w:right="0" w:firstLine="0"/>
+              <w:jc w:val="left"/>
+            </w:pPr>
+            <w:r>
+              <w:rPr>
+                <w:sz w:val="17"/>
               </w:rPr>
               <w:t>6</w:t>
             </w:r>
@@ -2244,8 +2514,8 @@
       </w:tr>
       <w:tr>
         <w:trPr>
-          <w:trHeight w:val="216"/>
           <w:cantSplit/>
+          <w:trHeight w:val="210" w:hRule="atLeast"/>
         </w:trPr>
         <w:tc>
           <w:tcPr>
@@ -2256,16 +2526,22 @@
               <w:bottom w:val="single" w:sz="4" w:space="0" w:color="000000"/>
               <w:right w:val="single" w:sz="4" w:space="0" w:color="000000"/>
             </w:tcBorders>
-          </w:tcPr>
-          <w:p>
-            <w:pPr>
-              <w:spacing w:after="0" w:line="259" w:lineRule="auto"/>
-              <w:ind w:left="110" w:right="0" w:firstLine="0"/>
-              <w:jc w:val="left"/>
-            </w:pPr>
-            <w:r>
-              <w:rPr>
-                <w:sz w:val="19"/>
+            <w:tcMar>
+              <w:top w:w="20" w:type="dxa"/>
+              <w:bottom w:w="20" w:type="dxa"/>
+              <w:left w:w="60" w:type="dxa"/>
+              <w:right w:w="60" w:type="dxa"/>
+            </w:tcMar>
+          </w:tcPr>
+          <w:p>
+            <w:pPr>
+              <w:spacing w:after="0" w:line="240" w:lineRule="auto" w:before="0"/>
+              <w:ind w:left="110" w:right="0" w:firstLine="0"/>
+              <w:jc w:val="left"/>
+            </w:pPr>
+            <w:r>
+              <w:rPr>
+                <w:sz w:val="17"/>
               </w:rPr>
               <w:t>2.4</w:t>
             </w:r>
@@ -2280,16 +2556,22 @@
               <w:bottom w:val="single" w:sz="4" w:space="0" w:color="000000"/>
               <w:right w:val="single" w:sz="4" w:space="0" w:color="000000"/>
             </w:tcBorders>
-          </w:tcPr>
-          <w:p>
-            <w:pPr>
-              <w:spacing w:after="0" w:line="259" w:lineRule="auto"/>
-              <w:ind w:left="110" w:right="0" w:firstLine="0"/>
-              <w:jc w:val="left"/>
-            </w:pPr>
-            <w:r>
-              <w:rPr>
-                <w:sz w:val="19"/>
+            <w:tcMar>
+              <w:top w:w="20" w:type="dxa"/>
+              <w:bottom w:w="20" w:type="dxa"/>
+              <w:left w:w="60" w:type="dxa"/>
+              <w:right w:w="60" w:type="dxa"/>
+            </w:tcMar>
+          </w:tcPr>
+          <w:p>
+            <w:pPr>
+              <w:spacing w:after="0" w:line="240" w:lineRule="auto" w:before="0"/>
+              <w:ind w:left="110" w:right="0" w:firstLine="0"/>
+              <w:jc w:val="left"/>
+            </w:pPr>
+            <w:r>
+              <w:rPr>
+                <w:sz w:val="17"/>
               </w:rPr>
               <w:t>Auction-Based Allocation</w:t>
             </w:r>
@@ -2304,16 +2586,22 @@
               <w:bottom w:val="single" w:sz="4" w:space="0" w:color="000000"/>
               <w:right w:val="nil"/>
             </w:tcBorders>
-          </w:tcPr>
-          <w:p>
-            <w:pPr>
-              <w:spacing w:after="0" w:line="259" w:lineRule="auto"/>
-              <w:ind w:left="110" w:right="0" w:firstLine="0"/>
-              <w:jc w:val="left"/>
-            </w:pPr>
-            <w:r>
-              <w:rPr>
-                <w:sz w:val="19"/>
+            <w:tcMar>
+              <w:top w:w="20" w:type="dxa"/>
+              <w:bottom w:w="20" w:type="dxa"/>
+              <w:left w:w="60" w:type="dxa"/>
+              <w:right w:w="60" w:type="dxa"/>
+            </w:tcMar>
+          </w:tcPr>
+          <w:p>
+            <w:pPr>
+              <w:spacing w:after="0" w:line="240" w:lineRule="auto" w:before="0"/>
+              <w:ind w:left="110" w:right="0" w:firstLine="0"/>
+              <w:jc w:val="left"/>
+            </w:pPr>
+            <w:r>
+              <w:rPr>
+                <w:sz w:val="17"/>
               </w:rPr>
               <w:t>7</w:t>
             </w:r>
@@ -2322,8 +2610,8 @@
       </w:tr>
       <w:tr>
         <w:trPr>
-          <w:trHeight w:val="218"/>
           <w:cantSplit/>
+          <w:trHeight w:val="210" w:hRule="atLeast"/>
         </w:trPr>
         <w:tc>
           <w:tcPr>
@@ -2334,16 +2622,22 @@
               <w:bottom w:val="single" w:sz="4" w:space="0" w:color="000000"/>
               <w:right w:val="single" w:sz="4" w:space="0" w:color="000000"/>
             </w:tcBorders>
-          </w:tcPr>
-          <w:p>
-            <w:pPr>
-              <w:spacing w:after="0" w:line="259" w:lineRule="auto"/>
-              <w:ind w:left="110" w:right="0" w:firstLine="0"/>
-              <w:jc w:val="left"/>
-            </w:pPr>
-            <w:r>
-              <w:rPr>
-                <w:sz w:val="19"/>
+            <w:tcMar>
+              <w:top w:w="20" w:type="dxa"/>
+              <w:bottom w:w="20" w:type="dxa"/>
+              <w:left w:w="60" w:type="dxa"/>
+              <w:right w:w="60" w:type="dxa"/>
+            </w:tcMar>
+          </w:tcPr>
+          <w:p>
+            <w:pPr>
+              <w:spacing w:after="0" w:line="240" w:lineRule="auto" w:before="0"/>
+              <w:ind w:left="110" w:right="0" w:firstLine="0"/>
+              <w:jc w:val="left"/>
+            </w:pPr>
+            <w:r>
+              <w:rPr>
+                <w:sz w:val="17"/>
               </w:rPr>
               <w:t>2.5</w:t>
             </w:r>
@@ -2358,16 +2652,22 @@
               <w:bottom w:val="single" w:sz="4" w:space="0" w:color="000000"/>
               <w:right w:val="single" w:sz="4" w:space="0" w:color="000000"/>
             </w:tcBorders>
-          </w:tcPr>
-          <w:p>
-            <w:pPr>
-              <w:spacing w:after="0" w:line="259" w:lineRule="auto"/>
-              <w:ind w:left="110" w:right="0" w:firstLine="0"/>
-              <w:jc w:val="left"/>
-            </w:pPr>
-            <w:r>
-              <w:rPr>
-                <w:sz w:val="19"/>
+            <w:tcMar>
+              <w:top w:w="20" w:type="dxa"/>
+              <w:bottom w:w="20" w:type="dxa"/>
+              <w:left w:w="60" w:type="dxa"/>
+              <w:right w:w="60" w:type="dxa"/>
+            </w:tcMar>
+          </w:tcPr>
+          <w:p>
+            <w:pPr>
+              <w:spacing w:after="0" w:line="240" w:lineRule="auto" w:before="0"/>
+              <w:ind w:left="110" w:right="0" w:firstLine="0"/>
+              <w:jc w:val="left"/>
+            </w:pPr>
+            <w:r>
+              <w:rPr>
+                <w:sz w:val="17"/>
               </w:rPr>
               <w:t>Research Gap</w:t>
             </w:r>
@@ -2382,16 +2682,22 @@
               <w:bottom w:val="single" w:sz="4" w:space="0" w:color="000000"/>
               <w:right w:val="nil"/>
             </w:tcBorders>
-          </w:tcPr>
-          <w:p>
-            <w:pPr>
-              <w:spacing w:after="0" w:line="259" w:lineRule="auto"/>
-              <w:ind w:left="110" w:right="0" w:firstLine="0"/>
-              <w:jc w:val="left"/>
-            </w:pPr>
-            <w:r>
-              <w:rPr>
-                <w:sz w:val="19"/>
+            <w:tcMar>
+              <w:top w:w="20" w:type="dxa"/>
+              <w:bottom w:w="20" w:type="dxa"/>
+              <w:left w:w="60" w:type="dxa"/>
+              <w:right w:w="60" w:type="dxa"/>
+            </w:tcMar>
+          </w:tcPr>
+          <w:p>
+            <w:pPr>
+              <w:spacing w:after="0" w:line="240" w:lineRule="auto" w:before="0"/>
+              <w:ind w:left="110" w:right="0" w:firstLine="0"/>
+              <w:jc w:val="left"/>
+            </w:pPr>
+            <w:r>
+              <w:rPr>
+                <w:sz w:val="17"/>
               </w:rPr>
               <w:t>8</w:t>
             </w:r>
@@ -2400,8 +2706,8 @@
       </w:tr>
       <w:tr>
         <w:trPr>
-          <w:trHeight w:val="216"/>
           <w:cantSplit/>
+          <w:trHeight w:val="210" w:hRule="atLeast"/>
         </w:trPr>
         <w:tc>
           <w:tcPr>
@@ -2412,16 +2718,22 @@
               <w:bottom w:val="single" w:sz="4" w:space="0" w:color="000000"/>
               <w:right w:val="single" w:sz="4" w:space="0" w:color="000000"/>
             </w:tcBorders>
-          </w:tcPr>
-          <w:p>
-            <w:pPr>
-              <w:spacing w:after="0" w:line="259" w:lineRule="auto"/>
-              <w:ind w:left="110" w:right="0" w:firstLine="0"/>
-              <w:jc w:val="left"/>
-            </w:pPr>
-            <w:r>
-              <w:rPr>
-                <w:sz w:val="19"/>
+            <w:tcMar>
+              <w:top w:w="20" w:type="dxa"/>
+              <w:bottom w:w="20" w:type="dxa"/>
+              <w:left w:w="60" w:type="dxa"/>
+              <w:right w:w="60" w:type="dxa"/>
+            </w:tcMar>
+          </w:tcPr>
+          <w:p>
+            <w:pPr>
+              <w:spacing w:after="0" w:line="240" w:lineRule="auto" w:before="0"/>
+              <w:ind w:left="110" w:right="0" w:firstLine="0"/>
+              <w:jc w:val="left"/>
+            </w:pPr>
+            <w:r>
+              <w:rPr>
+                <w:sz w:val="17"/>
               </w:rPr>
               <w:t>3</w:t>
             </w:r>
@@ -2436,16 +2748,22 @@
               <w:bottom w:val="single" w:sz="4" w:space="0" w:color="000000"/>
               <w:right w:val="single" w:sz="4" w:space="0" w:color="000000"/>
             </w:tcBorders>
-          </w:tcPr>
-          <w:p>
-            <w:pPr>
-              <w:spacing w:after="0" w:line="259" w:lineRule="auto"/>
-              <w:ind w:left="110" w:right="0" w:firstLine="0"/>
-              <w:jc w:val="left"/>
-            </w:pPr>
-            <w:r>
-              <w:rPr>
-                <w:sz w:val="19"/>
+            <w:tcMar>
+              <w:top w:w="20" w:type="dxa"/>
+              <w:bottom w:w="20" w:type="dxa"/>
+              <w:left w:w="60" w:type="dxa"/>
+              <w:right w:w="60" w:type="dxa"/>
+            </w:tcMar>
+          </w:tcPr>
+          <w:p>
+            <w:pPr>
+              <w:spacing w:after="0" w:line="240" w:lineRule="auto" w:before="0"/>
+              <w:ind w:left="110" w:right="0" w:firstLine="0"/>
+              <w:jc w:val="left"/>
+            </w:pPr>
+            <w:r>
+              <w:rPr>
+                <w:sz w:val="17"/>
               </w:rPr>
               <w:t>DESIGN AND METHODOLOGY</w:t>
             </w:r>
@@ -2460,16 +2778,22 @@
               <w:bottom w:val="single" w:sz="4" w:space="0" w:color="000000"/>
               <w:right w:val="nil"/>
             </w:tcBorders>
-          </w:tcPr>
-          <w:p>
-            <w:pPr>
-              <w:spacing w:after="0" w:line="259" w:lineRule="auto"/>
-              <w:ind w:left="110" w:right="0" w:firstLine="0"/>
-              <w:jc w:val="left"/>
-            </w:pPr>
-            <w:r>
-              <w:rPr>
-                <w:sz w:val="19"/>
+            <w:tcMar>
+              <w:top w:w="20" w:type="dxa"/>
+              <w:bottom w:w="20" w:type="dxa"/>
+              <w:left w:w="60" w:type="dxa"/>
+              <w:right w:w="60" w:type="dxa"/>
+            </w:tcMar>
+          </w:tcPr>
+          <w:p>
+            <w:pPr>
+              <w:spacing w:after="0" w:line="240" w:lineRule="auto" w:before="0"/>
+              <w:ind w:left="110" w:right="0" w:firstLine="0"/>
+              <w:jc w:val="left"/>
+            </w:pPr>
+            <w:r>
+              <w:rPr>
+                <w:sz w:val="17"/>
               </w:rPr>
               <w:t>9</w:t>
             </w:r>
@@ -2478,8 +2802,8 @@
       </w:tr>
       <w:tr>
         <w:trPr>
-          <w:trHeight w:val="218"/>
           <w:cantSplit/>
+          <w:trHeight w:val="210" w:hRule="atLeast"/>
         </w:trPr>
         <w:tc>
           <w:tcPr>
@@ -2490,16 +2814,22 @@
               <w:bottom w:val="single" w:sz="4" w:space="0" w:color="000000"/>
               <w:right w:val="single" w:sz="4" w:space="0" w:color="000000"/>
             </w:tcBorders>
-          </w:tcPr>
-          <w:p>
-            <w:pPr>
-              <w:spacing w:after="0" w:line="259" w:lineRule="auto"/>
-              <w:ind w:left="110" w:right="0" w:firstLine="0"/>
-              <w:jc w:val="left"/>
-            </w:pPr>
-            <w:r>
-              <w:rPr>
-                <w:sz w:val="19"/>
+            <w:tcMar>
+              <w:top w:w="20" w:type="dxa"/>
+              <w:bottom w:w="20" w:type="dxa"/>
+              <w:left w:w="60" w:type="dxa"/>
+              <w:right w:w="60" w:type="dxa"/>
+            </w:tcMar>
+          </w:tcPr>
+          <w:p>
+            <w:pPr>
+              <w:spacing w:after="0" w:line="240" w:lineRule="auto" w:before="0"/>
+              <w:ind w:left="110" w:right="0" w:firstLine="0"/>
+              <w:jc w:val="left"/>
+            </w:pPr>
+            <w:r>
+              <w:rPr>
+                <w:sz w:val="17"/>
               </w:rPr>
               <w:t>3.1</w:t>
             </w:r>
@@ -2514,16 +2844,22 @@
               <w:bottom w:val="single" w:sz="4" w:space="0" w:color="000000"/>
               <w:right w:val="single" w:sz="4" w:space="0" w:color="000000"/>
             </w:tcBorders>
-          </w:tcPr>
-          <w:p>
-            <w:pPr>
-              <w:spacing w:after="0" w:line="259" w:lineRule="auto"/>
-              <w:ind w:left="110" w:right="0" w:firstLine="0"/>
-              <w:jc w:val="left"/>
-            </w:pPr>
-            <w:r>
-              <w:rPr>
-                <w:sz w:val="19"/>
+            <w:tcMar>
+              <w:top w:w="20" w:type="dxa"/>
+              <w:bottom w:w="20" w:type="dxa"/>
+              <w:left w:w="60" w:type="dxa"/>
+              <w:right w:w="60" w:type="dxa"/>
+            </w:tcMar>
+          </w:tcPr>
+          <w:p>
+            <w:pPr>
+              <w:spacing w:after="0" w:line="240" w:lineRule="auto" w:before="0"/>
+              <w:ind w:left="110" w:right="0" w:firstLine="0"/>
+              <w:jc w:val="left"/>
+            </w:pPr>
+            <w:r>
+              <w:rPr>
+                <w:sz w:val="17"/>
               </w:rPr>
               <w:t>Platform Structure Overview</w:t>
             </w:r>
@@ -2538,16 +2874,22 @@
               <w:bottom w:val="single" w:sz="4" w:space="0" w:color="000000"/>
               <w:right w:val="nil"/>
             </w:tcBorders>
-          </w:tcPr>
-          <w:p>
-            <w:pPr>
-              <w:spacing w:after="0" w:line="259" w:lineRule="auto"/>
-              <w:ind w:left="110" w:right="0" w:firstLine="0"/>
-              <w:jc w:val="left"/>
-            </w:pPr>
-            <w:r>
-              <w:rPr>
-                <w:sz w:val="19"/>
+            <w:tcMar>
+              <w:top w:w="20" w:type="dxa"/>
+              <w:bottom w:w="20" w:type="dxa"/>
+              <w:left w:w="60" w:type="dxa"/>
+              <w:right w:w="60" w:type="dxa"/>
+            </w:tcMar>
+          </w:tcPr>
+          <w:p>
+            <w:pPr>
+              <w:spacing w:after="0" w:line="240" w:lineRule="auto" w:before="0"/>
+              <w:ind w:left="110" w:right="0" w:firstLine="0"/>
+              <w:jc w:val="left"/>
+            </w:pPr>
+            <w:r>
+              <w:rPr>
+                <w:sz w:val="17"/>
               </w:rPr>
               <w:t>9</w:t>
             </w:r>
@@ -2556,8 +2898,8 @@
       </w:tr>
       <w:tr>
         <w:trPr>
-          <w:trHeight w:val="216"/>
           <w:cantSplit/>
+          <w:trHeight w:val="210" w:hRule="atLeast"/>
         </w:trPr>
         <w:tc>
           <w:tcPr>
@@ -2568,16 +2910,22 @@
               <w:bottom w:val="single" w:sz="4" w:space="0" w:color="000000"/>
               <w:right w:val="single" w:sz="4" w:space="0" w:color="000000"/>
             </w:tcBorders>
-          </w:tcPr>
-          <w:p>
-            <w:pPr>
-              <w:spacing w:after="0" w:line="259" w:lineRule="auto"/>
-              <w:ind w:left="110" w:right="0" w:firstLine="0"/>
-              <w:jc w:val="left"/>
-            </w:pPr>
-            <w:r>
-              <w:rPr>
-                <w:sz w:val="19"/>
+            <w:tcMar>
+              <w:top w:w="20" w:type="dxa"/>
+              <w:bottom w:w="20" w:type="dxa"/>
+              <w:left w:w="60" w:type="dxa"/>
+              <w:right w:w="60" w:type="dxa"/>
+            </w:tcMar>
+          </w:tcPr>
+          <w:p>
+            <w:pPr>
+              <w:spacing w:after="0" w:line="240" w:lineRule="auto" w:before="0"/>
+              <w:ind w:left="110" w:right="0" w:firstLine="0"/>
+              <w:jc w:val="left"/>
+            </w:pPr>
+            <w:r>
+              <w:rPr>
+                <w:sz w:val="17"/>
               </w:rPr>
               <w:t>3.2</w:t>
             </w:r>
@@ -2592,16 +2940,22 @@
               <w:bottom w:val="single" w:sz="4" w:space="0" w:color="000000"/>
               <w:right w:val="single" w:sz="4" w:space="0" w:color="000000"/>
             </w:tcBorders>
-          </w:tcPr>
-          <w:p>
-            <w:pPr>
-              <w:spacing w:after="0" w:line="259" w:lineRule="auto"/>
-              <w:ind w:left="110" w:right="0" w:firstLine="0"/>
-              <w:jc w:val="left"/>
-            </w:pPr>
-            <w:r>
-              <w:rPr>
-                <w:sz w:val="19"/>
+            <w:tcMar>
+              <w:top w:w="20" w:type="dxa"/>
+              <w:bottom w:w="20" w:type="dxa"/>
+              <w:left w:w="60" w:type="dxa"/>
+              <w:right w:w="60" w:type="dxa"/>
+            </w:tcMar>
+          </w:tcPr>
+          <w:p>
+            <w:pPr>
+              <w:spacing w:after="0" w:line="240" w:lineRule="auto" w:before="0"/>
+              <w:ind w:left="110" w:right="0" w:firstLine="0"/>
+              <w:jc w:val="left"/>
+            </w:pPr>
+            <w:r>
+              <w:rPr>
+                <w:sz w:val="17"/>
               </w:rPr>
               <w:t>Data Sources and Student Profiles</w:t>
             </w:r>
@@ -2616,16 +2970,22 @@
               <w:bottom w:val="single" w:sz="4" w:space="0" w:color="000000"/>
               <w:right w:val="nil"/>
             </w:tcBorders>
-          </w:tcPr>
-          <w:p>
-            <w:pPr>
-              <w:spacing w:after="0" w:line="259" w:lineRule="auto"/>
-              <w:ind w:left="110" w:right="0" w:firstLine="0"/>
-              <w:jc w:val="left"/>
-            </w:pPr>
-            <w:r>
-              <w:rPr>
-                <w:sz w:val="19"/>
+            <w:tcMar>
+              <w:top w:w="20" w:type="dxa"/>
+              <w:bottom w:w="20" w:type="dxa"/>
+              <w:left w:w="60" w:type="dxa"/>
+              <w:right w:w="60" w:type="dxa"/>
+            </w:tcMar>
+          </w:tcPr>
+          <w:p>
+            <w:pPr>
+              <w:spacing w:after="0" w:line="240" w:lineRule="auto" w:before="0"/>
+              <w:ind w:left="110" w:right="0" w:firstLine="0"/>
+              <w:jc w:val="left"/>
+            </w:pPr>
+            <w:r>
+              <w:rPr>
+                <w:sz w:val="17"/>
               </w:rPr>
               <w:t>10</w:t>
             </w:r>
@@ -2634,8 +2994,8 @@
       </w:tr>
       <w:tr>
         <w:trPr>
-          <w:trHeight w:val="218"/>
           <w:cantSplit/>
+          <w:trHeight w:val="210" w:hRule="atLeast"/>
         </w:trPr>
         <w:tc>
           <w:tcPr>
@@ -2646,16 +3006,22 @@
               <w:bottom w:val="single" w:sz="4" w:space="0" w:color="000000"/>
               <w:right w:val="single" w:sz="4" w:space="0" w:color="000000"/>
             </w:tcBorders>
-          </w:tcPr>
-          <w:p>
-            <w:pPr>
-              <w:spacing w:after="0" w:line="259" w:lineRule="auto"/>
-              <w:ind w:left="110" w:right="0" w:firstLine="0"/>
-              <w:jc w:val="left"/>
-            </w:pPr>
-            <w:r>
-              <w:rPr>
-                <w:sz w:val="19"/>
+            <w:tcMar>
+              <w:top w:w="20" w:type="dxa"/>
+              <w:bottom w:w="20" w:type="dxa"/>
+              <w:left w:w="60" w:type="dxa"/>
+              <w:right w:w="60" w:type="dxa"/>
+            </w:tcMar>
+          </w:tcPr>
+          <w:p>
+            <w:pPr>
+              <w:spacing w:after="0" w:line="240" w:lineRule="auto" w:before="0"/>
+              <w:ind w:left="110" w:right="0" w:firstLine="0"/>
+              <w:jc w:val="left"/>
+            </w:pPr>
+            <w:r>
+              <w:rPr>
+                <w:sz w:val="17"/>
               </w:rPr>
               <w:t>3.3</w:t>
             </w:r>
@@ -2670,16 +3036,22 @@
               <w:bottom w:val="single" w:sz="4" w:space="0" w:color="000000"/>
               <w:right w:val="single" w:sz="4" w:space="0" w:color="000000"/>
             </w:tcBorders>
-          </w:tcPr>
-          <w:p>
-            <w:pPr>
-              <w:spacing w:after="0" w:line="259" w:lineRule="auto"/>
-              <w:ind w:left="110" w:right="0" w:firstLine="0"/>
-              <w:jc w:val="left"/>
-            </w:pPr>
-            <w:r>
-              <w:rPr>
-                <w:sz w:val="19"/>
+            <w:tcMar>
+              <w:top w:w="20" w:type="dxa"/>
+              <w:bottom w:w="20" w:type="dxa"/>
+              <w:left w:w="60" w:type="dxa"/>
+              <w:right w:w="60" w:type="dxa"/>
+            </w:tcMar>
+          </w:tcPr>
+          <w:p>
+            <w:pPr>
+              <w:spacing w:after="0" w:line="240" w:lineRule="auto" w:before="0"/>
+              <w:ind w:left="110" w:right="0" w:firstLine="0"/>
+              <w:jc w:val="left"/>
+            </w:pPr>
+            <w:r>
+              <w:rPr>
+                <w:sz w:val="17"/>
               </w:rPr>
               <w:t>Feature Engineering and Normalization</w:t>
             </w:r>
@@ -2694,16 +3066,22 @@
               <w:bottom w:val="single" w:sz="4" w:space="0" w:color="000000"/>
               <w:right w:val="nil"/>
             </w:tcBorders>
-          </w:tcPr>
-          <w:p>
-            <w:pPr>
-              <w:spacing w:after="0" w:line="259" w:lineRule="auto"/>
-              <w:ind w:left="110" w:right="0" w:firstLine="0"/>
-              <w:jc w:val="left"/>
-            </w:pPr>
-            <w:r>
-              <w:rPr>
-                <w:sz w:val="19"/>
+            <w:tcMar>
+              <w:top w:w="20" w:type="dxa"/>
+              <w:bottom w:w="20" w:type="dxa"/>
+              <w:left w:w="60" w:type="dxa"/>
+              <w:right w:w="60" w:type="dxa"/>
+            </w:tcMar>
+          </w:tcPr>
+          <w:p>
+            <w:pPr>
+              <w:spacing w:after="0" w:line="240" w:lineRule="auto" w:before="0"/>
+              <w:ind w:left="110" w:right="0" w:firstLine="0"/>
+              <w:jc w:val="left"/>
+            </w:pPr>
+            <w:r>
+              <w:rPr>
+                <w:sz w:val="17"/>
               </w:rPr>
               <w:t>11</w:t>
             </w:r>
@@ -2712,8 +3090,8 @@
       </w:tr>
       <w:tr>
         <w:trPr>
-          <w:trHeight w:val="216"/>
           <w:cantSplit/>
+          <w:trHeight w:val="210" w:hRule="atLeast"/>
         </w:trPr>
         <w:tc>
           <w:tcPr>
@@ -2724,16 +3102,22 @@
               <w:bottom w:val="single" w:sz="4" w:space="0" w:color="000000"/>
               <w:right w:val="single" w:sz="4" w:space="0" w:color="000000"/>
             </w:tcBorders>
-          </w:tcPr>
-          <w:p>
-            <w:pPr>
-              <w:spacing w:after="0" w:line="259" w:lineRule="auto"/>
-              <w:ind w:left="110" w:right="0" w:firstLine="0"/>
-              <w:jc w:val="left"/>
-            </w:pPr>
-            <w:r>
-              <w:rPr>
-                <w:sz w:val="19"/>
+            <w:tcMar>
+              <w:top w:w="20" w:type="dxa"/>
+              <w:bottom w:w="20" w:type="dxa"/>
+              <w:left w:w="60" w:type="dxa"/>
+              <w:right w:w="60" w:type="dxa"/>
+            </w:tcMar>
+          </w:tcPr>
+          <w:p>
+            <w:pPr>
+              <w:spacing w:after="0" w:line="240" w:lineRule="auto" w:before="0"/>
+              <w:ind w:left="110" w:right="0" w:firstLine="0"/>
+              <w:jc w:val="left"/>
+            </w:pPr>
+            <w:r>
+              <w:rPr>
+                <w:sz w:val="17"/>
               </w:rPr>
               <w:t>3.4</w:t>
             </w:r>
@@ -2748,16 +3132,22 @@
               <w:bottom w:val="single" w:sz="4" w:space="0" w:color="000000"/>
               <w:right w:val="single" w:sz="4" w:space="0" w:color="000000"/>
             </w:tcBorders>
-          </w:tcPr>
-          <w:p>
-            <w:pPr>
-              <w:spacing w:after="0" w:line="259" w:lineRule="auto"/>
-              <w:ind w:left="110" w:right="0" w:firstLine="0"/>
-              <w:jc w:val="left"/>
-            </w:pPr>
-            <w:r>
-              <w:rPr>
-                <w:sz w:val="19"/>
+            <w:tcMar>
+              <w:top w:w="20" w:type="dxa"/>
+              <w:bottom w:w="20" w:type="dxa"/>
+              <w:left w:w="60" w:type="dxa"/>
+              <w:right w:w="60" w:type="dxa"/>
+            </w:tcMar>
+          </w:tcPr>
+          <w:p>
+            <w:pPr>
+              <w:spacing w:after="0" w:line="240" w:lineRule="auto" w:before="0"/>
+              <w:ind w:left="110" w:right="0" w:firstLine="0"/>
+              <w:jc w:val="left"/>
+            </w:pPr>
+            <w:r>
+              <w:rPr>
+                <w:sz w:val="17"/>
               </w:rPr>
               <w:t>Similarity and Team-Fit Scoring</w:t>
             </w:r>
@@ -2772,16 +3162,22 @@
               <w:bottom w:val="single" w:sz="4" w:space="0" w:color="000000"/>
               <w:right w:val="nil"/>
             </w:tcBorders>
-          </w:tcPr>
-          <w:p>
-            <w:pPr>
-              <w:spacing w:after="0" w:line="259" w:lineRule="auto"/>
-              <w:ind w:left="110" w:right="0" w:firstLine="0"/>
-              <w:jc w:val="left"/>
-            </w:pPr>
-            <w:r>
-              <w:rPr>
-                <w:sz w:val="19"/>
+            <w:tcMar>
+              <w:top w:w="20" w:type="dxa"/>
+              <w:bottom w:w="20" w:type="dxa"/>
+              <w:left w:w="60" w:type="dxa"/>
+              <w:right w:w="60" w:type="dxa"/>
+            </w:tcMar>
+          </w:tcPr>
+          <w:p>
+            <w:pPr>
+              <w:spacing w:after="0" w:line="240" w:lineRule="auto" w:before="0"/>
+              <w:ind w:left="110" w:right="0" w:firstLine="0"/>
+              <w:jc w:val="left"/>
+            </w:pPr>
+            <w:r>
+              <w:rPr>
+                <w:sz w:val="17"/>
               </w:rPr>
               <w:t>12</w:t>
             </w:r>
@@ -2790,8 +3186,8 @@
       </w:tr>
       <w:tr>
         <w:trPr>
-          <w:trHeight w:val="218"/>
           <w:cantSplit/>
+          <w:trHeight w:val="210" w:hRule="atLeast"/>
         </w:trPr>
         <w:tc>
           <w:tcPr>
@@ -2802,16 +3198,22 @@
               <w:bottom w:val="single" w:sz="4" w:space="0" w:color="000000"/>
               <w:right w:val="single" w:sz="4" w:space="0" w:color="000000"/>
             </w:tcBorders>
-          </w:tcPr>
-          <w:p>
-            <w:pPr>
-              <w:spacing w:after="0" w:line="259" w:lineRule="auto"/>
-              <w:ind w:left="110" w:right="0" w:firstLine="0"/>
-              <w:jc w:val="left"/>
-            </w:pPr>
-            <w:r>
-              <w:rPr>
-                <w:sz w:val="19"/>
+            <w:tcMar>
+              <w:top w:w="20" w:type="dxa"/>
+              <w:bottom w:w="20" w:type="dxa"/>
+              <w:left w:w="60" w:type="dxa"/>
+              <w:right w:w="60" w:type="dxa"/>
+            </w:tcMar>
+          </w:tcPr>
+          <w:p>
+            <w:pPr>
+              <w:spacing w:after="0" w:line="240" w:lineRule="auto" w:before="0"/>
+              <w:ind w:left="110" w:right="0" w:firstLine="0"/>
+              <w:jc w:val="left"/>
+            </w:pPr>
+            <w:r>
+              <w:rPr>
+                <w:sz w:val="17"/>
               </w:rPr>
               <w:t>3.5</w:t>
             </w:r>
@@ -2826,16 +3228,22 @@
               <w:bottom w:val="single" w:sz="4" w:space="0" w:color="000000"/>
               <w:right w:val="single" w:sz="4" w:space="0" w:color="000000"/>
             </w:tcBorders>
-          </w:tcPr>
-          <w:p>
-            <w:pPr>
-              <w:spacing w:after="0" w:line="259" w:lineRule="auto"/>
-              <w:ind w:left="110" w:right="0" w:firstLine="0"/>
-              <w:jc w:val="left"/>
-            </w:pPr>
-            <w:r>
-              <w:rPr>
-                <w:sz w:val="19"/>
+            <w:tcMar>
+              <w:top w:w="20" w:type="dxa"/>
+              <w:bottom w:w="20" w:type="dxa"/>
+              <w:left w:w="60" w:type="dxa"/>
+              <w:right w:w="60" w:type="dxa"/>
+            </w:tcMar>
+          </w:tcPr>
+          <w:p>
+            <w:pPr>
+              <w:spacing w:after="0" w:line="240" w:lineRule="auto" w:before="0"/>
+              <w:ind w:left="110" w:right="0" w:firstLine="0"/>
+              <w:jc w:val="left"/>
+            </w:pPr>
+            <w:r>
+              <w:rPr>
+                <w:sz w:val="17"/>
               </w:rPr>
               <w:t>Auction Logic and Constraints</w:t>
             </w:r>
@@ -2850,16 +3258,22 @@
               <w:bottom w:val="single" w:sz="4" w:space="0" w:color="000000"/>
               <w:right w:val="nil"/>
             </w:tcBorders>
-          </w:tcPr>
-          <w:p>
-            <w:pPr>
-              <w:spacing w:after="0" w:line="259" w:lineRule="auto"/>
-              <w:ind w:left="110" w:right="0" w:firstLine="0"/>
-              <w:jc w:val="left"/>
-            </w:pPr>
-            <w:r>
-              <w:rPr>
-                <w:sz w:val="19"/>
+            <w:tcMar>
+              <w:top w:w="20" w:type="dxa"/>
+              <w:bottom w:w="20" w:type="dxa"/>
+              <w:left w:w="60" w:type="dxa"/>
+              <w:right w:w="60" w:type="dxa"/>
+            </w:tcMar>
+          </w:tcPr>
+          <w:p>
+            <w:pPr>
+              <w:spacing w:after="0" w:line="240" w:lineRule="auto" w:before="0"/>
+              <w:ind w:left="110" w:right="0" w:firstLine="0"/>
+              <w:jc w:val="left"/>
+            </w:pPr>
+            <w:r>
+              <w:rPr>
+                <w:sz w:val="17"/>
               </w:rPr>
               <w:t>14</w:t>
             </w:r>
@@ -2868,8 +3282,8 @@
       </w:tr>
       <w:tr>
         <w:trPr>
-          <w:trHeight w:val="216"/>
           <w:cantSplit/>
+          <w:trHeight w:val="210" w:hRule="atLeast"/>
         </w:trPr>
         <w:tc>
           <w:tcPr>
@@ -2880,16 +3294,22 @@
               <w:bottom w:val="single" w:sz="4" w:space="0" w:color="000000"/>
               <w:right w:val="single" w:sz="4" w:space="0" w:color="000000"/>
             </w:tcBorders>
-          </w:tcPr>
-          <w:p>
-            <w:pPr>
-              <w:spacing w:after="0" w:line="259" w:lineRule="auto"/>
-              <w:ind w:left="110" w:right="0" w:firstLine="0"/>
-              <w:jc w:val="left"/>
-            </w:pPr>
-            <w:r>
-              <w:rPr>
-                <w:sz w:val="19"/>
+            <w:tcMar>
+              <w:top w:w="20" w:type="dxa"/>
+              <w:bottom w:w="20" w:type="dxa"/>
+              <w:left w:w="60" w:type="dxa"/>
+              <w:right w:w="60" w:type="dxa"/>
+            </w:tcMar>
+          </w:tcPr>
+          <w:p>
+            <w:pPr>
+              <w:spacing w:after="0" w:line="240" w:lineRule="auto" w:before="0"/>
+              <w:ind w:left="110" w:right="0" w:firstLine="0"/>
+              <w:jc w:val="left"/>
+            </w:pPr>
+            <w:r>
+              <w:rPr>
+                <w:sz w:val="17"/>
               </w:rPr>
               <w:t>3.6</w:t>
             </w:r>
@@ -2904,16 +3324,22 @@
               <w:bottom w:val="single" w:sz="4" w:space="0" w:color="000000"/>
               <w:right w:val="single" w:sz="4" w:space="0" w:color="000000"/>
             </w:tcBorders>
-          </w:tcPr>
-          <w:p>
-            <w:pPr>
-              <w:spacing w:after="0" w:line="259" w:lineRule="auto"/>
-              <w:ind w:left="110" w:right="0" w:firstLine="0"/>
-              <w:jc w:val="left"/>
-            </w:pPr>
-            <w:r>
-              <w:rPr>
-                <w:sz w:val="19"/>
+            <w:tcMar>
+              <w:top w:w="20" w:type="dxa"/>
+              <w:bottom w:w="20" w:type="dxa"/>
+              <w:left w:w="60" w:type="dxa"/>
+              <w:right w:w="60" w:type="dxa"/>
+            </w:tcMar>
+          </w:tcPr>
+          <w:p>
+            <w:pPr>
+              <w:spacing w:after="0" w:line="240" w:lineRule="auto" w:before="0"/>
+              <w:ind w:left="110" w:right="0" w:firstLine="0"/>
+              <w:jc w:val="left"/>
+            </w:pPr>
+            <w:r>
+              <w:rPr>
+                <w:sz w:val="17"/>
               </w:rPr>
               <w:t>Skill Gap Analysis</w:t>
             </w:r>
@@ -2928,16 +3354,22 @@
               <w:bottom w:val="single" w:sz="4" w:space="0" w:color="000000"/>
               <w:right w:val="nil"/>
             </w:tcBorders>
-          </w:tcPr>
-          <w:p>
-            <w:pPr>
-              <w:spacing w:after="0" w:line="259" w:lineRule="auto"/>
-              <w:ind w:left="110" w:right="0" w:firstLine="0"/>
-              <w:jc w:val="left"/>
-            </w:pPr>
-            <w:r>
-              <w:rPr>
-                <w:sz w:val="19"/>
+            <w:tcMar>
+              <w:top w:w="20" w:type="dxa"/>
+              <w:bottom w:w="20" w:type="dxa"/>
+              <w:left w:w="60" w:type="dxa"/>
+              <w:right w:w="60" w:type="dxa"/>
+            </w:tcMar>
+          </w:tcPr>
+          <w:p>
+            <w:pPr>
+              <w:spacing w:after="0" w:line="240" w:lineRule="auto" w:before="0"/>
+              <w:ind w:left="110" w:right="0" w:firstLine="0"/>
+              <w:jc w:val="left"/>
+            </w:pPr>
+            <w:r>
+              <w:rPr>
+                <w:sz w:val="17"/>
               </w:rPr>
               <w:t>15</w:t>
             </w:r>
@@ -2946,8 +3378,8 @@
       </w:tr>
       <w:tr>
         <w:trPr>
-          <w:trHeight w:val="218"/>
           <w:cantSplit/>
+          <w:trHeight w:val="210" w:hRule="atLeast"/>
         </w:trPr>
         <w:tc>
           <w:tcPr>
@@ -2958,16 +3390,22 @@
               <w:bottom w:val="single" w:sz="4" w:space="0" w:color="000000"/>
               <w:right w:val="single" w:sz="4" w:space="0" w:color="000000"/>
             </w:tcBorders>
-          </w:tcPr>
-          <w:p>
-            <w:pPr>
-              <w:spacing w:after="0" w:line="259" w:lineRule="auto"/>
-              <w:ind w:left="110" w:right="0" w:firstLine="0"/>
-              <w:jc w:val="left"/>
-            </w:pPr>
-            <w:r>
-              <w:rPr>
-                <w:sz w:val="19"/>
+            <w:tcMar>
+              <w:top w:w="20" w:type="dxa"/>
+              <w:bottom w:w="20" w:type="dxa"/>
+              <w:left w:w="60" w:type="dxa"/>
+              <w:right w:w="60" w:type="dxa"/>
+            </w:tcMar>
+          </w:tcPr>
+          <w:p>
+            <w:pPr>
+              <w:spacing w:after="0" w:line="240" w:lineRule="auto" w:before="0"/>
+              <w:ind w:left="110" w:right="0" w:firstLine="0"/>
+              <w:jc w:val="left"/>
+            </w:pPr>
+            <w:r>
+              <w:rPr>
+                <w:sz w:val="17"/>
               </w:rPr>
               <w:t>3.7</w:t>
             </w:r>
@@ -2982,16 +3420,22 @@
               <w:bottom w:val="single" w:sz="4" w:space="0" w:color="000000"/>
               <w:right w:val="single" w:sz="4" w:space="0" w:color="000000"/>
             </w:tcBorders>
-          </w:tcPr>
-          <w:p>
-            <w:pPr>
-              <w:spacing w:after="0" w:line="259" w:lineRule="auto"/>
-              <w:ind w:left="110" w:right="0" w:firstLine="0"/>
-              <w:jc w:val="left"/>
-            </w:pPr>
-            <w:r>
-              <w:rPr>
-                <w:sz w:val="19"/>
+            <w:tcMar>
+              <w:top w:w="20" w:type="dxa"/>
+              <w:bottom w:w="20" w:type="dxa"/>
+              <w:left w:w="60" w:type="dxa"/>
+              <w:right w:w="60" w:type="dxa"/>
+            </w:tcMar>
+          </w:tcPr>
+          <w:p>
+            <w:pPr>
+              <w:spacing w:after="0" w:line="240" w:lineRule="auto" w:before="0"/>
+              <w:ind w:left="110" w:right="0" w:firstLine="0"/>
+              <w:jc w:val="left"/>
+            </w:pPr>
+            <w:r>
+              <w:rPr>
+                <w:sz w:val="17"/>
               </w:rPr>
               <w:t>Fairness, Privacy and Explainability</w:t>
             </w:r>
@@ -3006,16 +3450,22 @@
               <w:bottom w:val="single" w:sz="4" w:space="0" w:color="000000"/>
               <w:right w:val="nil"/>
             </w:tcBorders>
-          </w:tcPr>
-          <w:p>
-            <w:pPr>
-              <w:spacing w:after="0" w:line="259" w:lineRule="auto"/>
-              <w:ind w:left="110" w:right="0" w:firstLine="0"/>
-              <w:jc w:val="left"/>
-            </w:pPr>
-            <w:r>
-              <w:rPr>
-                <w:sz w:val="19"/>
+            <w:tcMar>
+              <w:top w:w="20" w:type="dxa"/>
+              <w:bottom w:w="20" w:type="dxa"/>
+              <w:left w:w="60" w:type="dxa"/>
+              <w:right w:w="60" w:type="dxa"/>
+            </w:tcMar>
+          </w:tcPr>
+          <w:p>
+            <w:pPr>
+              <w:spacing w:after="0" w:line="240" w:lineRule="auto" w:before="0"/>
+              <w:ind w:left="110" w:right="0" w:firstLine="0"/>
+              <w:jc w:val="left"/>
+            </w:pPr>
+            <w:r>
+              <w:rPr>
+                <w:sz w:val="17"/>
               </w:rPr>
               <w:t>16</w:t>
             </w:r>
@@ -3024,8 +3474,8 @@
       </w:tr>
       <w:tr>
         <w:trPr>
-          <w:trHeight w:val="424"/>
           <w:cantSplit/>
+          <w:trHeight w:val="210" w:hRule="atLeast"/>
         </w:trPr>
         <w:tc>
           <w:tcPr>
@@ -3037,16 +3487,22 @@
               <w:right w:val="single" w:sz="4" w:space="0" w:color="000000"/>
             </w:tcBorders>
             <w:vAlign w:val="center"/>
-          </w:tcPr>
-          <w:p>
-            <w:pPr>
-              <w:spacing w:after="0" w:line="259" w:lineRule="auto"/>
-              <w:ind w:left="110" w:right="0" w:firstLine="0"/>
-              <w:jc w:val="left"/>
-            </w:pPr>
-            <w:r>
-              <w:rPr>
-                <w:sz w:val="19"/>
+            <w:tcMar>
+              <w:top w:w="20" w:type="dxa"/>
+              <w:bottom w:w="20" w:type="dxa"/>
+              <w:left w:w="60" w:type="dxa"/>
+              <w:right w:w="60" w:type="dxa"/>
+            </w:tcMar>
+          </w:tcPr>
+          <w:p>
+            <w:pPr>
+              <w:spacing w:after="0" w:line="240" w:lineRule="auto" w:before="0"/>
+              <w:ind w:left="110" w:right="0" w:firstLine="0"/>
+              <w:jc w:val="left"/>
+            </w:pPr>
+            <w:r>
+              <w:rPr>
+                <w:sz w:val="17"/>
               </w:rPr>
               <w:t>4</w:t>
             </w:r>
@@ -3061,16 +3517,22 @@
               <w:bottom w:val="single" w:sz="4" w:space="0" w:color="000000"/>
               <w:right w:val="single" w:sz="4" w:space="0" w:color="000000"/>
             </w:tcBorders>
-          </w:tcPr>
-          <w:p>
-            <w:pPr>
-              <w:spacing w:after="0" w:line="259" w:lineRule="auto"/>
-              <w:ind w:left="110" w:right="0" w:firstLine="0"/>
-              <w:jc w:val="left"/>
-            </w:pPr>
-            <w:r>
-              <w:rPr>
-                <w:sz w:val="19"/>
+            <w:tcMar>
+              <w:top w:w="20" w:type="dxa"/>
+              <w:bottom w:w="20" w:type="dxa"/>
+              <w:left w:w="60" w:type="dxa"/>
+              <w:right w:w="60" w:type="dxa"/>
+            </w:tcMar>
+          </w:tcPr>
+          <w:p>
+            <w:pPr>
+              <w:spacing w:after="0" w:line="240" w:lineRule="auto" w:before="0"/>
+              <w:ind w:left="110" w:right="0" w:firstLine="0"/>
+              <w:jc w:val="left"/>
+            </w:pPr>
+            <w:r>
+              <w:rPr>
+                <w:sz w:val="17"/>
               </w:rPr>
               <w:t>SYSTEM DEVELOPMENT AND INTEGRATION</w:t>
             </w:r>
@@ -3086,16 +3548,22 @@
               <w:right w:val="nil"/>
             </w:tcBorders>
             <w:vAlign w:val="center"/>
-          </w:tcPr>
-          <w:p>
-            <w:pPr>
-              <w:spacing w:after="0" w:line="259" w:lineRule="auto"/>
-              <w:ind w:left="110" w:right="0" w:firstLine="0"/>
-              <w:jc w:val="left"/>
-            </w:pPr>
-            <w:r>
-              <w:rPr>
-                <w:sz w:val="19"/>
+            <w:tcMar>
+              <w:top w:w="20" w:type="dxa"/>
+              <w:bottom w:w="20" w:type="dxa"/>
+              <w:left w:w="60" w:type="dxa"/>
+              <w:right w:w="60" w:type="dxa"/>
+            </w:tcMar>
+          </w:tcPr>
+          <w:p>
+            <w:pPr>
+              <w:spacing w:after="0" w:line="240" w:lineRule="auto" w:before="0"/>
+              <w:ind w:left="110" w:right="0" w:firstLine="0"/>
+              <w:jc w:val="left"/>
+            </w:pPr>
+            <w:r>
+              <w:rPr>
+                <w:sz w:val="17"/>
               </w:rPr>
               <w:t>17</w:t>
             </w:r>
@@ -3104,8 +3572,8 @@
       </w:tr>
       <w:tr>
         <w:trPr>
-          <w:trHeight w:val="216"/>
           <w:cantSplit/>
+          <w:trHeight w:val="210" w:hRule="atLeast"/>
         </w:trPr>
         <w:tc>
           <w:tcPr>
@@ -3116,16 +3584,22 @@
               <w:bottom w:val="single" w:sz="4" w:space="0" w:color="000000"/>
               <w:right w:val="single" w:sz="4" w:space="0" w:color="000000"/>
             </w:tcBorders>
-          </w:tcPr>
-          <w:p>
-            <w:pPr>
-              <w:spacing w:after="0" w:line="259" w:lineRule="auto"/>
-              <w:ind w:left="110" w:right="0" w:firstLine="0"/>
-              <w:jc w:val="left"/>
-            </w:pPr>
-            <w:r>
-              <w:rPr>
-                <w:sz w:val="19"/>
+            <w:tcMar>
+              <w:top w:w="20" w:type="dxa"/>
+              <w:bottom w:w="20" w:type="dxa"/>
+              <w:left w:w="60" w:type="dxa"/>
+              <w:right w:w="60" w:type="dxa"/>
+            </w:tcMar>
+          </w:tcPr>
+          <w:p>
+            <w:pPr>
+              <w:spacing w:after="0" w:line="240" w:lineRule="auto" w:before="0"/>
+              <w:ind w:left="110" w:right="0" w:firstLine="0"/>
+              <w:jc w:val="left"/>
+            </w:pPr>
+            <w:r>
+              <w:rPr>
+                <w:sz w:val="17"/>
               </w:rPr>
               <w:t>4.1</w:t>
             </w:r>
@@ -3140,16 +3614,22 @@
               <w:bottom w:val="single" w:sz="4" w:space="0" w:color="000000"/>
               <w:right w:val="single" w:sz="4" w:space="0" w:color="000000"/>
             </w:tcBorders>
-          </w:tcPr>
-          <w:p>
-            <w:pPr>
-              <w:spacing w:after="0" w:line="259" w:lineRule="auto"/>
-              <w:ind w:left="110" w:right="0" w:firstLine="0"/>
-              <w:jc w:val="left"/>
-            </w:pPr>
-            <w:r>
-              <w:rPr>
-                <w:sz w:val="19"/>
+            <w:tcMar>
+              <w:top w:w="20" w:type="dxa"/>
+              <w:bottom w:w="20" w:type="dxa"/>
+              <w:left w:w="60" w:type="dxa"/>
+              <w:right w:w="60" w:type="dxa"/>
+            </w:tcMar>
+          </w:tcPr>
+          <w:p>
+            <w:pPr>
+              <w:spacing w:after="0" w:line="240" w:lineRule="auto" w:before="0"/>
+              <w:ind w:left="110" w:right="0" w:firstLine="0"/>
+              <w:jc w:val="left"/>
+            </w:pPr>
+            <w:r>
+              <w:rPr>
+                <w:sz w:val="17"/>
               </w:rPr>
               <w:t>System Architecture</w:t>
             </w:r>
@@ -3164,16 +3644,22 @@
               <w:bottom w:val="single" w:sz="4" w:space="0" w:color="000000"/>
               <w:right w:val="nil"/>
             </w:tcBorders>
-          </w:tcPr>
-          <w:p>
-            <w:pPr>
-              <w:spacing w:after="0" w:line="259" w:lineRule="auto"/>
-              <w:ind w:left="110" w:right="0" w:firstLine="0"/>
-              <w:jc w:val="left"/>
-            </w:pPr>
-            <w:r>
-              <w:rPr>
-                <w:sz w:val="19"/>
+            <w:tcMar>
+              <w:top w:w="20" w:type="dxa"/>
+              <w:bottom w:w="20" w:type="dxa"/>
+              <w:left w:w="60" w:type="dxa"/>
+              <w:right w:w="60" w:type="dxa"/>
+            </w:tcMar>
+          </w:tcPr>
+          <w:p>
+            <w:pPr>
+              <w:spacing w:after="0" w:line="240" w:lineRule="auto" w:before="0"/>
+              <w:ind w:left="110" w:right="0" w:firstLine="0"/>
+              <w:jc w:val="left"/>
+            </w:pPr>
+            <w:r>
+              <w:rPr>
+                <w:sz w:val="17"/>
               </w:rPr>
               <w:t>17</w:t>
             </w:r>
@@ -3182,8 +3668,8 @@
       </w:tr>
       <w:tr>
         <w:trPr>
-          <w:trHeight w:val="218"/>
           <w:cantSplit/>
+          <w:trHeight w:val="210" w:hRule="atLeast"/>
         </w:trPr>
         <w:tc>
           <w:tcPr>
@@ -3194,16 +3680,22 @@
               <w:bottom w:val="single" w:sz="4" w:space="0" w:color="000000"/>
               <w:right w:val="single" w:sz="4" w:space="0" w:color="000000"/>
             </w:tcBorders>
-          </w:tcPr>
-          <w:p>
-            <w:pPr>
-              <w:spacing w:after="0" w:line="259" w:lineRule="auto"/>
-              <w:ind w:left="110" w:right="0" w:firstLine="0"/>
-              <w:jc w:val="left"/>
-            </w:pPr>
-            <w:r>
-              <w:rPr>
-                <w:sz w:val="19"/>
+            <w:tcMar>
+              <w:top w:w="20" w:type="dxa"/>
+              <w:bottom w:w="20" w:type="dxa"/>
+              <w:left w:w="60" w:type="dxa"/>
+              <w:right w:w="60" w:type="dxa"/>
+            </w:tcMar>
+          </w:tcPr>
+          <w:p>
+            <w:pPr>
+              <w:spacing w:after="0" w:line="240" w:lineRule="auto" w:before="0"/>
+              <w:ind w:left="110" w:right="0" w:firstLine="0"/>
+              <w:jc w:val="left"/>
+            </w:pPr>
+            <w:r>
+              <w:rPr>
+                <w:sz w:val="17"/>
               </w:rPr>
               <w:t>4.2</w:t>
             </w:r>
@@ -3218,16 +3710,22 @@
               <w:bottom w:val="single" w:sz="4" w:space="0" w:color="000000"/>
               <w:right w:val="single" w:sz="4" w:space="0" w:color="000000"/>
             </w:tcBorders>
-          </w:tcPr>
-          <w:p>
-            <w:pPr>
-              <w:spacing w:after="0" w:line="259" w:lineRule="auto"/>
-              <w:ind w:left="110" w:right="0" w:firstLine="0"/>
-              <w:jc w:val="left"/>
-            </w:pPr>
-            <w:r>
-              <w:rPr>
-                <w:sz w:val="19"/>
+            <w:tcMar>
+              <w:top w:w="20" w:type="dxa"/>
+              <w:bottom w:w="20" w:type="dxa"/>
+              <w:left w:w="60" w:type="dxa"/>
+              <w:right w:w="60" w:type="dxa"/>
+            </w:tcMar>
+          </w:tcPr>
+          <w:p>
+            <w:pPr>
+              <w:spacing w:after="0" w:line="240" w:lineRule="auto" w:before="0"/>
+              <w:ind w:left="110" w:right="0" w:firstLine="0"/>
+              <w:jc w:val="left"/>
+            </w:pPr>
+            <w:r>
+              <w:rPr>
+                <w:sz w:val="17"/>
               </w:rPr>
               <w:t>Functional Workflow</w:t>
             </w:r>
@@ -3242,16 +3740,22 @@
               <w:bottom w:val="single" w:sz="4" w:space="0" w:color="000000"/>
               <w:right w:val="nil"/>
             </w:tcBorders>
-          </w:tcPr>
-          <w:p>
-            <w:pPr>
-              <w:spacing w:after="0" w:line="259" w:lineRule="auto"/>
-              <w:ind w:left="110" w:right="0" w:firstLine="0"/>
-              <w:jc w:val="left"/>
-            </w:pPr>
-            <w:r>
-              <w:rPr>
-                <w:sz w:val="19"/>
+            <w:tcMar>
+              <w:top w:w="20" w:type="dxa"/>
+              <w:bottom w:w="20" w:type="dxa"/>
+              <w:left w:w="60" w:type="dxa"/>
+              <w:right w:w="60" w:type="dxa"/>
+            </w:tcMar>
+          </w:tcPr>
+          <w:p>
+            <w:pPr>
+              <w:spacing w:after="0" w:line="240" w:lineRule="auto" w:before="0"/>
+              <w:ind w:left="110" w:right="0" w:firstLine="0"/>
+              <w:jc w:val="left"/>
+            </w:pPr>
+            <w:r>
+              <w:rPr>
+                <w:sz w:val="17"/>
               </w:rPr>
               <w:t>18</w:t>
             </w:r>
@@ -3260,8 +3764,8 @@
       </w:tr>
       <w:tr>
         <w:trPr>
-          <w:trHeight w:val="216"/>
           <w:cantSplit/>
+          <w:trHeight w:val="210" w:hRule="atLeast"/>
         </w:trPr>
         <w:tc>
           <w:tcPr>
@@ -3272,16 +3776,22 @@
               <w:bottom w:val="single" w:sz="4" w:space="0" w:color="000000"/>
               <w:right w:val="single" w:sz="4" w:space="0" w:color="000000"/>
             </w:tcBorders>
-          </w:tcPr>
-          <w:p>
-            <w:pPr>
-              <w:spacing w:after="0" w:line="259" w:lineRule="auto"/>
-              <w:ind w:left="110" w:right="0" w:firstLine="0"/>
-              <w:jc w:val="left"/>
-            </w:pPr>
-            <w:r>
-              <w:rPr>
-                <w:sz w:val="19"/>
+            <w:tcMar>
+              <w:top w:w="20" w:type="dxa"/>
+              <w:bottom w:w="20" w:type="dxa"/>
+              <w:left w:w="60" w:type="dxa"/>
+              <w:right w:w="60" w:type="dxa"/>
+            </w:tcMar>
+          </w:tcPr>
+          <w:p>
+            <w:pPr>
+              <w:spacing w:after="0" w:line="240" w:lineRule="auto" w:before="0"/>
+              <w:ind w:left="110" w:right="0" w:firstLine="0"/>
+              <w:jc w:val="left"/>
+            </w:pPr>
+            <w:r>
+              <w:rPr>
+                <w:sz w:val="17"/>
               </w:rPr>
               <w:t>4.3</w:t>
             </w:r>
@@ -3296,11 +3806,20 @@
               <w:bottom w:val="single" w:sz="4" w:space="0" w:color="000000"/>
               <w:right w:val="single" w:sz="4" w:space="0" w:color="000000"/>
             </w:tcBorders>
-          </w:tcPr>
-          <w:p>
-            <w:r>
-              <w:rPr>
-                <w:sz w:val="19"/>
+            <w:tcMar>
+              <w:top w:w="20" w:type="dxa"/>
+              <w:bottom w:w="20" w:type="dxa"/>
+              <w:left w:w="60" w:type="dxa"/>
+              <w:right w:w="60" w:type="dxa"/>
+            </w:tcMar>
+          </w:tcPr>
+          <w:p>
+            <w:pPr>
+              <w:spacing w:before="0" w:after="0" w:line="240" w:lineRule="auto"/>
+            </w:pPr>
+            <w:r>
+              <w:rPr>
+                <w:sz w:val="17"/>
               </w:rPr>
               <w:t>User Interface Modules and Deployed Screens</w:t>
             </w:r>
@@ -3315,16 +3834,22 @@
               <w:bottom w:val="single" w:sz="4" w:space="0" w:color="000000"/>
               <w:right w:val="nil"/>
             </w:tcBorders>
-          </w:tcPr>
-          <w:p>
-            <w:pPr>
-              <w:spacing w:after="0" w:line="259" w:lineRule="auto"/>
-              <w:ind w:left="110" w:right="0" w:firstLine="0"/>
-              <w:jc w:val="left"/>
-            </w:pPr>
-            <w:r>
-              <w:rPr>
-                <w:sz w:val="19"/>
+            <w:tcMar>
+              <w:top w:w="20" w:type="dxa"/>
+              <w:bottom w:w="20" w:type="dxa"/>
+              <w:left w:w="60" w:type="dxa"/>
+              <w:right w:w="60" w:type="dxa"/>
+            </w:tcMar>
+          </w:tcPr>
+          <w:p>
+            <w:pPr>
+              <w:spacing w:after="0" w:line="240" w:lineRule="auto" w:before="0"/>
+              <w:ind w:left="110" w:right="0" w:firstLine="0"/>
+              <w:jc w:val="left"/>
+            </w:pPr>
+            <w:r>
+              <w:rPr>
+                <w:sz w:val="17"/>
               </w:rPr>
               <w:t>19</w:t>
             </w:r>
@@ -3333,8 +3858,8 @@
       </w:tr>
       <w:tr>
         <w:trPr>
-          <w:trHeight w:val="218"/>
           <w:cantSplit/>
+          <w:trHeight w:val="210" w:hRule="atLeast"/>
         </w:trPr>
         <w:tc>
           <w:tcPr>
@@ -3345,16 +3870,22 @@
               <w:bottom w:val="single" w:sz="4" w:space="0" w:color="000000"/>
               <w:right w:val="single" w:sz="4" w:space="0" w:color="000000"/>
             </w:tcBorders>
-          </w:tcPr>
-          <w:p>
-            <w:pPr>
-              <w:spacing w:after="0" w:line="259" w:lineRule="auto"/>
-              <w:ind w:left="110" w:right="0" w:firstLine="0"/>
-              <w:jc w:val="left"/>
-            </w:pPr>
-            <w:r>
-              <w:rPr>
-                <w:sz w:val="19"/>
+            <w:tcMar>
+              <w:top w:w="20" w:type="dxa"/>
+              <w:bottom w:w="20" w:type="dxa"/>
+              <w:left w:w="60" w:type="dxa"/>
+              <w:right w:w="60" w:type="dxa"/>
+            </w:tcMar>
+          </w:tcPr>
+          <w:p>
+            <w:pPr>
+              <w:spacing w:after="0" w:line="240" w:lineRule="auto" w:before="0"/>
+              <w:ind w:left="110" w:right="0" w:firstLine="0"/>
+              <w:jc w:val="left"/>
+            </w:pPr>
+            <w:r>
+              <w:rPr>
+                <w:sz w:val="17"/>
               </w:rPr>
               <w:t>4.4</w:t>
             </w:r>
@@ -3369,16 +3900,22 @@
               <w:bottom w:val="single" w:sz="4" w:space="0" w:color="000000"/>
               <w:right w:val="single" w:sz="4" w:space="0" w:color="000000"/>
             </w:tcBorders>
-          </w:tcPr>
-          <w:p>
-            <w:pPr>
-              <w:spacing w:after="0" w:line="259" w:lineRule="auto"/>
-              <w:ind w:left="110" w:right="0" w:firstLine="0"/>
-              <w:jc w:val="left"/>
-            </w:pPr>
-            <w:r>
-              <w:rPr>
-                <w:sz w:val="19"/>
+            <w:tcMar>
+              <w:top w:w="20" w:type="dxa"/>
+              <w:bottom w:w="20" w:type="dxa"/>
+              <w:left w:w="60" w:type="dxa"/>
+              <w:right w:w="60" w:type="dxa"/>
+            </w:tcMar>
+          </w:tcPr>
+          <w:p>
+            <w:pPr>
+              <w:spacing w:after="0" w:line="240" w:lineRule="auto" w:before="0"/>
+              <w:ind w:left="110" w:right="0" w:firstLine="0"/>
+              <w:jc w:val="left"/>
+            </w:pPr>
+            <w:r>
+              <w:rPr>
+                <w:sz w:val="17"/>
               </w:rPr>
               <w:t>Data Model and API Design</w:t>
             </w:r>
@@ -3393,16 +3930,22 @@
               <w:bottom w:val="single" w:sz="4" w:space="0" w:color="000000"/>
               <w:right w:val="nil"/>
             </w:tcBorders>
-          </w:tcPr>
-          <w:p>
-            <w:pPr>
-              <w:spacing w:after="0" w:line="259" w:lineRule="auto"/>
-              <w:ind w:left="110" w:right="0" w:firstLine="0"/>
-              <w:jc w:val="left"/>
-            </w:pPr>
-            <w:r>
-              <w:rPr>
-                <w:sz w:val="19"/>
+            <w:tcMar>
+              <w:top w:w="20" w:type="dxa"/>
+              <w:bottom w:w="20" w:type="dxa"/>
+              <w:left w:w="60" w:type="dxa"/>
+              <w:right w:w="60" w:type="dxa"/>
+            </w:tcMar>
+          </w:tcPr>
+          <w:p>
+            <w:pPr>
+              <w:spacing w:after="0" w:line="240" w:lineRule="auto" w:before="0"/>
+              <w:ind w:left="110" w:right="0" w:firstLine="0"/>
+              <w:jc w:val="left"/>
+            </w:pPr>
+            <w:r>
+              <w:rPr>
+                <w:sz w:val="17"/>
               </w:rPr>
               <w:t>23</w:t>
             </w:r>
@@ -3411,8 +3954,8 @@
       </w:tr>
       <w:tr>
         <w:trPr>
-          <w:trHeight w:val="216"/>
           <w:cantSplit/>
+          <w:trHeight w:val="210" w:hRule="atLeast"/>
         </w:trPr>
         <w:tc>
           <w:tcPr>
@@ -3423,16 +3966,22 @@
               <w:bottom w:val="single" w:sz="4" w:space="0" w:color="000000"/>
               <w:right w:val="single" w:sz="4" w:space="0" w:color="000000"/>
             </w:tcBorders>
-          </w:tcPr>
-          <w:p>
-            <w:pPr>
-              <w:spacing w:after="0" w:line="259" w:lineRule="auto"/>
-              <w:ind w:left="110" w:right="0" w:firstLine="0"/>
-              <w:jc w:val="left"/>
-            </w:pPr>
-            <w:r>
-              <w:rPr>
-                <w:sz w:val="19"/>
+            <w:tcMar>
+              <w:top w:w="20" w:type="dxa"/>
+              <w:bottom w:w="20" w:type="dxa"/>
+              <w:left w:w="60" w:type="dxa"/>
+              <w:right w:w="60" w:type="dxa"/>
+            </w:tcMar>
+          </w:tcPr>
+          <w:p>
+            <w:pPr>
+              <w:spacing w:after="0" w:line="240" w:lineRule="auto" w:before="0"/>
+              <w:ind w:left="110" w:right="0" w:firstLine="0"/>
+              <w:jc w:val="left"/>
+            </w:pPr>
+            <w:r>
+              <w:rPr>
+                <w:sz w:val="17"/>
               </w:rPr>
               <w:t>4.5</w:t>
             </w:r>
@@ -3447,16 +3996,22 @@
               <w:bottom w:val="single" w:sz="4" w:space="0" w:color="000000"/>
               <w:right w:val="single" w:sz="4" w:space="0" w:color="000000"/>
             </w:tcBorders>
-          </w:tcPr>
-          <w:p>
-            <w:pPr>
-              <w:spacing w:after="0" w:line="259" w:lineRule="auto"/>
-              <w:ind w:left="110" w:right="0" w:firstLine="0"/>
-              <w:jc w:val="left"/>
-            </w:pPr>
-            <w:r>
-              <w:rPr>
-                <w:sz w:val="19"/>
+            <w:tcMar>
+              <w:top w:w="20" w:type="dxa"/>
+              <w:bottom w:w="20" w:type="dxa"/>
+              <w:left w:w="60" w:type="dxa"/>
+              <w:right w:w="60" w:type="dxa"/>
+            </w:tcMar>
+          </w:tcPr>
+          <w:p>
+            <w:pPr>
+              <w:spacing w:after="0" w:line="240" w:lineRule="auto" w:before="0"/>
+              <w:ind w:left="110" w:right="0" w:firstLine="0"/>
+              <w:jc w:val="left"/>
+            </w:pPr>
+            <w:r>
+              <w:rPr>
+                <w:sz w:val="17"/>
               </w:rPr>
               <w:t>Implementation Plan</w:t>
             </w:r>
@@ -3471,16 +4026,22 @@
               <w:bottom w:val="single" w:sz="4" w:space="0" w:color="000000"/>
               <w:right w:val="nil"/>
             </w:tcBorders>
-          </w:tcPr>
-          <w:p>
-            <w:pPr>
-              <w:spacing w:after="0" w:line="259" w:lineRule="auto"/>
-              <w:ind w:left="110" w:right="0" w:firstLine="0"/>
-              <w:jc w:val="left"/>
-            </w:pPr>
-            <w:r>
-              <w:rPr>
-                <w:sz w:val="19"/>
+            <w:tcMar>
+              <w:top w:w="20" w:type="dxa"/>
+              <w:bottom w:w="20" w:type="dxa"/>
+              <w:left w:w="60" w:type="dxa"/>
+              <w:right w:w="60" w:type="dxa"/>
+            </w:tcMar>
+          </w:tcPr>
+          <w:p>
+            <w:pPr>
+              <w:spacing w:after="0" w:line="240" w:lineRule="auto" w:before="0"/>
+              <w:ind w:left="110" w:right="0" w:firstLine="0"/>
+              <w:jc w:val="left"/>
+            </w:pPr>
+            <w:r>
+              <w:rPr>
+                <w:sz w:val="17"/>
               </w:rPr>
               <w:t>25</w:t>
             </w:r>
@@ -3489,8 +4050,8 @@
       </w:tr>
       <w:tr>
         <w:trPr>
-          <w:trHeight w:val="218"/>
           <w:cantSplit/>
+          <w:trHeight w:val="210" w:hRule="atLeast"/>
         </w:trPr>
         <w:tc>
           <w:tcPr>
@@ -3501,16 +4062,22 @@
               <w:bottom w:val="single" w:sz="4" w:space="0" w:color="000000"/>
               <w:right w:val="single" w:sz="4" w:space="0" w:color="000000"/>
             </w:tcBorders>
-          </w:tcPr>
-          <w:p>
-            <w:pPr>
-              <w:spacing w:after="0" w:line="259" w:lineRule="auto"/>
-              <w:ind w:left="110" w:right="0" w:firstLine="0"/>
-              <w:jc w:val="left"/>
-            </w:pPr>
-            <w:r>
-              <w:rPr>
-                <w:sz w:val="19"/>
+            <w:tcMar>
+              <w:top w:w="20" w:type="dxa"/>
+              <w:bottom w:w="20" w:type="dxa"/>
+              <w:left w:w="60" w:type="dxa"/>
+              <w:right w:w="60" w:type="dxa"/>
+            </w:tcMar>
+          </w:tcPr>
+          <w:p>
+            <w:pPr>
+              <w:spacing w:after="0" w:line="240" w:lineRule="auto" w:before="0"/>
+              <w:ind w:left="110" w:right="0" w:firstLine="0"/>
+              <w:jc w:val="left"/>
+            </w:pPr>
+            <w:r>
+              <w:rPr>
+                <w:sz w:val="17"/>
               </w:rPr>
               <w:t>5</w:t>
             </w:r>
@@ -3525,16 +4092,22 @@
               <w:bottom w:val="single" w:sz="4" w:space="0" w:color="000000"/>
               <w:right w:val="single" w:sz="4" w:space="0" w:color="000000"/>
             </w:tcBorders>
-          </w:tcPr>
-          <w:p>
-            <w:pPr>
-              <w:spacing w:after="0" w:line="259" w:lineRule="auto"/>
-              <w:ind w:left="110" w:right="0" w:firstLine="0"/>
-              <w:jc w:val="left"/>
-            </w:pPr>
-            <w:r>
-              <w:rPr>
-                <w:sz w:val="19"/>
+            <w:tcMar>
+              <w:top w:w="20" w:type="dxa"/>
+              <w:bottom w:w="20" w:type="dxa"/>
+              <w:left w:w="60" w:type="dxa"/>
+              <w:right w:w="60" w:type="dxa"/>
+            </w:tcMar>
+          </w:tcPr>
+          <w:p>
+            <w:pPr>
+              <w:spacing w:after="0" w:line="240" w:lineRule="auto" w:before="0"/>
+              <w:ind w:left="110" w:right="0" w:firstLine="0"/>
+              <w:jc w:val="left"/>
+            </w:pPr>
+            <w:r>
+              <w:rPr>
+                <w:sz w:val="17"/>
               </w:rPr>
               <w:t>RESULTS AND EVALUATION PLAN</w:t>
             </w:r>
@@ -3549,16 +4122,22 @@
               <w:bottom w:val="single" w:sz="4" w:space="0" w:color="000000"/>
               <w:right w:val="nil"/>
             </w:tcBorders>
-          </w:tcPr>
-          <w:p>
-            <w:pPr>
-              <w:spacing w:after="0" w:line="259" w:lineRule="auto"/>
-              <w:ind w:left="110" w:right="0" w:firstLine="0"/>
-              <w:jc w:val="left"/>
-            </w:pPr>
-            <w:r>
-              <w:rPr>
-                <w:sz w:val="19"/>
+            <w:tcMar>
+              <w:top w:w="20" w:type="dxa"/>
+              <w:bottom w:w="20" w:type="dxa"/>
+              <w:left w:w="60" w:type="dxa"/>
+              <w:right w:w="60" w:type="dxa"/>
+            </w:tcMar>
+          </w:tcPr>
+          <w:p>
+            <w:pPr>
+              <w:spacing w:after="0" w:line="240" w:lineRule="auto" w:before="0"/>
+              <w:ind w:left="110" w:right="0" w:firstLine="0"/>
+              <w:jc w:val="left"/>
+            </w:pPr>
+            <w:r>
+              <w:rPr>
+                <w:sz w:val="17"/>
               </w:rPr>
               <w:t>27</w:t>
             </w:r>
@@ -3567,8 +4146,8 @@
       </w:tr>
       <w:tr>
         <w:trPr>
-          <w:trHeight w:val="216"/>
           <w:cantSplit/>
+          <w:trHeight w:val="210" w:hRule="atLeast"/>
         </w:trPr>
         <w:tc>
           <w:tcPr>
@@ -3579,16 +4158,22 @@
               <w:bottom w:val="single" w:sz="4" w:space="0" w:color="000000"/>
               <w:right w:val="single" w:sz="4" w:space="0" w:color="000000"/>
             </w:tcBorders>
-          </w:tcPr>
-          <w:p>
-            <w:pPr>
-              <w:spacing w:after="0" w:line="259" w:lineRule="auto"/>
-              <w:ind w:left="110" w:right="0" w:firstLine="0"/>
-              <w:jc w:val="left"/>
-            </w:pPr>
-            <w:r>
-              <w:rPr>
-                <w:sz w:val="19"/>
+            <w:tcMar>
+              <w:top w:w="20" w:type="dxa"/>
+              <w:bottom w:w="20" w:type="dxa"/>
+              <w:left w:w="60" w:type="dxa"/>
+              <w:right w:w="60" w:type="dxa"/>
+            </w:tcMar>
+          </w:tcPr>
+          <w:p>
+            <w:pPr>
+              <w:spacing w:after="0" w:line="240" w:lineRule="auto" w:before="0"/>
+              <w:ind w:left="110" w:right="0" w:firstLine="0"/>
+              <w:jc w:val="left"/>
+            </w:pPr>
+            <w:r>
+              <w:rPr>
+                <w:sz w:val="17"/>
               </w:rPr>
               <w:t>5.1</w:t>
             </w:r>
@@ -3603,11 +4188,20 @@
               <w:bottom w:val="single" w:sz="4" w:space="0" w:color="000000"/>
               <w:right w:val="single" w:sz="4" w:space="0" w:color="000000"/>
             </w:tcBorders>
-          </w:tcPr>
-          <w:p>
-            <w:r>
-              <w:rPr>
-                <w:sz w:val="19"/>
+            <w:tcMar>
+              <w:top w:w="20" w:type="dxa"/>
+              <w:bottom w:w="20" w:type="dxa"/>
+              <w:left w:w="60" w:type="dxa"/>
+              <w:right w:w="60" w:type="dxa"/>
+            </w:tcMar>
+          </w:tcPr>
+          <w:p>
+            <w:pPr>
+              <w:spacing w:before="0" w:after="0" w:line="240" w:lineRule="auto"/>
+            </w:pPr>
+            <w:r>
+              <w:rPr>
+                <w:sz w:val="17"/>
               </w:rPr>
               <w:t>System Implementation and Deployed Interface Verification</w:t>
             </w:r>
@@ -3622,16 +4216,22 @@
               <w:bottom w:val="single" w:sz="4" w:space="0" w:color="000000"/>
               <w:right w:val="nil"/>
             </w:tcBorders>
-          </w:tcPr>
-          <w:p>
-            <w:pPr>
-              <w:spacing w:after="0" w:line="259" w:lineRule="auto"/>
-              <w:ind w:left="110" w:right="0" w:firstLine="0"/>
-              <w:jc w:val="left"/>
-            </w:pPr>
-            <w:r>
-              <w:rPr>
-                <w:sz w:val="19"/>
+            <w:tcMar>
+              <w:top w:w="20" w:type="dxa"/>
+              <w:bottom w:w="20" w:type="dxa"/>
+              <w:left w:w="60" w:type="dxa"/>
+              <w:right w:w="60" w:type="dxa"/>
+            </w:tcMar>
+          </w:tcPr>
+          <w:p>
+            <w:pPr>
+              <w:spacing w:after="0" w:line="240" w:lineRule="auto" w:before="0"/>
+              <w:ind w:left="110" w:right="0" w:firstLine="0"/>
+              <w:jc w:val="left"/>
+            </w:pPr>
+            <w:r>
+              <w:rPr>
+                <w:sz w:val="17"/>
               </w:rPr>
               <w:t>27</w:t>
             </w:r>
@@ -3640,8 +4240,8 @@
       </w:tr>
       <w:tr>
         <w:trPr>
-          <w:trHeight w:val="218"/>
           <w:cantSplit/>
+          <w:trHeight w:val="210" w:hRule="atLeast"/>
         </w:trPr>
         <w:tc>
           <w:tcPr>
@@ -3652,16 +4252,22 @@
               <w:bottom w:val="single" w:sz="4" w:space="0" w:color="000000"/>
               <w:right w:val="single" w:sz="4" w:space="0" w:color="000000"/>
             </w:tcBorders>
-          </w:tcPr>
-          <w:p>
-            <w:pPr>
-              <w:spacing w:after="0" w:line="259" w:lineRule="auto"/>
-              <w:ind w:left="110" w:right="0" w:firstLine="0"/>
-              <w:jc w:val="left"/>
-            </w:pPr>
-            <w:r>
-              <w:rPr>
-                <w:sz w:val="19"/>
+            <w:tcMar>
+              <w:top w:w="20" w:type="dxa"/>
+              <w:bottom w:w="20" w:type="dxa"/>
+              <w:left w:w="60" w:type="dxa"/>
+              <w:right w:w="60" w:type="dxa"/>
+            </w:tcMar>
+          </w:tcPr>
+          <w:p>
+            <w:pPr>
+              <w:spacing w:after="0" w:line="240" w:lineRule="auto" w:before="0"/>
+              <w:ind w:left="110" w:right="0" w:firstLine="0"/>
+              <w:jc w:val="left"/>
+            </w:pPr>
+            <w:r>
+              <w:rPr>
+                <w:sz w:val="17"/>
               </w:rPr>
               <w:t>5.2</w:t>
             </w:r>
@@ -3676,16 +4282,22 @@
               <w:bottom w:val="single" w:sz="4" w:space="0" w:color="000000"/>
               <w:right w:val="single" w:sz="4" w:space="0" w:color="000000"/>
             </w:tcBorders>
-          </w:tcPr>
-          <w:p>
-            <w:pPr>
-              <w:spacing w:after="0" w:line="259" w:lineRule="auto"/>
-              <w:ind w:left="110" w:right="0" w:firstLine="0"/>
-              <w:jc w:val="left"/>
-            </w:pPr>
-            <w:r>
-              <w:rPr>
-                <w:sz w:val="19"/>
+            <w:tcMar>
+              <w:top w:w="20" w:type="dxa"/>
+              <w:bottom w:w="20" w:type="dxa"/>
+              <w:left w:w="60" w:type="dxa"/>
+              <w:right w:w="60" w:type="dxa"/>
+            </w:tcMar>
+          </w:tcPr>
+          <w:p>
+            <w:pPr>
+              <w:spacing w:after="0" w:line="240" w:lineRule="auto" w:before="0"/>
+              <w:ind w:left="110" w:right="0" w:firstLine="0"/>
+              <w:jc w:val="left"/>
+            </w:pPr>
+            <w:r>
+              <w:rPr>
+                <w:sz w:val="17"/>
               </w:rPr>
               <w:t>Functional Test Plan</w:t>
             </w:r>
@@ -3700,16 +4312,22 @@
               <w:bottom w:val="single" w:sz="4" w:space="0" w:color="000000"/>
               <w:right w:val="nil"/>
             </w:tcBorders>
-          </w:tcPr>
-          <w:p>
-            <w:pPr>
-              <w:spacing w:after="0" w:line="259" w:lineRule="auto"/>
-              <w:ind w:left="110" w:right="0" w:firstLine="0"/>
-              <w:jc w:val="left"/>
-            </w:pPr>
-            <w:r>
-              <w:rPr>
-                <w:sz w:val="19"/>
+            <w:tcMar>
+              <w:top w:w="20" w:type="dxa"/>
+              <w:bottom w:w="20" w:type="dxa"/>
+              <w:left w:w="60" w:type="dxa"/>
+              <w:right w:w="60" w:type="dxa"/>
+            </w:tcMar>
+          </w:tcPr>
+          <w:p>
+            <w:pPr>
+              <w:spacing w:after="0" w:line="240" w:lineRule="auto" w:before="0"/>
+              <w:ind w:left="110" w:right="0" w:firstLine="0"/>
+              <w:jc w:val="left"/>
+            </w:pPr>
+            <w:r>
+              <w:rPr>
+                <w:sz w:val="17"/>
               </w:rPr>
               <w:t>30</w:t>
             </w:r>
@@ -3718,8 +4336,8 @@
       </w:tr>
       <w:tr>
         <w:trPr>
-          <w:trHeight w:val="216"/>
           <w:cantSplit/>
+          <w:trHeight w:val="210" w:hRule="atLeast"/>
         </w:trPr>
         <w:tc>
           <w:tcPr>
@@ -3730,16 +4348,22 @@
               <w:bottom w:val="single" w:sz="4" w:space="0" w:color="000000"/>
               <w:right w:val="single" w:sz="4" w:space="0" w:color="000000"/>
             </w:tcBorders>
-          </w:tcPr>
-          <w:p>
-            <w:pPr>
-              <w:spacing w:after="0" w:line="259" w:lineRule="auto"/>
-              <w:ind w:left="110" w:right="0" w:firstLine="0"/>
-              <w:jc w:val="left"/>
-            </w:pPr>
-            <w:r>
-              <w:rPr>
-                <w:sz w:val="19"/>
+            <w:tcMar>
+              <w:top w:w="20" w:type="dxa"/>
+              <w:bottom w:w="20" w:type="dxa"/>
+              <w:left w:w="60" w:type="dxa"/>
+              <w:right w:w="60" w:type="dxa"/>
+            </w:tcMar>
+          </w:tcPr>
+          <w:p>
+            <w:pPr>
+              <w:spacing w:after="0" w:line="240" w:lineRule="auto" w:before="0"/>
+              <w:ind w:left="110" w:right="0" w:firstLine="0"/>
+              <w:jc w:val="left"/>
+            </w:pPr>
+            <w:r>
+              <w:rPr>
+                <w:sz w:val="17"/>
               </w:rPr>
               <w:t>5.3</w:t>
             </w:r>
@@ -3754,16 +4378,22 @@
               <w:bottom w:val="single" w:sz="4" w:space="0" w:color="000000"/>
               <w:right w:val="single" w:sz="4" w:space="0" w:color="000000"/>
             </w:tcBorders>
-          </w:tcPr>
-          <w:p>
-            <w:pPr>
-              <w:spacing w:after="0" w:line="259" w:lineRule="auto"/>
-              <w:ind w:left="110" w:right="0" w:firstLine="0"/>
-              <w:jc w:val="left"/>
-            </w:pPr>
-            <w:r>
-              <w:rPr>
-                <w:sz w:val="19"/>
+            <w:tcMar>
+              <w:top w:w="20" w:type="dxa"/>
+              <w:bottom w:w="20" w:type="dxa"/>
+              <w:left w:w="60" w:type="dxa"/>
+              <w:right w:w="60" w:type="dxa"/>
+            </w:tcMar>
+          </w:tcPr>
+          <w:p>
+            <w:pPr>
+              <w:spacing w:after="0" w:line="240" w:lineRule="auto" w:before="0"/>
+              <w:ind w:left="110" w:right="0" w:firstLine="0"/>
+              <w:jc w:val="left"/>
+            </w:pPr>
+            <w:r>
+              <w:rPr>
+                <w:sz w:val="17"/>
               </w:rPr>
               <w:t>Evaluation Metrics</w:t>
             </w:r>
@@ -3778,16 +4408,22 @@
               <w:bottom w:val="single" w:sz="4" w:space="0" w:color="000000"/>
               <w:right w:val="nil"/>
             </w:tcBorders>
-          </w:tcPr>
-          <w:p>
-            <w:pPr>
-              <w:spacing w:after="0" w:line="259" w:lineRule="auto"/>
-              <w:ind w:left="110" w:right="0" w:firstLine="0"/>
-              <w:jc w:val="left"/>
-            </w:pPr>
-            <w:r>
-              <w:rPr>
-                <w:sz w:val="19"/>
+            <w:tcMar>
+              <w:top w:w="20" w:type="dxa"/>
+              <w:bottom w:w="20" w:type="dxa"/>
+              <w:left w:w="60" w:type="dxa"/>
+              <w:right w:w="60" w:type="dxa"/>
+            </w:tcMar>
+          </w:tcPr>
+          <w:p>
+            <w:pPr>
+              <w:spacing w:after="0" w:line="240" w:lineRule="auto" w:before="0"/>
+              <w:ind w:left="110" w:right="0" w:firstLine="0"/>
+              <w:jc w:val="left"/>
+            </w:pPr>
+            <w:r>
+              <w:rPr>
+                <w:sz w:val="17"/>
               </w:rPr>
               <w:t>32</w:t>
             </w:r>
@@ -3796,8 +4432,8 @@
       </w:tr>
       <w:tr>
         <w:trPr>
-          <w:trHeight w:val="218"/>
           <w:cantSplit/>
+          <w:trHeight w:val="210" w:hRule="atLeast"/>
         </w:trPr>
         <w:tc>
           <w:tcPr>
@@ -3808,16 +4444,22 @@
               <w:bottom w:val="single" w:sz="4" w:space="0" w:color="000000"/>
               <w:right w:val="single" w:sz="4" w:space="0" w:color="000000"/>
             </w:tcBorders>
-          </w:tcPr>
-          <w:p>
-            <w:pPr>
-              <w:spacing w:after="0" w:line="259" w:lineRule="auto"/>
-              <w:ind w:left="110" w:right="0" w:firstLine="0"/>
-              <w:jc w:val="left"/>
-            </w:pPr>
-            <w:r>
-              <w:rPr>
-                <w:sz w:val="19"/>
+            <w:tcMar>
+              <w:top w:w="20" w:type="dxa"/>
+              <w:bottom w:w="20" w:type="dxa"/>
+              <w:left w:w="60" w:type="dxa"/>
+              <w:right w:w="60" w:type="dxa"/>
+            </w:tcMar>
+          </w:tcPr>
+          <w:p>
+            <w:pPr>
+              <w:spacing w:after="0" w:line="240" w:lineRule="auto" w:before="0"/>
+              <w:ind w:left="110" w:right="0" w:firstLine="0"/>
+              <w:jc w:val="left"/>
+            </w:pPr>
+            <w:r>
+              <w:rPr>
+                <w:sz w:val="17"/>
               </w:rPr>
               <w:t>5.4</w:t>
             </w:r>
@@ -3832,16 +4474,22 @@
               <w:bottom w:val="single" w:sz="4" w:space="0" w:color="000000"/>
               <w:right w:val="single" w:sz="4" w:space="0" w:color="000000"/>
             </w:tcBorders>
-          </w:tcPr>
-          <w:p>
-            <w:pPr>
-              <w:spacing w:after="0" w:line="259" w:lineRule="auto"/>
-              <w:ind w:left="110" w:right="0" w:firstLine="0"/>
-              <w:jc w:val="left"/>
-            </w:pPr>
-            <w:r>
-              <w:rPr>
-                <w:sz w:val="19"/>
+            <w:tcMar>
+              <w:top w:w="20" w:type="dxa"/>
+              <w:bottom w:w="20" w:type="dxa"/>
+              <w:left w:w="60" w:type="dxa"/>
+              <w:right w:w="60" w:type="dxa"/>
+            </w:tcMar>
+          </w:tcPr>
+          <w:p>
+            <w:pPr>
+              <w:spacing w:after="0" w:line="240" w:lineRule="auto" w:before="0"/>
+              <w:ind w:left="110" w:right="0" w:firstLine="0"/>
+              <w:jc w:val="left"/>
+            </w:pPr>
+            <w:r>
+              <w:rPr>
+                <w:sz w:val="17"/>
               </w:rPr>
               <w:t>Expected Outcomes and Limitations</w:t>
             </w:r>
@@ -3856,16 +4504,22 @@
               <w:bottom w:val="single" w:sz="4" w:space="0" w:color="000000"/>
               <w:right w:val="nil"/>
             </w:tcBorders>
-          </w:tcPr>
-          <w:p>
-            <w:pPr>
-              <w:spacing w:after="0" w:line="259" w:lineRule="auto"/>
-              <w:ind w:left="110" w:right="0" w:firstLine="0"/>
-              <w:jc w:val="left"/>
-            </w:pPr>
-            <w:r>
-              <w:rPr>
-                <w:sz w:val="19"/>
+            <w:tcMar>
+              <w:top w:w="20" w:type="dxa"/>
+              <w:bottom w:w="20" w:type="dxa"/>
+              <w:left w:w="60" w:type="dxa"/>
+              <w:right w:w="60" w:type="dxa"/>
+            </w:tcMar>
+          </w:tcPr>
+          <w:p>
+            <w:pPr>
+              <w:spacing w:after="0" w:line="240" w:lineRule="auto" w:before="0"/>
+              <w:ind w:left="110" w:right="0" w:firstLine="0"/>
+              <w:jc w:val="left"/>
+            </w:pPr>
+            <w:r>
+              <w:rPr>
+                <w:sz w:val="17"/>
               </w:rPr>
               <w:t>34</w:t>
             </w:r>
@@ -3874,8 +4528,8 @@
       </w:tr>
       <w:tr>
         <w:trPr>
-          <w:trHeight w:val="216"/>
           <w:cantSplit/>
+          <w:trHeight w:val="210" w:hRule="atLeast"/>
         </w:trPr>
         <w:tc>
           <w:tcPr>
@@ -3886,16 +4540,22 @@
               <w:bottom w:val="single" w:sz="4" w:space="0" w:color="000000"/>
               <w:right w:val="single" w:sz="4" w:space="0" w:color="000000"/>
             </w:tcBorders>
-          </w:tcPr>
-          <w:p>
-            <w:pPr>
-              <w:spacing w:after="0" w:line="259" w:lineRule="auto"/>
-              <w:ind w:left="110" w:right="0" w:firstLine="0"/>
-              <w:jc w:val="left"/>
-            </w:pPr>
-            <w:r>
-              <w:rPr>
-                <w:sz w:val="19"/>
+            <w:tcMar>
+              <w:top w:w="20" w:type="dxa"/>
+              <w:bottom w:w="20" w:type="dxa"/>
+              <w:left w:w="60" w:type="dxa"/>
+              <w:right w:w="60" w:type="dxa"/>
+            </w:tcMar>
+          </w:tcPr>
+          <w:p>
+            <w:pPr>
+              <w:spacing w:after="0" w:line="240" w:lineRule="auto" w:before="0"/>
+              <w:ind w:left="110" w:right="0" w:firstLine="0"/>
+              <w:jc w:val="left"/>
+            </w:pPr>
+            <w:r>
+              <w:rPr>
+                <w:sz w:val="17"/>
               </w:rPr>
               <w:t>6</w:t>
             </w:r>
@@ -3910,16 +4570,22 @@
               <w:bottom w:val="single" w:sz="4" w:space="0" w:color="000000"/>
               <w:right w:val="single" w:sz="4" w:space="0" w:color="000000"/>
             </w:tcBorders>
-          </w:tcPr>
-          <w:p>
-            <w:pPr>
-              <w:spacing w:after="0" w:line="259" w:lineRule="auto"/>
-              <w:ind w:left="110" w:right="0" w:firstLine="0"/>
-              <w:jc w:val="left"/>
-            </w:pPr>
-            <w:r>
-              <w:rPr>
-                <w:sz w:val="19"/>
+            <w:tcMar>
+              <w:top w:w="20" w:type="dxa"/>
+              <w:bottom w:w="20" w:type="dxa"/>
+              <w:left w:w="60" w:type="dxa"/>
+              <w:right w:w="60" w:type="dxa"/>
+            </w:tcMar>
+          </w:tcPr>
+          <w:p>
+            <w:pPr>
+              <w:spacing w:after="0" w:line="240" w:lineRule="auto" w:before="0"/>
+              <w:ind w:left="110" w:right="0" w:firstLine="0"/>
+              <w:jc w:val="left"/>
+            </w:pPr>
+            <w:r>
+              <w:rPr>
+                <w:sz w:val="17"/>
               </w:rPr>
               <w:t>CONCLUSION AND FUTURE SCOPE</w:t>
             </w:r>
@@ -3934,16 +4600,22 @@
               <w:bottom w:val="single" w:sz="4" w:space="0" w:color="000000"/>
               <w:right w:val="nil"/>
             </w:tcBorders>
-          </w:tcPr>
-          <w:p>
-            <w:pPr>
-              <w:spacing w:after="0" w:line="259" w:lineRule="auto"/>
-              <w:ind w:left="110" w:right="0" w:firstLine="0"/>
-              <w:jc w:val="left"/>
-            </w:pPr>
-            <w:r>
-              <w:rPr>
-                <w:sz w:val="19"/>
+            <w:tcMar>
+              <w:top w:w="20" w:type="dxa"/>
+              <w:bottom w:w="20" w:type="dxa"/>
+              <w:left w:w="60" w:type="dxa"/>
+              <w:right w:w="60" w:type="dxa"/>
+            </w:tcMar>
+          </w:tcPr>
+          <w:p>
+            <w:pPr>
+              <w:spacing w:after="0" w:line="240" w:lineRule="auto" w:before="0"/>
+              <w:ind w:left="110" w:right="0" w:firstLine="0"/>
+              <w:jc w:val="left"/>
+            </w:pPr>
+            <w:r>
+              <w:rPr>
+                <w:sz w:val="17"/>
               </w:rPr>
               <w:t>36</w:t>
             </w:r>
@@ -3952,8 +4624,8 @@
       </w:tr>
       <w:tr>
         <w:trPr>
-          <w:trHeight w:val="424"/>
           <w:cantSplit/>
+          <w:trHeight w:val="210" w:hRule="atLeast"/>
         </w:trPr>
         <w:tc>
           <w:tcPr>
@@ -3964,10 +4636,16 @@
               <w:bottom w:val="single" w:sz="4" w:space="0" w:color="000000"/>
               <w:right w:val="single" w:sz="4" w:space="0" w:color="000000"/>
             </w:tcBorders>
-          </w:tcPr>
-          <w:p>
-            <w:pPr>
-              <w:spacing w:after="160" w:line="259" w:lineRule="auto"/>
+            <w:tcMar>
+              <w:top w:w="20" w:type="dxa"/>
+              <w:bottom w:w="20" w:type="dxa"/>
+              <w:left w:w="60" w:type="dxa"/>
+              <w:right w:w="60" w:type="dxa"/>
+            </w:tcMar>
+          </w:tcPr>
+          <w:p>
+            <w:pPr>
+              <w:spacing w:after="0" w:line="240" w:lineRule="auto" w:before="0"/>
               <w:ind w:right="0" w:firstLine="0"/>
               <w:jc w:val="left"/>
             </w:pPr>
@@ -3982,16 +4660,22 @@
               <w:bottom w:val="single" w:sz="4" w:space="0" w:color="000000"/>
               <w:right w:val="single" w:sz="4" w:space="0" w:color="000000"/>
             </w:tcBorders>
-          </w:tcPr>
-          <w:p>
-            <w:pPr>
-              <w:spacing w:after="0" w:line="259" w:lineRule="auto"/>
-              <w:ind w:left="110" w:right="0" w:firstLine="0"/>
-              <w:jc w:val="left"/>
-            </w:pPr>
-            <w:r>
-              <w:rPr>
-                <w:sz w:val="19"/>
+            <w:tcMar>
+              <w:top w:w="20" w:type="dxa"/>
+              <w:bottom w:w="20" w:type="dxa"/>
+              <w:left w:w="60" w:type="dxa"/>
+              <w:right w:w="60" w:type="dxa"/>
+            </w:tcMar>
+          </w:tcPr>
+          <w:p>
+            <w:pPr>
+              <w:spacing w:after="0" w:line="240" w:lineRule="auto" w:before="0"/>
+              <w:ind w:left="110" w:right="0" w:firstLine="0"/>
+              <w:jc w:val="left"/>
+            </w:pPr>
+            <w:r>
+              <w:rPr>
+                <w:sz w:val="17"/>
               </w:rPr>
               <w:t>APPENDIX A – Algorithms and Pseudocode</w:t>
             </w:r>
@@ -4007,16 +4691,22 @@
               <w:right w:val="nil"/>
             </w:tcBorders>
             <w:vAlign w:val="center"/>
-          </w:tcPr>
-          <w:p>
-            <w:pPr>
-              <w:spacing w:after="0" w:line="259" w:lineRule="auto"/>
-              <w:ind w:left="110" w:right="0" w:firstLine="0"/>
-              <w:jc w:val="left"/>
-            </w:pPr>
-            <w:r>
-              <w:rPr>
-                <w:sz w:val="19"/>
+            <w:tcMar>
+              <w:top w:w="20" w:type="dxa"/>
+              <w:bottom w:w="20" w:type="dxa"/>
+              <w:left w:w="60" w:type="dxa"/>
+              <w:right w:w="60" w:type="dxa"/>
+            </w:tcMar>
+          </w:tcPr>
+          <w:p>
+            <w:pPr>
+              <w:spacing w:after="0" w:line="240" w:lineRule="auto" w:before="0"/>
+              <w:ind w:left="110" w:right="0" w:firstLine="0"/>
+              <w:jc w:val="left"/>
+            </w:pPr>
+            <w:r>
+              <w:rPr>
+                <w:sz w:val="17"/>
               </w:rPr>
               <w:t>37</w:t>
             </w:r>
@@ -4025,8 +4715,8 @@
       </w:tr>
       <w:tr>
         <w:trPr>
-          <w:trHeight w:val="286"/>
           <w:cantSplit/>
+          <w:trHeight w:val="210" w:hRule="atLeast"/>
         </w:trPr>
         <w:tc>
           <w:tcPr>
@@ -4037,10 +4727,16 @@
               <w:bottom w:val="single" w:sz="4" w:space="0" w:color="000000"/>
               <w:right w:val="single" w:sz="4" w:space="0" w:color="000000"/>
             </w:tcBorders>
-          </w:tcPr>
-          <w:p>
-            <w:pPr>
-              <w:spacing w:after="160" w:line="259" w:lineRule="auto"/>
+            <w:tcMar>
+              <w:top w:w="20" w:type="dxa"/>
+              <w:bottom w:w="20" w:type="dxa"/>
+              <w:left w:w="60" w:type="dxa"/>
+              <w:right w:w="60" w:type="dxa"/>
+            </w:tcMar>
+          </w:tcPr>
+          <w:p>
+            <w:pPr>
+              <w:spacing w:after="0" w:line="240" w:lineRule="auto" w:before="0"/>
               <w:ind w:right="0" w:firstLine="0"/>
               <w:jc w:val="left"/>
             </w:pPr>
@@ -4055,16 +4751,22 @@
               <w:bottom w:val="single" w:sz="4" w:space="0" w:color="000000"/>
               <w:right w:val="single" w:sz="4" w:space="0" w:color="000000"/>
             </w:tcBorders>
-          </w:tcPr>
-          <w:p>
-            <w:pPr>
-              <w:spacing w:after="0" w:line="259" w:lineRule="auto"/>
-              <w:ind w:left="110" w:right="0" w:firstLine="0"/>
-              <w:jc w:val="left"/>
-            </w:pPr>
-            <w:r>
-              <w:rPr>
-                <w:sz w:val="19"/>
+            <w:tcMar>
+              <w:top w:w="20" w:type="dxa"/>
+              <w:bottom w:w="20" w:type="dxa"/>
+              <w:left w:w="60" w:type="dxa"/>
+              <w:right w:w="60" w:type="dxa"/>
+            </w:tcMar>
+          </w:tcPr>
+          <w:p>
+            <w:pPr>
+              <w:spacing w:after="0" w:line="240" w:lineRule="auto" w:before="0"/>
+              <w:ind w:left="110" w:right="0" w:firstLine="0"/>
+              <w:jc w:val="left"/>
+            </w:pPr>
+            <w:r>
+              <w:rPr>
+                <w:sz w:val="17"/>
               </w:rPr>
               <w:t>APPENDIX B – Data Dictionary</w:t>
             </w:r>
@@ -4079,16 +4781,22 @@
               <w:bottom w:val="single" w:sz="4" w:space="0" w:color="000000"/>
               <w:right w:val="nil"/>
             </w:tcBorders>
-          </w:tcPr>
-          <w:p>
-            <w:pPr>
-              <w:spacing w:after="0" w:line="259" w:lineRule="auto"/>
-              <w:ind w:left="110" w:right="0" w:firstLine="0"/>
-              <w:jc w:val="left"/>
-            </w:pPr>
-            <w:r>
-              <w:rPr>
-                <w:sz w:val="19"/>
+            <w:tcMar>
+              <w:top w:w="20" w:type="dxa"/>
+              <w:bottom w:w="20" w:type="dxa"/>
+              <w:left w:w="60" w:type="dxa"/>
+              <w:right w:w="60" w:type="dxa"/>
+            </w:tcMar>
+          </w:tcPr>
+          <w:p>
+            <w:pPr>
+              <w:spacing w:after="0" w:line="240" w:lineRule="auto" w:before="0"/>
+              <w:ind w:left="110" w:right="0" w:firstLine="0"/>
+              <w:jc w:val="left"/>
+            </w:pPr>
+            <w:r>
+              <w:rPr>
+                <w:sz w:val="17"/>
               </w:rPr>
               <w:t>40</w:t>
             </w:r>
@@ -4097,8 +4805,8 @@
       </w:tr>
       <w:tr>
         <w:trPr>
-          <w:trHeight w:val="424"/>
           <w:cantSplit/>
+          <w:trHeight w:val="210" w:hRule="atLeast"/>
         </w:trPr>
         <w:tc>
           <w:tcPr>
@@ -4109,10 +4817,16 @@
               <w:bottom w:val="single" w:sz="4" w:space="0" w:color="000000"/>
               <w:right w:val="single" w:sz="4" w:space="0" w:color="000000"/>
             </w:tcBorders>
-          </w:tcPr>
-          <w:p>
-            <w:pPr>
-              <w:spacing w:after="160" w:line="259" w:lineRule="auto"/>
+            <w:tcMar>
+              <w:top w:w="20" w:type="dxa"/>
+              <w:bottom w:w="20" w:type="dxa"/>
+              <w:left w:w="60" w:type="dxa"/>
+              <w:right w:w="60" w:type="dxa"/>
+            </w:tcMar>
+          </w:tcPr>
+          <w:p>
+            <w:pPr>
+              <w:spacing w:after="0" w:line="240" w:lineRule="auto" w:before="0"/>
               <w:ind w:right="0" w:firstLine="0"/>
               <w:jc w:val="left"/>
             </w:pPr>
@@ -4127,16 +4841,22 @@
               <w:bottom w:val="single" w:sz="4" w:space="0" w:color="000000"/>
               <w:right w:val="single" w:sz="4" w:space="0" w:color="000000"/>
             </w:tcBorders>
-          </w:tcPr>
-          <w:p>
-            <w:pPr>
-              <w:spacing w:after="0" w:line="259" w:lineRule="auto"/>
-              <w:ind w:left="110" w:right="0" w:firstLine="0"/>
-              <w:jc w:val="left"/>
-            </w:pPr>
-            <w:r>
-              <w:rPr>
-                <w:sz w:val="19"/>
+            <w:tcMar>
+              <w:top w:w="20" w:type="dxa"/>
+              <w:bottom w:w="20" w:type="dxa"/>
+              <w:left w:w="60" w:type="dxa"/>
+              <w:right w:w="60" w:type="dxa"/>
+            </w:tcMar>
+          </w:tcPr>
+          <w:p>
+            <w:pPr>
+              <w:spacing w:after="0" w:line="240" w:lineRule="auto" w:before="0"/>
+              <w:ind w:left="110" w:right="0" w:firstLine="0"/>
+              <w:jc w:val="left"/>
+            </w:pPr>
+            <w:r>
+              <w:rPr>
+                <w:sz w:val="17"/>
               </w:rPr>
               <w:t>APPENDIX C – Sample Data and Test Cases</w:t>
             </w:r>
@@ -4152,16 +4872,22 @@
               <w:right w:val="nil"/>
             </w:tcBorders>
             <w:vAlign w:val="center"/>
-          </w:tcPr>
-          <w:p>
-            <w:pPr>
-              <w:spacing w:after="0" w:line="259" w:lineRule="auto"/>
-              <w:ind w:left="110" w:right="0" w:firstLine="0"/>
-              <w:jc w:val="left"/>
-            </w:pPr>
-            <w:r>
-              <w:rPr>
-                <w:sz w:val="19"/>
+            <w:tcMar>
+              <w:top w:w="20" w:type="dxa"/>
+              <w:bottom w:w="20" w:type="dxa"/>
+              <w:left w:w="60" w:type="dxa"/>
+              <w:right w:w="60" w:type="dxa"/>
+            </w:tcMar>
+          </w:tcPr>
+          <w:p>
+            <w:pPr>
+              <w:spacing w:after="0" w:line="240" w:lineRule="auto" w:before="0"/>
+              <w:ind w:left="110" w:right="0" w:firstLine="0"/>
+              <w:jc w:val="left"/>
+            </w:pPr>
+            <w:r>
+              <w:rPr>
+                <w:sz w:val="17"/>
               </w:rPr>
               <w:t>42</w:t>
             </w:r>
@@ -4170,8 +4896,8 @@
       </w:tr>
       <w:tr>
         <w:trPr>
-          <w:trHeight w:val="424"/>
           <w:cantSplit/>
+          <w:trHeight w:val="210" w:hRule="atLeast"/>
         </w:trPr>
         <w:tc>
           <w:tcPr>
@@ -4182,10 +4908,16 @@
               <w:bottom w:val="single" w:sz="4" w:space="0" w:color="000000"/>
               <w:right w:val="single" w:sz="4" w:space="0" w:color="000000"/>
             </w:tcBorders>
-          </w:tcPr>
-          <w:p>
-            <w:pPr>
-              <w:spacing w:after="160" w:line="259" w:lineRule="auto"/>
+            <w:tcMar>
+              <w:top w:w="20" w:type="dxa"/>
+              <w:bottom w:w="20" w:type="dxa"/>
+              <w:left w:w="60" w:type="dxa"/>
+              <w:right w:w="60" w:type="dxa"/>
+            </w:tcMar>
+          </w:tcPr>
+          <w:p>
+            <w:pPr>
+              <w:spacing w:after="0" w:line="240" w:lineRule="auto" w:before="0"/>
               <w:ind w:right="0" w:firstLine="0"/>
               <w:jc w:val="left"/>
             </w:pPr>
@@ -4200,29 +4932,35 @@
               <w:bottom w:val="single" w:sz="4" w:space="0" w:color="000000"/>
               <w:right w:val="single" w:sz="4" w:space="0" w:color="000000"/>
             </w:tcBorders>
-          </w:tcPr>
-          <w:p>
-            <w:pPr>
-              <w:spacing w:after="0" w:line="259" w:lineRule="auto"/>
-              <w:ind w:left="110" w:right="0" w:firstLine="0"/>
-              <w:jc w:val="left"/>
-            </w:pPr>
-            <w:r>
-              <w:rPr>
-                <w:sz w:val="19"/>
+            <w:tcMar>
+              <w:top w:w="20" w:type="dxa"/>
+              <w:bottom w:w="20" w:type="dxa"/>
+              <w:left w:w="60" w:type="dxa"/>
+              <w:right w:w="60" w:type="dxa"/>
+            </w:tcMar>
+          </w:tcPr>
+          <w:p>
+            <w:pPr>
+              <w:spacing w:after="0" w:line="240" w:lineRule="auto" w:before="0"/>
+              <w:ind w:left="110" w:right="0" w:firstLine="0"/>
+              <w:jc w:val="left"/>
+            </w:pPr>
+            <w:r>
+              <w:rPr>
+                <w:sz w:val="17"/>
               </w:rPr>
               <w:t xml:space="preserve">APPENDIX D – Demonstration </w:t>
             </w:r>
           </w:p>
           <w:p>
             <w:pPr>
-              <w:spacing w:after="0" w:line="259" w:lineRule="auto"/>
-              <w:ind w:left="110" w:right="0" w:firstLine="0"/>
-              <w:jc w:val="left"/>
-            </w:pPr>
-            <w:r>
-              <w:rPr>
-                <w:sz w:val="19"/>
+              <w:spacing w:after="0" w:line="240" w:lineRule="auto" w:before="0"/>
+              <w:ind w:left="110" w:right="0" w:firstLine="0"/>
+              <w:jc w:val="left"/>
+            </w:pPr>
+            <w:r>
+              <w:rPr>
+                <w:sz w:val="17"/>
               </w:rPr>
               <w:t>Checklist</w:t>
             </w:r>
@@ -4238,16 +4976,22 @@
               <w:right w:val="nil"/>
             </w:tcBorders>
             <w:vAlign w:val="center"/>
-          </w:tcPr>
-          <w:p>
-            <w:pPr>
-              <w:spacing w:after="0" w:line="259" w:lineRule="auto"/>
-              <w:ind w:left="110" w:right="0" w:firstLine="0"/>
-              <w:jc w:val="left"/>
-            </w:pPr>
-            <w:r>
-              <w:rPr>
-                <w:sz w:val="19"/>
+            <w:tcMar>
+              <w:top w:w="20" w:type="dxa"/>
+              <w:bottom w:w="20" w:type="dxa"/>
+              <w:left w:w="60" w:type="dxa"/>
+              <w:right w:w="60" w:type="dxa"/>
+            </w:tcMar>
+          </w:tcPr>
+          <w:p>
+            <w:pPr>
+              <w:spacing w:after="0" w:line="240" w:lineRule="auto" w:before="0"/>
+              <w:ind w:left="110" w:right="0" w:firstLine="0"/>
+              <w:jc w:val="left"/>
+            </w:pPr>
+            <w:r>
+              <w:rPr>
+                <w:sz w:val="17"/>
               </w:rPr>
               <w:t>45</w:t>
             </w:r>
@@ -4256,8 +5000,8 @@
       </w:tr>
       <w:tr>
         <w:trPr>
-          <w:trHeight w:val="286"/>
           <w:cantSplit/>
+          <w:trHeight w:val="210" w:hRule="atLeast"/>
         </w:trPr>
         <w:tc>
           <w:tcPr>
@@ -4268,10 +5012,16 @@
               <w:bottom w:val="single" w:sz="4" w:space="0" w:color="000000"/>
               <w:right w:val="single" w:sz="4" w:space="0" w:color="000000"/>
             </w:tcBorders>
-          </w:tcPr>
-          <w:p>
-            <w:pPr>
-              <w:spacing w:after="160" w:line="259" w:lineRule="auto"/>
+            <w:tcMar>
+              <w:top w:w="20" w:type="dxa"/>
+              <w:bottom w:w="20" w:type="dxa"/>
+              <w:left w:w="60" w:type="dxa"/>
+              <w:right w:w="60" w:type="dxa"/>
+            </w:tcMar>
+          </w:tcPr>
+          <w:p>
+            <w:pPr>
+              <w:spacing w:after="0" w:line="240" w:lineRule="auto" w:before="0"/>
               <w:ind w:right="0" w:firstLine="0"/>
               <w:jc w:val="left"/>
             </w:pPr>
@@ -4286,16 +5036,22 @@
               <w:bottom w:val="single" w:sz="4" w:space="0" w:color="000000"/>
               <w:right w:val="single" w:sz="4" w:space="0" w:color="000000"/>
             </w:tcBorders>
-          </w:tcPr>
-          <w:p>
-            <w:pPr>
-              <w:spacing w:after="0" w:line="259" w:lineRule="auto"/>
-              <w:ind w:left="110" w:right="0" w:firstLine="0"/>
-              <w:jc w:val="left"/>
-            </w:pPr>
-            <w:r>
-              <w:rPr>
-                <w:sz w:val="19"/>
+            <w:tcMar>
+              <w:top w:w="20" w:type="dxa"/>
+              <w:bottom w:w="20" w:type="dxa"/>
+              <w:left w:w="60" w:type="dxa"/>
+              <w:right w:w="60" w:type="dxa"/>
+            </w:tcMar>
+          </w:tcPr>
+          <w:p>
+            <w:pPr>
+              <w:spacing w:after="0" w:line="240" w:lineRule="auto" w:before="0"/>
+              <w:ind w:left="110" w:right="0" w:firstLine="0"/>
+              <w:jc w:val="left"/>
+            </w:pPr>
+            <w:r>
+              <w:rPr>
+                <w:sz w:val="17"/>
               </w:rPr>
               <w:t>REFERENCES</w:t>
             </w:r>
@@ -4310,16 +5066,22 @@
               <w:bottom w:val="single" w:sz="4" w:space="0" w:color="000000"/>
               <w:right w:val="nil"/>
             </w:tcBorders>
-          </w:tcPr>
-          <w:p>
-            <w:pPr>
-              <w:spacing w:after="0" w:line="259" w:lineRule="auto"/>
-              <w:ind w:left="110" w:right="0" w:firstLine="0"/>
-              <w:jc w:val="left"/>
-            </w:pPr>
-            <w:r>
-              <w:rPr>
-                <w:sz w:val="19"/>
+            <w:tcMar>
+              <w:top w:w="20" w:type="dxa"/>
+              <w:bottom w:w="20" w:type="dxa"/>
+              <w:left w:w="60" w:type="dxa"/>
+              <w:right w:w="60" w:type="dxa"/>
+            </w:tcMar>
+          </w:tcPr>
+          <w:p>
+            <w:pPr>
+              <w:spacing w:after="0" w:line="240" w:lineRule="auto" w:before="0"/>
+              <w:ind w:left="110" w:right="0" w:firstLine="0"/>
+              <w:jc w:val="left"/>
+            </w:pPr>
+            <w:r>
+              <w:rPr>
+                <w:sz w:val="17"/>
               </w:rPr>
               <w:t>47</w:t>
             </w:r>
@@ -4331,7 +5093,7 @@
       <w:pPr>
         <w:keepNext/>
         <w:pageBreakBefore/>
-        <w:spacing w:after="240" w:line="259" w:lineRule="auto" w:before="0"/>
+        <w:spacing w:after="200" w:line="259" w:lineRule="auto" w:before="0"/>
         <w:ind w:left="3600" w:right="0" w:hanging="10"/>
         <w:jc w:val="center"/>
       </w:pPr>
@@ -4933,7 +5695,7 @@
       <w:pPr>
         <w:keepNext/>
         <w:pageBreakBefore/>
-        <w:spacing w:before="0" w:after="240"/>
+        <w:spacing w:before="0" w:after="200"/>
         <w:ind w:firstLine="0"/>
         <w:jc w:val="center"/>
       </w:pPr>
@@ -5912,7 +6674,7 @@
       <w:pPr>
         <w:keepNext/>
         <w:pageBreakBefore/>
-        <w:spacing w:after="240" w:line="259" w:lineRule="auto" w:before="0"/>
+        <w:spacing w:after="200" w:line="259" w:lineRule="auto" w:before="0"/>
         <w:ind w:left="2969" w:right="0" w:hanging="10"/>
         <w:jc w:val="center"/>
       </w:pPr>

</xml_diff>